<commit_message>
fixed new mistakes in texts
</commit_message>
<xml_diff>
--- a/LR_5_Rustamov.docx
+++ b/LR_5_Rustamov.docx
@@ -1,6 +1,6 @@
 
 <file path=word/document.xml><?xml version="1.0" encoding="utf-8"?>
-<w:document xmlns:wpc="http://schemas.microsoft.com/office/word/2010/wordprocessingCanvas" xmlns:cx="http://schemas.microsoft.com/office/drawing/2014/chartex" xmlns:cx1="http://schemas.microsoft.com/office/drawing/2015/9/8/chartex" xmlns:cx2="http://schemas.microsoft.com/office/drawing/2015/10/21/chartex" xmlns:cx3="http://schemas.microsoft.com/office/drawing/2016/5/9/chartex" xmlns:cx4="http://schemas.microsoft.com/office/drawing/2016/5/10/chartex" xmlns:cx5="http://schemas.microsoft.com/office/drawing/2016/5/11/chartex" xmlns:cx6="http://schemas.microsoft.com/office/drawing/2016/5/12/chartex" xmlns:cx7="http://schemas.microsoft.com/office/drawing/2016/5/13/chartex" xmlns:cx8="http://schemas.microsoft.com/office/drawing/2016/5/14/chartex" xmlns:mc="http://schemas.openxmlformats.org/markup-compatibility/2006" xmlns:aink="http://schemas.microsoft.com/office/drawing/2016/ink" xmlns:am3d="http://schemas.microsoft.com/office/drawing/2017/model3d" xmlns:o="urn:schemas-microsoft-com:office:office" xmlns:r="http://schemas.openxmlformats.org/officeDocument/2006/relationships" xmlns:m="http://schemas.openxmlformats.org/officeDocument/2006/math" xmlns:v="urn:schemas-microsoft-com:vml" xmlns:wp14="http://schemas.microsoft.com/office/word/2010/wordprocessingDrawing" xmlns:wp="http://schemas.openxmlformats.org/drawingml/2006/wordprocessingDrawing" xmlns:w10="urn:schemas-microsoft-com:office:word" xmlns:w="http://schemas.openxmlformats.org/wordprocessingml/2006/main" xmlns:w14="http://schemas.microsoft.com/office/word/2010/wordml" xmlns:w15="http://schemas.microsoft.com/office/word/2012/wordml" xmlns:w16cex="http://schemas.microsoft.com/office/word/2018/wordml/cex" xmlns:w16cid="http://schemas.microsoft.com/office/word/2016/wordml/cid" xmlns:w16="http://schemas.microsoft.com/office/word/2018/wordml" xmlns:w16sdtdh="http://schemas.microsoft.com/office/word/2020/wordml/sdtdatahash" xmlns:w16se="http://schemas.microsoft.com/office/word/2015/wordml/symex" xmlns:wpg="http://schemas.microsoft.com/office/word/2010/wordprocessingGroup" xmlns:wpi="http://schemas.microsoft.com/office/word/2010/wordprocessingInk" xmlns:wne="http://schemas.microsoft.com/office/word/2006/wordml" xmlns:wps="http://schemas.microsoft.com/office/word/2010/wordprocessingShape" mc:Ignorable="w14 w15 w16se w16cid w16 w16cex w16sdtdh wp14">
+<w:document xmlns:wpc="http://schemas.microsoft.com/office/word/2010/wordprocessingCanvas" xmlns:cx="http://schemas.microsoft.com/office/drawing/2014/chartex" xmlns:cx1="http://schemas.microsoft.com/office/drawing/2015/9/8/chartex" xmlns:cx2="http://schemas.microsoft.com/office/drawing/2015/10/21/chartex" xmlns:cx3="http://schemas.microsoft.com/office/drawing/2016/5/9/chartex" xmlns:cx4="http://schemas.microsoft.com/office/drawing/2016/5/10/chartex" xmlns:cx5="http://schemas.microsoft.com/office/drawing/2016/5/11/chartex" xmlns:cx6="http://schemas.microsoft.com/office/drawing/2016/5/12/chartex" xmlns:cx7="http://schemas.microsoft.com/office/drawing/2016/5/13/chartex" xmlns:cx8="http://schemas.microsoft.com/office/drawing/2016/5/14/chartex" xmlns:mc="http://schemas.openxmlformats.org/markup-compatibility/2006" xmlns:aink="http://schemas.microsoft.com/office/drawing/2016/ink" xmlns:am3d="http://schemas.microsoft.com/office/drawing/2017/model3d" xmlns:o="urn:schemas-microsoft-com:office:office" xmlns:oel="http://schemas.microsoft.com/office/2019/extlst" xmlns:r="http://schemas.openxmlformats.org/officeDocument/2006/relationships" xmlns:m="http://schemas.openxmlformats.org/officeDocument/2006/math" xmlns:v="urn:schemas-microsoft-com:vml" xmlns:wp14="http://schemas.microsoft.com/office/word/2010/wordprocessingDrawing" xmlns:wp="http://schemas.openxmlformats.org/drawingml/2006/wordprocessingDrawing" xmlns:w10="urn:schemas-microsoft-com:office:word" xmlns:w="http://schemas.openxmlformats.org/wordprocessingml/2006/main" xmlns:w14="http://schemas.microsoft.com/office/word/2010/wordml" xmlns:w15="http://schemas.microsoft.com/office/word/2012/wordml" xmlns:w16cex="http://schemas.microsoft.com/office/word/2018/wordml/cex" xmlns:w16cid="http://schemas.microsoft.com/office/word/2016/wordml/cid" xmlns:w16="http://schemas.microsoft.com/office/word/2018/wordml" xmlns:w16du="http://schemas.microsoft.com/office/word/2023/wordml/word16du" xmlns:w16sdtdh="http://schemas.microsoft.com/office/word/2020/wordml/sdtdatahash" xmlns:w16sdtfl="http://schemas.microsoft.com/office/word/2024/wordml/sdtformatlock" xmlns:w16se="http://schemas.microsoft.com/office/word/2015/wordml/symex" xmlns:wpg="http://schemas.microsoft.com/office/word/2010/wordprocessingGroup" xmlns:wpi="http://schemas.microsoft.com/office/word/2010/wordprocessingInk" xmlns:wne="http://schemas.microsoft.com/office/word/2006/wordml" xmlns:wps="http://schemas.microsoft.com/office/word/2010/wordprocessingShape" mc:Ignorable="w14 w15 w16se w16cid w16 w16cex w16sdtdh w16sdtfl w16du wp14">
   <w:body>
     <w:p>
       <w:pPr>
@@ -1178,34 +1178,8 @@
                 <w:lang w:eastAsia="ru-RU"/>
                 <w14:ligatures w14:val="none"/>
               </w:rPr>
-              <w:t xml:space="preserve">доцент </w:t>
-            </w:r>
-            <w:proofErr w:type="spellStart"/>
-            <w:r>
-              <w:rPr>
-                <w:rFonts w:ascii="Times New Roman" w:eastAsia="Times New Roman" w:hAnsi="Times New Roman" w:cs="Times New Roman"/>
-                <w:color w:val="000000"/>
-                <w:kern w:val="0"/>
-                <w:szCs w:val="28"/>
-                <w:lang w:eastAsia="ru-RU"/>
-                <w14:ligatures w14:val="none"/>
-              </w:rPr>
-              <w:t>к.</w:t>
-            </w:r>
-            <w:proofErr w:type="gramStart"/>
-            <w:r>
-              <w:rPr>
-                <w:rFonts w:ascii="Times New Roman" w:eastAsia="Times New Roman" w:hAnsi="Times New Roman" w:cs="Times New Roman"/>
-                <w:color w:val="000000"/>
-                <w:kern w:val="0"/>
-                <w:szCs w:val="28"/>
-                <w:lang w:eastAsia="ru-RU"/>
-                <w14:ligatures w14:val="none"/>
-              </w:rPr>
-              <w:t>т.н</w:t>
-            </w:r>
-            <w:proofErr w:type="spellEnd"/>
-            <w:proofErr w:type="gramEnd"/>
+              <w:t>доцент к.т.н</w:t>
+            </w:r>
           </w:p>
         </w:tc>
         <w:tc>
@@ -1273,7 +1247,6 @@
                 <w14:ligatures w14:val="none"/>
               </w:rPr>
             </w:pPr>
-            <w:proofErr w:type="spellStart"/>
             <w:r>
               <w:rPr>
                 <w:rFonts w:ascii="Times New Roman" w:eastAsia="Times New Roman" w:hAnsi="Times New Roman" w:cs="Times New Roman"/>
@@ -1283,19 +1256,7 @@
                 <w:lang w:eastAsia="ru-RU"/>
                 <w14:ligatures w14:val="none"/>
               </w:rPr>
-              <w:t>Калентьев</w:t>
-            </w:r>
-            <w:proofErr w:type="spellEnd"/>
-            <w:r>
-              <w:rPr>
-                <w:rFonts w:ascii="Times New Roman" w:eastAsia="Times New Roman" w:hAnsi="Times New Roman" w:cs="Times New Roman"/>
-                <w:color w:val="000000"/>
-                <w:kern w:val="0"/>
-                <w:szCs w:val="28"/>
-                <w:lang w:eastAsia="ru-RU"/>
-                <w14:ligatures w14:val="none"/>
-              </w:rPr>
-              <w:t xml:space="preserve"> А.А.</w:t>
+              <w:t>Калентьев А.А.</w:t>
             </w:r>
           </w:p>
         </w:tc>
@@ -3000,7 +2961,7 @@
       </w:pPr>
       <w:r>
         <w:drawing>
-          <wp:inline distT="0" distB="0" distL="0" distR="0" wp14:anchorId="7AD332B9" wp14:editId="1A6312FC">
+          <wp:inline distT="0" distB="0" distL="0" distR="0" wp14:anchorId="7AD332B9" wp14:editId="1B2355D3">
             <wp:extent cx="3543300" cy="5212248"/>
             <wp:effectExtent l="0" t="0" r="0" b="0"/>
             <wp:docPr id="1595171144" name="Рисунок 3"/>
@@ -3100,32 +3061,10 @@
         <w:rPr>
           <w:lang w:val="en-US"/>
         </w:rPr>
-        <w:t xml:space="preserve"> </w:t>
-      </w:r>
-      <w:proofErr w:type="spellStart"/>
-      <w:r>
-        <w:rPr>
-          <w:lang w:val="en-US"/>
-        </w:rPr>
-        <w:t>диаграмма</w:t>
-      </w:r>
-      <w:proofErr w:type="spellEnd"/>
-      <w:r>
-        <w:rPr>
-          <w:lang w:val="en-US"/>
-        </w:rPr>
-        <w:t xml:space="preserve"> </w:t>
-      </w:r>
-      <w:proofErr w:type="spellStart"/>
-      <w:r>
-        <w:rPr>
-          <w:lang w:val="en-US"/>
-        </w:rPr>
-        <w:t>классов</w:t>
+        <w:t xml:space="preserve"> диаграмма классов</w:t>
       </w:r>
       <w:bookmarkEnd w:id="1"/>
       <w:bookmarkEnd w:id="2"/>
-      <w:proofErr w:type="spellEnd"/>
     </w:p>
     <w:p>
       <w:r>
@@ -3216,20 +3155,12 @@
         <w:jc w:val="center"/>
       </w:pPr>
       <w:bookmarkStart w:id="3" w:name="_Toc232211094"/>
-      <w:proofErr w:type="spellStart"/>
       <w:r>
         <w:rPr>
           <w:lang w:val="en-US"/>
         </w:rPr>
         <w:lastRenderedPageBreak/>
-        <w:t>Описание</w:t>
-      </w:r>
-      <w:proofErr w:type="spellEnd"/>
-      <w:r>
-        <w:rPr>
-          <w:lang w:val="en-US"/>
-        </w:rPr>
-        <w:t xml:space="preserve"> </w:t>
+        <w:t xml:space="preserve">Описание </w:t>
       </w:r>
       <w:r>
         <w:t>связей</w:t>
@@ -3263,19 +3194,11 @@
         </w:rPr>
         <w:t xml:space="preserve"> </w:t>
       </w:r>
-      <w:proofErr w:type="spellStart"/>
       <w:r>
         <w:rPr>
           <w:lang w:val="en-US"/>
         </w:rPr>
-        <w:t>типа</w:t>
-      </w:r>
-      <w:proofErr w:type="spellEnd"/>
-      <w:r>
-        <w:rPr>
-          <w:lang w:val="en-US"/>
-        </w:rPr>
-        <w:t xml:space="preserve"> «</w:t>
+        <w:t>типа «</w:t>
       </w:r>
       <w:r>
         <w:t>тип</w:t>
@@ -3376,18 +3299,8 @@
           <w:szCs w:val="22"/>
           <w:lang w:val="en-US"/>
         </w:rPr>
-        <w:t xml:space="preserve"> </w:t>
-      </w:r>
-      <w:proofErr w:type="spellStart"/>
-      <w:r>
-        <w:rPr>
-          <w:sz w:val="28"/>
-          <w:szCs w:val="22"/>
-          <w:lang w:val="en-US"/>
-        </w:rPr>
-        <w:t>IVolumeFigure</w:t>
-      </w:r>
-      <w:proofErr w:type="spellEnd"/>
+        <w:t xml:space="preserve"> IVolumeFigure</w:t>
+      </w:r>
     </w:p>
     <w:tbl>
       <w:tblPr>
@@ -3528,17 +3441,8 @@
                 <w:iCs/>
                 <w:szCs w:val="22"/>
               </w:rPr>
-              <w:t xml:space="preserve">Интерфейс </w:t>
-            </w:r>
-            <w:proofErr w:type="spellStart"/>
-            <w:r>
-              <w:rPr>
-                <w:iCs/>
-                <w:szCs w:val="22"/>
-              </w:rPr>
-              <w:t>IVolumeFigure</w:t>
-            </w:r>
-            <w:proofErr w:type="spellEnd"/>
+              <w:t>Интерфейс IVolumeFigure</w:t>
+            </w:r>
             <w:r>
               <w:rPr>
                 <w:iCs/>
@@ -3600,7 +3504,6 @@
               </w:rPr>
               <w:t>+</w:t>
             </w:r>
-            <w:proofErr w:type="spellStart"/>
             <w:r>
               <w:rPr>
                 <w:iCs/>
@@ -3609,7 +3512,6 @@
               </w:rPr>
               <w:t>FigureType</w:t>
             </w:r>
-            <w:proofErr w:type="spellEnd"/>
           </w:p>
         </w:tc>
         <w:tc>
@@ -3783,8 +3685,6 @@
               </w:rPr>
               <w:t>+</w:t>
             </w:r>
-            <w:proofErr w:type="spellStart"/>
-            <w:proofErr w:type="gramStart"/>
             <w:r>
               <w:rPr>
                 <w:iCs/>
@@ -3801,23 +3701,13 @@
               </w:rPr>
               <w:t>tDescription</w:t>
             </w:r>
-            <w:proofErr w:type="spellEnd"/>
             <w:r>
               <w:rPr>
                 <w:iCs/>
                 <w:szCs w:val="22"/>
                 <w:lang w:val="en-US"/>
               </w:rPr>
-              <w:t>(</w:t>
-            </w:r>
-            <w:proofErr w:type="gramEnd"/>
-            <w:r>
-              <w:rPr>
-                <w:iCs/>
-                <w:szCs w:val="22"/>
-                <w:lang w:val="en-US"/>
-              </w:rPr>
-              <w:t>)</w:t>
+              <w:t>()</w:t>
             </w:r>
           </w:p>
         </w:tc>
@@ -3932,17 +3822,8 @@
           <w:sz w:val="28"/>
           <w:szCs w:val="22"/>
         </w:rPr>
-        <w:t xml:space="preserve"> – Описание абстрактного класса </w:t>
-      </w:r>
-      <w:proofErr w:type="spellStart"/>
-      <w:r>
-        <w:rPr>
-          <w:sz w:val="28"/>
-          <w:szCs w:val="22"/>
-        </w:rPr>
-        <w:t>VolumeFigureBase</w:t>
-      </w:r>
-      <w:proofErr w:type="spellEnd"/>
+        <w:t xml:space="preserve"> – Описание абстрактного класса VolumeFigureBase</w:t>
+      </w:r>
     </w:p>
     <w:tbl>
       <w:tblPr>
@@ -4092,39 +3973,7 @@
                 <w:iCs/>
                 <w:szCs w:val="22"/>
               </w:rPr>
-              <w:t xml:space="preserve">Абстрактный базовый класс </w:t>
-            </w:r>
-            <w:proofErr w:type="spellStart"/>
-            <w:r>
-              <w:rPr>
-                <w:iCs/>
-                <w:szCs w:val="22"/>
-              </w:rPr>
-              <w:t>VolumeFigureBase</w:t>
-            </w:r>
-            <w:proofErr w:type="spellEnd"/>
-            <w:r>
-              <w:rPr>
-                <w:iCs/>
-                <w:szCs w:val="22"/>
-              </w:rPr>
-              <w:t xml:space="preserve"> – общий класс для всех объёмных фигур. Реализует интерфейс </w:t>
-            </w:r>
-            <w:proofErr w:type="spellStart"/>
-            <w:r>
-              <w:rPr>
-                <w:iCs/>
-                <w:szCs w:val="22"/>
-              </w:rPr>
-              <w:t>IVolumeFigure</w:t>
-            </w:r>
-            <w:proofErr w:type="spellEnd"/>
-            <w:r>
-              <w:rPr>
-                <w:iCs/>
-                <w:szCs w:val="22"/>
-              </w:rPr>
-              <w:t xml:space="preserve"> и задаёт общие свойства и методы проверки данных</w:t>
+              <w:t>Абстрактный базовый класс VolumeFigureBase – общий класс для всех объёмных фигур. Реализует интерфейс IVolumeFigure и задаёт общие свойства и методы проверки данных</w:t>
             </w:r>
           </w:p>
         </w:tc>
@@ -4178,18 +4027,8 @@
                 <w:szCs w:val="22"/>
                 <w:lang w:val="en-US"/>
               </w:rPr>
-              <w:t>+</w:t>
-            </w:r>
-            <w:proofErr w:type="spellStart"/>
-            <w:r>
-              <w:rPr>
-                <w:iCs/>
-                <w:szCs w:val="22"/>
-                <w:lang w:val="en-US"/>
-              </w:rPr>
-              <w:t>FigureType</w:t>
-            </w:r>
-            <w:proofErr w:type="spellEnd"/>
+              <w:t>+FigureType</w:t>
+            </w:r>
           </w:p>
         </w:tc>
         <w:tc>
@@ -4354,32 +4193,7 @@
                 <w:iCs/>
                 <w:szCs w:val="22"/>
               </w:rPr>
-              <w:t>+</w:t>
-            </w:r>
-            <w:proofErr w:type="spellStart"/>
-            <w:proofErr w:type="gramStart"/>
-            <w:r>
-              <w:rPr>
-                <w:iCs/>
-                <w:szCs w:val="22"/>
-              </w:rPr>
-              <w:t>GetDescription</w:t>
-            </w:r>
-            <w:proofErr w:type="spellEnd"/>
-            <w:r>
-              <w:rPr>
-                <w:iCs/>
-                <w:szCs w:val="22"/>
-              </w:rPr>
-              <w:t>(</w:t>
-            </w:r>
-            <w:proofErr w:type="gramEnd"/>
-            <w:r>
-              <w:rPr>
-                <w:iCs/>
-                <w:szCs w:val="22"/>
-              </w:rPr>
-              <w:t>)</w:t>
+              <w:t>+GetDescription()</w:t>
             </w:r>
             <w:r>
               <w:rPr>
@@ -4404,7 +4218,6 @@
                 <w:lang w:val="en-US"/>
               </w:rPr>
             </w:pPr>
-            <w:proofErr w:type="spellStart"/>
             <w:r>
               <w:rPr>
                 <w:iCs/>
@@ -4412,7 +4225,6 @@
               </w:rPr>
               <w:t>string</w:t>
             </w:r>
-            <w:proofErr w:type="spellEnd"/>
           </w:p>
         </w:tc>
         <w:tc>
@@ -4458,43 +4270,7 @@
                 <w:lang w:val="en-US"/>
               </w:rPr>
               <w:lastRenderedPageBreak/>
-              <w:t>#</w:t>
-            </w:r>
-            <w:proofErr w:type="gramStart"/>
-            <w:r>
-              <w:rPr>
-                <w:iCs/>
-                <w:szCs w:val="22"/>
-                <w:lang w:val="en-US"/>
-              </w:rPr>
-              <w:t>ValidatePositive(</w:t>
-            </w:r>
-            <w:proofErr w:type="gramEnd"/>
-            <w:r>
-              <w:rPr>
-                <w:iCs/>
-                <w:szCs w:val="22"/>
-                <w:lang w:val="en-US"/>
-              </w:rPr>
-              <w:t xml:space="preserve">double value, string </w:t>
-            </w:r>
-            <w:proofErr w:type="spellStart"/>
-            <w:r>
-              <w:rPr>
-                <w:iCs/>
-                <w:szCs w:val="22"/>
-                <w:lang w:val="en-US"/>
-              </w:rPr>
-              <w:t>parameterName</w:t>
-            </w:r>
-            <w:proofErr w:type="spellEnd"/>
-            <w:r>
-              <w:rPr>
-                <w:iCs/>
-                <w:szCs w:val="22"/>
-                <w:lang w:val="en-US"/>
-              </w:rPr>
-              <w:t xml:space="preserve">) </w:t>
+              <w:t xml:space="preserve">#ValidatePositive(double value, string parameterName) </w:t>
             </w:r>
           </w:p>
         </w:tc>
@@ -4563,43 +4339,7 @@
                 <w:szCs w:val="22"/>
                 <w:lang w:val="en-US"/>
               </w:rPr>
-              <w:t>#</w:t>
-            </w:r>
-            <w:proofErr w:type="gramStart"/>
-            <w:r>
-              <w:rPr>
-                <w:iCs/>
-                <w:szCs w:val="22"/>
-                <w:lang w:val="en-US"/>
-              </w:rPr>
-              <w:t>ValidateVolume(</w:t>
-            </w:r>
-            <w:proofErr w:type="gramEnd"/>
-            <w:r>
-              <w:rPr>
-                <w:iCs/>
-                <w:szCs w:val="22"/>
-                <w:lang w:val="en-US"/>
-              </w:rPr>
-              <w:t xml:space="preserve">double volume, string </w:t>
-            </w:r>
-            <w:proofErr w:type="spellStart"/>
-            <w:r>
-              <w:rPr>
-                <w:iCs/>
-                <w:szCs w:val="22"/>
-                <w:lang w:val="en-US"/>
-              </w:rPr>
-              <w:t>figureType</w:t>
-            </w:r>
-            <w:proofErr w:type="spellEnd"/>
-            <w:r>
-              <w:rPr>
-                <w:iCs/>
-                <w:szCs w:val="22"/>
-                <w:lang w:val="en-US"/>
-              </w:rPr>
-              <w:t>)</w:t>
+              <w:t>#ValidateVolume(double volume, string figureType)</w:t>
             </w:r>
           </w:p>
         </w:tc>
@@ -4880,39 +4620,7 @@
                 <w:iCs/>
                 <w:szCs w:val="22"/>
               </w:rPr>
-              <w:t xml:space="preserve">Класс </w:t>
-            </w:r>
-            <w:proofErr w:type="spellStart"/>
-            <w:r>
-              <w:rPr>
-                <w:iCs/>
-                <w:szCs w:val="22"/>
-              </w:rPr>
-              <w:t>Sphere</w:t>
-            </w:r>
-            <w:proofErr w:type="spellEnd"/>
-            <w:r>
-              <w:rPr>
-                <w:iCs/>
-                <w:szCs w:val="22"/>
-              </w:rPr>
-              <w:t xml:space="preserve"> является дочерним классом </w:t>
-            </w:r>
-            <w:proofErr w:type="spellStart"/>
-            <w:r>
-              <w:rPr>
-                <w:iCs/>
-                <w:szCs w:val="22"/>
-              </w:rPr>
-              <w:t>VolumeFigureBase</w:t>
-            </w:r>
-            <w:proofErr w:type="spellEnd"/>
-            <w:r>
-              <w:rPr>
-                <w:iCs/>
-                <w:szCs w:val="22"/>
-              </w:rPr>
-              <w:t xml:space="preserve"> и описывает объёмную фигуру «Сфера». Класс хранит радиус сферы и реализует вычисление её объёма.</w:t>
+              <w:t>Класс Sphere является дочерним классом VolumeFigureBase и описывает объёмную фигуру «Сфера». Класс хранит радиус сферы и реализует вычисление её объёма.</w:t>
             </w:r>
           </w:p>
         </w:tc>
@@ -4964,17 +4672,8 @@
                 <w:iCs/>
                 <w:szCs w:val="22"/>
               </w:rPr>
-              <w:t>-_</w:t>
-            </w:r>
-            <w:proofErr w:type="spellStart"/>
-            <w:r>
-              <w:rPr>
-                <w:iCs/>
-                <w:szCs w:val="22"/>
-              </w:rPr>
-              <w:t>radius</w:t>
-            </w:r>
-            <w:proofErr w:type="spellEnd"/>
+              <w:t>-_radius</w:t>
+            </w:r>
           </w:p>
         </w:tc>
         <w:tc>
@@ -5156,18 +4855,8 @@
                 <w:szCs w:val="22"/>
                 <w:lang w:val="en-US"/>
               </w:rPr>
-              <w:t>+</w:t>
-            </w:r>
-            <w:proofErr w:type="spellStart"/>
-            <w:r>
-              <w:rPr>
-                <w:iCs/>
-                <w:szCs w:val="22"/>
-                <w:lang w:val="en-US"/>
-              </w:rPr>
-              <w:t>FigureType</w:t>
-            </w:r>
-            <w:proofErr w:type="spellEnd"/>
+              <w:t>+FigureType</w:t>
+            </w:r>
           </w:p>
         </w:tc>
         <w:tc>
@@ -5346,57 +5035,7 @@
                 <w:iCs/>
                 <w:szCs w:val="22"/>
               </w:rPr>
-              <w:t>+</w:t>
-            </w:r>
-            <w:proofErr w:type="spellStart"/>
-            <w:proofErr w:type="gramStart"/>
-            <w:r>
-              <w:rPr>
-                <w:iCs/>
-                <w:szCs w:val="22"/>
-              </w:rPr>
-              <w:t>Sphere</w:t>
-            </w:r>
-            <w:proofErr w:type="spellEnd"/>
-            <w:r>
-              <w:rPr>
-                <w:iCs/>
-                <w:szCs w:val="22"/>
-              </w:rPr>
-              <w:t>(</w:t>
-            </w:r>
-            <w:proofErr w:type="spellStart"/>
-            <w:proofErr w:type="gramEnd"/>
-            <w:r>
-              <w:rPr>
-                <w:iCs/>
-                <w:szCs w:val="22"/>
-              </w:rPr>
-              <w:t>double</w:t>
-            </w:r>
-            <w:proofErr w:type="spellEnd"/>
-            <w:r>
-              <w:rPr>
-                <w:iCs/>
-                <w:szCs w:val="22"/>
-              </w:rPr>
-              <w:t xml:space="preserve"> </w:t>
-            </w:r>
-            <w:proofErr w:type="spellStart"/>
-            <w:r>
-              <w:rPr>
-                <w:iCs/>
-                <w:szCs w:val="22"/>
-              </w:rPr>
-              <w:t>radius</w:t>
-            </w:r>
-            <w:proofErr w:type="spellEnd"/>
-            <w:r>
-              <w:rPr>
-                <w:iCs/>
-                <w:szCs w:val="22"/>
-              </w:rPr>
-              <w:t>)</w:t>
+              <w:t>+Sphere(double radius)</w:t>
             </w:r>
           </w:p>
         </w:tc>
@@ -5456,32 +5095,7 @@
                 <w:iCs/>
                 <w:szCs w:val="22"/>
               </w:rPr>
-              <w:t>+</w:t>
-            </w:r>
-            <w:proofErr w:type="spellStart"/>
-            <w:proofErr w:type="gramStart"/>
-            <w:r>
-              <w:rPr>
-                <w:iCs/>
-                <w:szCs w:val="22"/>
-              </w:rPr>
-              <w:t>GetDescription</w:t>
-            </w:r>
-            <w:proofErr w:type="spellEnd"/>
-            <w:r>
-              <w:rPr>
-                <w:iCs/>
-                <w:szCs w:val="22"/>
-              </w:rPr>
-              <w:t>(</w:t>
-            </w:r>
-            <w:proofErr w:type="gramEnd"/>
-            <w:r>
-              <w:rPr>
-                <w:iCs/>
-                <w:szCs w:val="22"/>
-              </w:rPr>
-              <w:t>)</w:t>
+              <w:t>+GetDescription()</w:t>
             </w:r>
           </w:p>
         </w:tc>
@@ -5597,17 +5211,8 @@
           <w:sz w:val="28"/>
           <w:szCs w:val="22"/>
         </w:rPr>
-        <w:t xml:space="preserve">Описание класса </w:t>
-      </w:r>
-      <w:proofErr w:type="spellStart"/>
-      <w:r>
-        <w:rPr>
-          <w:sz w:val="28"/>
-          <w:szCs w:val="22"/>
-        </w:rPr>
-        <w:t>Pyramid</w:t>
-      </w:r>
-      <w:proofErr w:type="spellEnd"/>
+        <w:t>Описание класса Pyramid</w:t>
+      </w:r>
     </w:p>
     <w:tbl>
       <w:tblPr>
@@ -5757,39 +5362,7 @@
                 <w:iCs/>
                 <w:szCs w:val="22"/>
               </w:rPr>
-              <w:t xml:space="preserve">Класс </w:t>
-            </w:r>
-            <w:proofErr w:type="spellStart"/>
-            <w:r>
-              <w:rPr>
-                <w:iCs/>
-                <w:szCs w:val="22"/>
-              </w:rPr>
-              <w:t>Pyramid</w:t>
-            </w:r>
-            <w:proofErr w:type="spellEnd"/>
-            <w:r>
-              <w:rPr>
-                <w:iCs/>
-                <w:szCs w:val="22"/>
-              </w:rPr>
-              <w:t xml:space="preserve"> – дочерний класс </w:t>
-            </w:r>
-            <w:proofErr w:type="spellStart"/>
-            <w:r>
-              <w:rPr>
-                <w:iCs/>
-                <w:szCs w:val="22"/>
-              </w:rPr>
-              <w:t>VolumeFigureBase</w:t>
-            </w:r>
-            <w:proofErr w:type="spellEnd"/>
-            <w:r>
-              <w:rPr>
-                <w:iCs/>
-                <w:szCs w:val="22"/>
-              </w:rPr>
-              <w:t>, описывающий пирамиду с прямоугольным основанием</w:t>
+              <w:t>Класс Pyramid – дочерний класс VolumeFigureBase, описывающий пирамиду с прямоугольным основанием</w:t>
             </w:r>
           </w:p>
         </w:tc>
@@ -5843,7 +5416,6 @@
               </w:rPr>
               <w:t>-_</w:t>
             </w:r>
-            <w:proofErr w:type="spellStart"/>
             <w:r>
               <w:rPr>
                 <w:iCs/>
@@ -5851,7 +5423,6 @@
               </w:rPr>
               <w:t>baseLength</w:t>
             </w:r>
-            <w:proofErr w:type="spellEnd"/>
           </w:p>
         </w:tc>
         <w:tc>
@@ -5926,17 +5497,8 @@
                 <w:iCs/>
                 <w:szCs w:val="22"/>
               </w:rPr>
-              <w:t>_</w:t>
-            </w:r>
-            <w:proofErr w:type="spellStart"/>
-            <w:r>
-              <w:rPr>
-                <w:iCs/>
-                <w:szCs w:val="22"/>
-              </w:rPr>
-              <w:t>baseWidth</w:t>
-            </w:r>
-            <w:proofErr w:type="spellEnd"/>
+              <w:t>_baseWidth</w:t>
+            </w:r>
           </w:p>
         </w:tc>
         <w:tc>
@@ -6012,17 +5574,8 @@
                 <w:iCs/>
                 <w:szCs w:val="22"/>
               </w:rPr>
-              <w:t>_</w:t>
-            </w:r>
-            <w:proofErr w:type="spellStart"/>
-            <w:r>
-              <w:rPr>
-                <w:iCs/>
-                <w:szCs w:val="22"/>
-              </w:rPr>
-              <w:t>height</w:t>
-            </w:r>
-            <w:proofErr w:type="spellEnd"/>
+              <w:t>_height</w:t>
+            </w:r>
           </w:p>
         </w:tc>
         <w:tc>
@@ -6119,18 +5672,8 @@
                 <w:szCs w:val="22"/>
                 <w:lang w:val="en-US"/>
               </w:rPr>
-              <w:t>+</w:t>
-            </w:r>
-            <w:proofErr w:type="spellStart"/>
-            <w:r>
-              <w:rPr>
-                <w:iCs/>
-                <w:szCs w:val="22"/>
-                <w:lang w:val="en-US"/>
-              </w:rPr>
-              <w:t>BaseLength</w:t>
-            </w:r>
-            <w:proofErr w:type="spellEnd"/>
+              <w:t>+BaseLength</w:t>
+            </w:r>
           </w:p>
         </w:tc>
         <w:tc>
@@ -6198,18 +5741,8 @@
                 <w:szCs w:val="22"/>
                 <w:lang w:val="en-US"/>
               </w:rPr>
-              <w:t>+</w:t>
-            </w:r>
-            <w:proofErr w:type="spellStart"/>
-            <w:r>
-              <w:rPr>
-                <w:iCs/>
-                <w:szCs w:val="22"/>
-                <w:lang w:val="en-US"/>
-              </w:rPr>
-              <w:t>BaseWidth</w:t>
-            </w:r>
-            <w:proofErr w:type="spellEnd"/>
+              <w:t>+BaseWidth</w:t>
+            </w:r>
           </w:p>
         </w:tc>
         <w:tc>
@@ -6346,18 +5879,8 @@
                 <w:szCs w:val="22"/>
                 <w:lang w:val="en-US"/>
               </w:rPr>
-              <w:t>+</w:t>
-            </w:r>
-            <w:proofErr w:type="spellStart"/>
-            <w:r>
-              <w:rPr>
-                <w:iCs/>
-                <w:szCs w:val="22"/>
-                <w:lang w:val="en-US"/>
-              </w:rPr>
-              <w:t>BaseArea</w:t>
-            </w:r>
-            <w:proofErr w:type="spellEnd"/>
+              <w:t>+BaseArea</w:t>
+            </w:r>
           </w:p>
         </w:tc>
         <w:tc>
@@ -6427,7 +5950,6 @@
               </w:rPr>
               <w:t>+</w:t>
             </w:r>
-            <w:proofErr w:type="spellStart"/>
             <w:r>
               <w:rPr>
                 <w:iCs/>
@@ -6435,7 +5957,6 @@
               </w:rPr>
               <w:t>FigureType</w:t>
             </w:r>
-            <w:proofErr w:type="spellEnd"/>
           </w:p>
         </w:tc>
         <w:tc>
@@ -6601,61 +6122,7 @@
                 <w:szCs w:val="22"/>
                 <w:lang w:val="en-US"/>
               </w:rPr>
-              <w:t>+</w:t>
-            </w:r>
-            <w:proofErr w:type="gramStart"/>
-            <w:r>
-              <w:rPr>
-                <w:iCs/>
-                <w:szCs w:val="22"/>
-                <w:lang w:val="en-US"/>
-              </w:rPr>
-              <w:t>Pyramid(</w:t>
-            </w:r>
-            <w:proofErr w:type="gramEnd"/>
-            <w:r>
-              <w:rPr>
-                <w:iCs/>
-                <w:szCs w:val="22"/>
-                <w:lang w:val="en-US"/>
-              </w:rPr>
-              <w:t xml:space="preserve">double </w:t>
-            </w:r>
-            <w:proofErr w:type="spellStart"/>
-            <w:r>
-              <w:rPr>
-                <w:iCs/>
-                <w:szCs w:val="22"/>
-                <w:lang w:val="en-US"/>
-              </w:rPr>
-              <w:t>baseLength</w:t>
-            </w:r>
-            <w:proofErr w:type="spellEnd"/>
-            <w:r>
-              <w:rPr>
-                <w:iCs/>
-                <w:szCs w:val="22"/>
-                <w:lang w:val="en-US"/>
-              </w:rPr>
-              <w:t xml:space="preserve">, double </w:t>
-            </w:r>
-            <w:proofErr w:type="spellStart"/>
-            <w:r>
-              <w:rPr>
-                <w:iCs/>
-                <w:szCs w:val="22"/>
-                <w:lang w:val="en-US"/>
-              </w:rPr>
-              <w:t>baseWidth</w:t>
-            </w:r>
-            <w:proofErr w:type="spellEnd"/>
-            <w:r>
-              <w:rPr>
-                <w:iCs/>
-                <w:szCs w:val="22"/>
-                <w:lang w:val="en-US"/>
-              </w:rPr>
-              <w:t>, double height)</w:t>
+              <w:t>+Pyramid(double baseLength, double baseWidth, double height)</w:t>
             </w:r>
           </w:p>
         </w:tc>
@@ -6715,32 +6182,7 @@
                 <w:iCs/>
                 <w:szCs w:val="22"/>
               </w:rPr>
-              <w:t>+</w:t>
-            </w:r>
-            <w:proofErr w:type="spellStart"/>
-            <w:proofErr w:type="gramStart"/>
-            <w:r>
-              <w:rPr>
-                <w:iCs/>
-                <w:szCs w:val="22"/>
-              </w:rPr>
-              <w:t>GetDescription</w:t>
-            </w:r>
-            <w:proofErr w:type="spellEnd"/>
-            <w:r>
-              <w:rPr>
-                <w:iCs/>
-                <w:szCs w:val="22"/>
-              </w:rPr>
-              <w:t>(</w:t>
-            </w:r>
-            <w:proofErr w:type="gramEnd"/>
-            <w:r>
-              <w:rPr>
-                <w:iCs/>
-                <w:szCs w:val="22"/>
-              </w:rPr>
-              <w:t>)</w:t>
+              <w:t>+GetDescription()</w:t>
             </w:r>
           </w:p>
         </w:tc>
@@ -7006,39 +6448,7 @@
                 <w:iCs/>
                 <w:szCs w:val="22"/>
               </w:rPr>
-              <w:t xml:space="preserve">Класс </w:t>
-            </w:r>
-            <w:proofErr w:type="spellStart"/>
-            <w:r>
-              <w:rPr>
-                <w:iCs/>
-                <w:szCs w:val="22"/>
-              </w:rPr>
-              <w:t>Parallelepiped</w:t>
-            </w:r>
-            <w:proofErr w:type="spellEnd"/>
-            <w:r>
-              <w:rPr>
-                <w:iCs/>
-                <w:szCs w:val="22"/>
-              </w:rPr>
-              <w:t xml:space="preserve"> – дочерний класс </w:t>
-            </w:r>
-            <w:proofErr w:type="spellStart"/>
-            <w:r>
-              <w:rPr>
-                <w:iCs/>
-                <w:szCs w:val="22"/>
-              </w:rPr>
-              <w:t>VolumeFigureBase</w:t>
-            </w:r>
-            <w:proofErr w:type="spellEnd"/>
-            <w:r>
-              <w:rPr>
-                <w:iCs/>
-                <w:szCs w:val="22"/>
-              </w:rPr>
-              <w:t>, описывающий прямоугольный параллелепипед</w:t>
+              <w:t>Класс Parallelepiped – дочерний класс VolumeFigureBase, описывающий прямоугольный параллелепипед</w:t>
             </w:r>
           </w:p>
         </w:tc>
@@ -7093,19 +6503,8 @@
                 <w:sz w:val="26"/>
                 <w:szCs w:val="26"/>
               </w:rPr>
-              <w:t>-_</w:t>
-            </w:r>
-            <w:proofErr w:type="spellStart"/>
-            <w:r>
-              <w:rPr>
-                <w:rFonts w:ascii="Calibri" w:hAnsi="Calibri" w:cs="Calibri"/>
-                <w:color w:val="000000"/>
-                <w:sz w:val="26"/>
-                <w:szCs w:val="26"/>
-              </w:rPr>
-              <w:t>length</w:t>
-            </w:r>
-            <w:proofErr w:type="spellEnd"/>
+              <w:t>-_length</w:t>
+            </w:r>
           </w:p>
         </w:tc>
         <w:tc>
@@ -7122,7 +6521,6 @@
                 <w:lang w:val="en-US"/>
               </w:rPr>
             </w:pPr>
-            <w:proofErr w:type="spellStart"/>
             <w:r>
               <w:rPr>
                 <w:rFonts w:ascii="Calibri" w:hAnsi="Calibri" w:cs="Calibri"/>
@@ -7132,7 +6530,6 @@
               </w:rPr>
               <w:t>double</w:t>
             </w:r>
-            <w:proofErr w:type="spellEnd"/>
           </w:p>
         </w:tc>
         <w:tc>
@@ -7182,19 +6579,8 @@
                 <w:sz w:val="26"/>
                 <w:szCs w:val="26"/>
               </w:rPr>
-              <w:t>-_</w:t>
-            </w:r>
-            <w:proofErr w:type="spellStart"/>
-            <w:r>
-              <w:rPr>
-                <w:rFonts w:ascii="Calibri" w:hAnsi="Calibri" w:cs="Calibri"/>
-                <w:color w:val="000000"/>
-                <w:sz w:val="26"/>
-                <w:szCs w:val="26"/>
-              </w:rPr>
-              <w:t>width</w:t>
-            </w:r>
-            <w:proofErr w:type="spellEnd"/>
+              <w:t>-_width</w:t>
+            </w:r>
           </w:p>
         </w:tc>
         <w:tc>
@@ -7211,7 +6597,6 @@
                 <w:lang w:val="en-US"/>
               </w:rPr>
             </w:pPr>
-            <w:proofErr w:type="spellStart"/>
             <w:r>
               <w:rPr>
                 <w:rFonts w:ascii="Calibri" w:hAnsi="Calibri" w:cs="Calibri"/>
@@ -7221,7 +6606,6 @@
               </w:rPr>
               <w:t>double</w:t>
             </w:r>
-            <w:proofErr w:type="spellEnd"/>
           </w:p>
         </w:tc>
         <w:tc>
@@ -7271,19 +6655,8 @@
                 <w:sz w:val="26"/>
                 <w:szCs w:val="26"/>
               </w:rPr>
-              <w:t>-_</w:t>
-            </w:r>
-            <w:proofErr w:type="spellStart"/>
-            <w:r>
-              <w:rPr>
-                <w:rFonts w:ascii="Calibri" w:hAnsi="Calibri" w:cs="Calibri"/>
-                <w:color w:val="000000"/>
-                <w:sz w:val="26"/>
-                <w:szCs w:val="26"/>
-              </w:rPr>
-              <w:t>height</w:t>
-            </w:r>
-            <w:proofErr w:type="spellEnd"/>
+              <w:t>-_height</w:t>
+            </w:r>
           </w:p>
         </w:tc>
         <w:tc>
@@ -7300,7 +6673,6 @@
                 <w:lang w:val="en-US"/>
               </w:rPr>
             </w:pPr>
-            <w:proofErr w:type="spellStart"/>
             <w:r>
               <w:rPr>
                 <w:rFonts w:ascii="Calibri" w:hAnsi="Calibri" w:cs="Calibri"/>
@@ -7310,7 +6682,6 @@
               </w:rPr>
               <w:t>double</w:t>
             </w:r>
-            <w:proofErr w:type="spellEnd"/>
           </w:p>
         </w:tc>
         <w:tc>
@@ -7389,19 +6760,8 @@
                 <w:sz w:val="26"/>
                 <w:szCs w:val="26"/>
               </w:rPr>
-              <w:t>+</w:t>
-            </w:r>
-            <w:proofErr w:type="spellStart"/>
-            <w:r>
-              <w:rPr>
-                <w:rFonts w:ascii="Calibri" w:hAnsi="Calibri" w:cs="Calibri"/>
-                <w:color w:val="000000"/>
-                <w:sz w:val="26"/>
-                <w:szCs w:val="26"/>
-              </w:rPr>
-              <w:t>Length</w:t>
-            </w:r>
-            <w:proofErr w:type="spellEnd"/>
+              <w:t>+Length</w:t>
+            </w:r>
           </w:p>
         </w:tc>
         <w:tc>
@@ -7418,7 +6778,6 @@
                 <w:lang w:val="en-US"/>
               </w:rPr>
             </w:pPr>
-            <w:proofErr w:type="spellStart"/>
             <w:r>
               <w:rPr>
                 <w:rFonts w:ascii="Calibri" w:hAnsi="Calibri" w:cs="Calibri"/>
@@ -7428,7 +6787,6 @@
               </w:rPr>
               <w:t>double</w:t>
             </w:r>
-            <w:proofErr w:type="spellEnd"/>
           </w:p>
         </w:tc>
         <w:tc>
@@ -7478,19 +6836,8 @@
                 <w:sz w:val="26"/>
                 <w:szCs w:val="26"/>
               </w:rPr>
-              <w:t>+</w:t>
-            </w:r>
-            <w:proofErr w:type="spellStart"/>
-            <w:r>
-              <w:rPr>
-                <w:rFonts w:ascii="Calibri" w:hAnsi="Calibri" w:cs="Calibri"/>
-                <w:color w:val="000000"/>
-                <w:sz w:val="26"/>
-                <w:szCs w:val="26"/>
-              </w:rPr>
-              <w:t>Width</w:t>
-            </w:r>
-            <w:proofErr w:type="spellEnd"/>
+              <w:t>+Width</w:t>
+            </w:r>
           </w:p>
         </w:tc>
         <w:tc>
@@ -7507,7 +6854,6 @@
                 <w:lang w:val="en-US"/>
               </w:rPr>
             </w:pPr>
-            <w:proofErr w:type="spellStart"/>
             <w:r>
               <w:rPr>
                 <w:rFonts w:ascii="Calibri" w:hAnsi="Calibri" w:cs="Calibri"/>
@@ -7517,7 +6863,6 @@
               </w:rPr>
               <w:t>double</w:t>
             </w:r>
-            <w:proofErr w:type="spellEnd"/>
           </w:p>
         </w:tc>
         <w:tc>
@@ -7567,19 +6912,8 @@
                 <w:sz w:val="26"/>
                 <w:szCs w:val="26"/>
               </w:rPr>
-              <w:t>+</w:t>
-            </w:r>
-            <w:proofErr w:type="spellStart"/>
-            <w:r>
-              <w:rPr>
-                <w:rFonts w:ascii="Calibri" w:hAnsi="Calibri" w:cs="Calibri"/>
-                <w:color w:val="000000"/>
-                <w:sz w:val="26"/>
-                <w:szCs w:val="26"/>
-              </w:rPr>
-              <w:t>Height</w:t>
-            </w:r>
-            <w:proofErr w:type="spellEnd"/>
+              <w:t>+Height</w:t>
+            </w:r>
           </w:p>
         </w:tc>
         <w:tc>
@@ -7596,7 +6930,6 @@
                 <w:lang w:val="en-US"/>
               </w:rPr>
             </w:pPr>
-            <w:proofErr w:type="spellStart"/>
             <w:r>
               <w:rPr>
                 <w:rFonts w:ascii="Calibri" w:hAnsi="Calibri" w:cs="Calibri"/>
@@ -7606,7 +6939,6 @@
               </w:rPr>
               <w:t>double</w:t>
             </w:r>
-            <w:proofErr w:type="spellEnd"/>
           </w:p>
         </w:tc>
         <w:tc>
@@ -7656,19 +6988,8 @@
                 <w:sz w:val="26"/>
                 <w:szCs w:val="26"/>
               </w:rPr>
-              <w:t>+</w:t>
-            </w:r>
-            <w:proofErr w:type="spellStart"/>
-            <w:r>
-              <w:rPr>
-                <w:rFonts w:ascii="Calibri" w:hAnsi="Calibri" w:cs="Calibri"/>
-                <w:color w:val="000000"/>
-                <w:sz w:val="26"/>
-                <w:szCs w:val="26"/>
-              </w:rPr>
-              <w:t>FigureType</w:t>
-            </w:r>
-            <w:proofErr w:type="spellEnd"/>
+              <w:t>+FigureType</w:t>
+            </w:r>
           </w:p>
         </w:tc>
         <w:tc>
@@ -7685,7 +7006,6 @@
                 <w:lang w:val="en-US"/>
               </w:rPr>
             </w:pPr>
-            <w:proofErr w:type="spellStart"/>
             <w:r>
               <w:rPr>
                 <w:rFonts w:ascii="Calibri" w:hAnsi="Calibri" w:cs="Calibri"/>
@@ -7695,7 +7015,6 @@
               </w:rPr>
               <w:t>string</w:t>
             </w:r>
-            <w:proofErr w:type="spellEnd"/>
           </w:p>
         </w:tc>
         <w:tc>
@@ -7745,19 +7064,8 @@
                 <w:sz w:val="26"/>
                 <w:szCs w:val="26"/>
               </w:rPr>
-              <w:t>+</w:t>
-            </w:r>
-            <w:proofErr w:type="spellStart"/>
-            <w:r>
-              <w:rPr>
-                <w:rFonts w:ascii="Calibri" w:hAnsi="Calibri" w:cs="Calibri"/>
-                <w:color w:val="000000"/>
-                <w:sz w:val="26"/>
-                <w:szCs w:val="26"/>
-              </w:rPr>
-              <w:t>Volume</w:t>
-            </w:r>
-            <w:proofErr w:type="spellEnd"/>
+              <w:t>+Volume</w:t>
+            </w:r>
           </w:p>
         </w:tc>
         <w:tc>
@@ -7774,7 +7082,6 @@
                 <w:lang w:val="en-US"/>
               </w:rPr>
             </w:pPr>
-            <w:proofErr w:type="spellStart"/>
             <w:r>
               <w:rPr>
                 <w:rFonts w:ascii="Calibri" w:hAnsi="Calibri" w:cs="Calibri"/>
@@ -7784,7 +7091,6 @@
               </w:rPr>
               <w:t>double</w:t>
             </w:r>
-            <w:proofErr w:type="spellEnd"/>
           </w:p>
         </w:tc>
         <w:tc>
@@ -7862,25 +7168,7 @@
                 <w:lang w:val="en-US"/>
               </w:rPr>
               <w:lastRenderedPageBreak/>
-              <w:t>+</w:t>
-            </w:r>
-            <w:proofErr w:type="gramStart"/>
-            <w:r>
-              <w:rPr>
-                <w:iCs/>
-                <w:szCs w:val="22"/>
-                <w:lang w:val="en-US"/>
-              </w:rPr>
-              <w:t>Parallelepiped(</w:t>
-            </w:r>
-            <w:proofErr w:type="gramEnd"/>
-            <w:r>
-              <w:rPr>
-                <w:iCs/>
-                <w:szCs w:val="22"/>
-                <w:lang w:val="en-US"/>
-              </w:rPr>
-              <w:t>double length, double width, double height)</w:t>
+              <w:t>+Parallelepiped(double length, double width, double height)</w:t>
             </w:r>
           </w:p>
         </w:tc>
@@ -7940,32 +7228,7 @@
                 <w:iCs/>
                 <w:szCs w:val="22"/>
               </w:rPr>
-              <w:t>+</w:t>
-            </w:r>
-            <w:proofErr w:type="spellStart"/>
-            <w:proofErr w:type="gramStart"/>
-            <w:r>
-              <w:rPr>
-                <w:iCs/>
-                <w:szCs w:val="22"/>
-              </w:rPr>
-              <w:t>GetDescription</w:t>
-            </w:r>
-            <w:proofErr w:type="spellEnd"/>
-            <w:r>
-              <w:rPr>
-                <w:iCs/>
-                <w:szCs w:val="22"/>
-              </w:rPr>
-              <w:t>(</w:t>
-            </w:r>
-            <w:proofErr w:type="gramEnd"/>
-            <w:r>
-              <w:rPr>
-                <w:iCs/>
-                <w:szCs w:val="22"/>
-              </w:rPr>
-              <w:t>)</w:t>
+              <w:t>+GetDescription()</w:t>
             </w:r>
           </w:p>
         </w:tc>
@@ -8036,58 +7299,31 @@
         </w:rPr>
       </w:pPr>
       <w:bookmarkStart w:id="5" w:name="_Toc232211096"/>
-      <w:proofErr w:type="spellStart"/>
       <w:r>
         <w:rPr>
           <w:lang w:val="en-US"/>
         </w:rPr>
-        <w:t>Дерево</w:t>
-      </w:r>
-      <w:proofErr w:type="spellEnd"/>
+        <w:t xml:space="preserve">Дерево ветвлений </w:t>
+      </w:r>
       <w:r>
         <w:rPr>
           <w:lang w:val="en-US"/>
         </w:rPr>
-        <w:t xml:space="preserve"> </w:t>
-      </w:r>
-      <w:proofErr w:type="spellStart"/>
-      <w:r>
+        <w:t>Git</w:t>
+      </w:r>
+      <w:bookmarkEnd w:id="5"/>
+    </w:p>
+    <w:p>
+      <w:pPr>
         <w:rPr>
           <w:lang w:val="en-US"/>
         </w:rPr>
-        <w:t>ветвлений</w:t>
-      </w:r>
-      <w:proofErr w:type="spellEnd"/>
-      <w:r>
-        <w:rPr>
-          <w:lang w:val="en-US"/>
-        </w:rPr>
-        <w:t xml:space="preserve"> </w:t>
-      </w:r>
-      <w:r>
-        <w:rPr>
-          <w:lang w:val="en-US"/>
-        </w:rPr>
-        <w:t>Git</w:t>
-      </w:r>
-      <w:bookmarkEnd w:id="5"/>
-    </w:p>
-    <w:p>
-      <w:pPr>
-        <w:rPr>
-          <w:lang w:val="en-US"/>
-        </w:rPr>
       </w:pPr>
       <w:r>
         <w:t xml:space="preserve">В данном разделе представлена история изменений проекта, сформированная с использованием системы контроля версий Git. На рисунке 3 показано дерево коммитов ветки </w:t>
       </w:r>
-      <w:proofErr w:type="spellStart"/>
-      <w:r>
-        <w:t>feature</w:t>
-      </w:r>
-      <w:proofErr w:type="spellEnd"/>
-      <w:r>
-        <w:t>/lab04</w:t>
+      <w:r>
+        <w:t>feature/lab04</w:t>
       </w:r>
       <w:r>
         <w:rPr>
@@ -8213,28 +7449,12 @@
         <w:t xml:space="preserve"> – </w:t>
       </w:r>
       <w:r>
-        <w:t>Дерево ветвлений «</w:t>
-      </w:r>
-      <w:proofErr w:type="spellStart"/>
-      <w:r>
-        <w:t>feature</w:t>
-      </w:r>
-      <w:proofErr w:type="spellEnd"/>
-      <w:r>
-        <w:t>/lab04»</w:t>
-      </w:r>
-    </w:p>
-    <w:p>
-      <w:r>
-        <w:t xml:space="preserve">На рисунке видно, что текущая ветка </w:t>
-      </w:r>
-      <w:proofErr w:type="spellStart"/>
-      <w:r>
-        <w:t>feature</w:t>
-      </w:r>
-      <w:proofErr w:type="spellEnd"/>
-      <w:r>
-        <w:t>/lab04 содержит последовательность коммитов, отражающих этапы разработки и исправления программы. В ходе работы были выполнены исправления, связанные с добавлением фигур, устранением ошибок компиляции, удалением TODO-комментариев, а также изменением уровня абстракции и работы с интерфейсом.</w:t>
+        <w:t>Дерево ветвлений «feature/lab04»</w:t>
+      </w:r>
+    </w:p>
+    <w:p>
+      <w:r>
+        <w:t>На рисунке видно, что текущая ветка feature/lab04 содержит последовательность коммитов, отражающих этапы разработки и исправления программы. В ходе работы были выполнены исправления, связанные с добавлением фигур, устранением ошибок компиляции, удалением TODO-комментариев, а также изменением уровня абстракции и работы с интерфейсом.</w:t>
       </w:r>
     </w:p>
     <w:p>
@@ -8251,58 +7471,14 @@
         </w:rPr>
       </w:pPr>
       <w:bookmarkStart w:id="7" w:name="_Toc232211097"/>
-      <w:proofErr w:type="spellStart"/>
       <w:r>
         <w:rPr>
           <w:lang w:val="en-US"/>
         </w:rPr>
         <w:lastRenderedPageBreak/>
-        <w:t>Функциональное</w:t>
-      </w:r>
-      <w:proofErr w:type="spellEnd"/>
-      <w:r>
-        <w:rPr>
-          <w:lang w:val="en-US"/>
-        </w:rPr>
-        <w:t xml:space="preserve"> </w:t>
-      </w:r>
-      <w:proofErr w:type="spellStart"/>
-      <w:r>
-        <w:rPr>
-          <w:lang w:val="en-US"/>
-        </w:rPr>
-        <w:t>тестирование</w:t>
-      </w:r>
-      <w:proofErr w:type="spellEnd"/>
-      <w:r>
-        <w:rPr>
-          <w:lang w:val="en-US"/>
-        </w:rPr>
-        <w:t xml:space="preserve"> </w:t>
-      </w:r>
-      <w:proofErr w:type="spellStart"/>
-      <w:r>
-        <w:rPr>
-          <w:lang w:val="en-US"/>
-        </w:rPr>
-        <w:t>разработанной</w:t>
-      </w:r>
-      <w:proofErr w:type="spellEnd"/>
-      <w:r>
-        <w:rPr>
-          <w:lang w:val="en-US"/>
-        </w:rPr>
-        <w:t xml:space="preserve"> </w:t>
-      </w:r>
-      <w:proofErr w:type="spellStart"/>
-      <w:r>
-        <w:rPr>
-          <w:lang w:val="en-US"/>
-        </w:rPr>
-        <w:t>программы</w:t>
+        <w:t>Функциональное тестирование разработанной программы</w:t>
       </w:r>
       <w:bookmarkEnd w:id="7"/>
-      <w:proofErr w:type="spellEnd"/>
     </w:p>
     <w:p>
       <w:r>
@@ -8408,6 +7584,7 @@
     <w:p>
       <w:pPr>
         <w:pStyle w:val="aff"/>
+        <w:spacing w:after="0"/>
       </w:pPr>
       <w:r>
         <w:t xml:space="preserve">1 – </w:t>
@@ -8485,14 +7662,12 @@
       <w:r>
         <w:t>Главное окно программы "</w:t>
       </w:r>
-      <w:proofErr w:type="spellStart"/>
       <w:r>
         <w:rPr>
           <w:lang w:val="en-US"/>
         </w:rPr>
         <w:t>RusWin</w:t>
       </w:r>
-      <w:proofErr w:type="spellEnd"/>
       <w:r>
         <w:t xml:space="preserve">3 </w:t>
       </w:r>
@@ -8597,7 +7772,13 @@
     </w:p>
     <w:p>
       <w:r>
-        <w:t xml:space="preserve">В данном разделе проверяется работа функции добавления новых объёмных фигур. Окно добавления фигуры позволяет выбрать тип создаваемого объекта, ввести необходимые параметры и подтвердить добавление с помощью кнопки «Ок». При выборе разных типов фигур состав полей ввода изменяется: для сферы указывается радиус, для пирамиды </w:t>
+        <w:t>В данном разделе проверяется работа функции добавления новых объёмных фигур. Окно добавления фигуры позволяет выбрать тип создаваемого объекта, ввести необходимые параметры и подтвердить добавление с помощью кнопки «О</w:t>
+      </w:r>
+      <w:r>
+        <w:t>К</w:t>
+      </w:r>
+      <w:r>
+        <w:t xml:space="preserve">». При выборе разных типов фигур состав полей ввода изменяется: для сферы указывается радиус, для пирамиды </w:t>
       </w:r>
       <w:r>
         <w:t>–</w:t>
@@ -8668,9 +7849,9 @@
       </w:pPr>
       <w:r>
         <w:drawing>
-          <wp:inline distT="0" distB="0" distL="0" distR="0" wp14:anchorId="0F162BFB" wp14:editId="3A9BDA97">
-            <wp:extent cx="2932982" cy="1984076"/>
-            <wp:effectExtent l="0" t="0" r="1270" b="0"/>
+          <wp:inline distT="0" distB="0" distL="0" distR="0" wp14:anchorId="0F162BFB" wp14:editId="6F3BEA7F">
+            <wp:extent cx="2766022" cy="1871133"/>
+            <wp:effectExtent l="0" t="0" r="0" b="0"/>
             <wp:docPr id="2099945330" name="Рисунок 1"/>
             <wp:cNvGraphicFramePr>
               <a:graphicFrameLocks xmlns:a="http://schemas.openxmlformats.org/drawingml/2006/main" noChangeAspect="1"/>
@@ -8691,7 +7872,7 @@
                   <pic:spPr>
                     <a:xfrm>
                       <a:off x="0" y="0"/>
-                      <a:ext cx="2939505" cy="1988489"/>
+                      <a:ext cx="2788582" cy="1886394"/>
                     </a:xfrm>
                     <a:prstGeom prst="rect">
                       <a:avLst/>
@@ -8707,6 +7888,7 @@
     <w:p>
       <w:pPr>
         <w:pStyle w:val="aff"/>
+        <w:spacing w:after="0"/>
       </w:pPr>
       <w:r>
         <w:t>1 – Выбор типа фигуры; 2 – поле ввода исходных данных для выбранной фигуры</w:t>
@@ -8717,48 +7899,48 @@
         <w:pStyle w:val="aff"/>
       </w:pPr>
       <w:r>
+        <w:t xml:space="preserve">Рисунок </w:t>
+      </w:r>
+      <w:bookmarkStart w:id="11" w:name="Рис_5_добавление_сферы"/>
+      <w:r>
+        <w:fldChar w:fldCharType="begin"/>
+      </w:r>
+      <w:r>
+        <w:instrText xml:space="preserve"> SEQ Рисунок \* ARABIC </w:instrText>
+      </w:r>
+      <w:r>
+        <w:fldChar w:fldCharType="separate"/>
+      </w:r>
+      <w:r>
+        <w:rPr>
+          <w:noProof/>
+        </w:rPr>
+        <w:t>5</w:t>
+      </w:r>
+      <w:r>
+        <w:rPr>
+          <w:noProof/>
+        </w:rPr>
+        <w:fldChar w:fldCharType="end"/>
+      </w:r>
+      <w:bookmarkEnd w:id="11"/>
+      <w:r>
+        <w:t xml:space="preserve"> – Добавление фигуры</w:t>
+      </w:r>
+      <w:r>
+        <w:t xml:space="preserve"> «Сфера»</w:t>
+      </w:r>
+    </w:p>
+    <w:p>
+      <w:pPr>
+        <w:pStyle w:val="af9"/>
+      </w:pPr>
+      <w:r>
         <w:lastRenderedPageBreak/>
-        <w:t xml:space="preserve">Рисунок </w:t>
-      </w:r>
-      <w:bookmarkStart w:id="11" w:name="Рис_5_добавление_сферы"/>
-      <w:r>
-        <w:fldChar w:fldCharType="begin"/>
-      </w:r>
-      <w:r>
-        <w:instrText xml:space="preserve"> SEQ Рисунок \* ARABIC </w:instrText>
-      </w:r>
-      <w:r>
-        <w:fldChar w:fldCharType="separate"/>
-      </w:r>
-      <w:r>
-        <w:rPr>
-          <w:noProof/>
-        </w:rPr>
-        <w:t>5</w:t>
-      </w:r>
-      <w:r>
-        <w:rPr>
-          <w:noProof/>
-        </w:rPr>
-        <w:fldChar w:fldCharType="end"/>
-      </w:r>
-      <w:bookmarkEnd w:id="11"/>
-      <w:r>
-        <w:t xml:space="preserve"> – Добавление фигуры</w:t>
-      </w:r>
-      <w:r>
-        <w:t xml:space="preserve"> «Сфера»</w:t>
-      </w:r>
-    </w:p>
-    <w:p>
-      <w:pPr>
-        <w:pStyle w:val="af9"/>
-      </w:pPr>
-      <w:r>
         <w:drawing>
-          <wp:inline distT="0" distB="0" distL="0" distR="0" wp14:anchorId="19188639" wp14:editId="01C0374D">
-            <wp:extent cx="3051865" cy="2047875"/>
-            <wp:effectExtent l="0" t="0" r="0" b="0"/>
+          <wp:inline distT="0" distB="0" distL="0" distR="0" wp14:anchorId="19188639" wp14:editId="78E614A1">
+            <wp:extent cx="2813708" cy="1888066"/>
+            <wp:effectExtent l="0" t="0" r="5715" b="0"/>
             <wp:docPr id="2131735048" name="Рисунок 2"/>
             <wp:cNvGraphicFramePr>
               <a:graphicFrameLocks xmlns:a="http://schemas.openxmlformats.org/drawingml/2006/main" noChangeAspect="1"/>
@@ -8788,7 +7970,7 @@
                   <pic:spPr bwMode="auto">
                     <a:xfrm>
                       <a:off x="0" y="0"/>
-                      <a:ext cx="3057099" cy="2051387"/>
+                      <a:ext cx="2821315" cy="1893171"/>
                     </a:xfrm>
                     <a:prstGeom prst="rect">
                       <a:avLst/>
@@ -8830,9 +8012,9 @@
       </w:pPr>
       <w:r>
         <w:drawing>
-          <wp:inline distT="0" distB="0" distL="0" distR="0" wp14:anchorId="23377CAB" wp14:editId="7DFC7D20">
-            <wp:extent cx="3028950" cy="2023709"/>
-            <wp:effectExtent l="0" t="0" r="0" b="0"/>
+          <wp:inline distT="0" distB="0" distL="0" distR="0" wp14:anchorId="23377CAB" wp14:editId="173293FC">
+            <wp:extent cx="2810933" cy="1878047"/>
+            <wp:effectExtent l="0" t="0" r="8890" b="8255"/>
             <wp:docPr id="1235610959" name="Рисунок 4"/>
             <wp:cNvGraphicFramePr>
               <a:graphicFrameLocks xmlns:a="http://schemas.openxmlformats.org/drawingml/2006/main" noChangeAspect="1"/>
@@ -8862,7 +8044,7 @@
                   <pic:spPr bwMode="auto">
                     <a:xfrm>
                       <a:off x="0" y="0"/>
-                      <a:ext cx="3037508" cy="2029427"/>
+                      <a:ext cx="2823174" cy="1886226"/>
                     </a:xfrm>
                     <a:prstGeom prst="rect">
                       <a:avLst/>
@@ -9092,8 +8274,15 @@
           <w:sz w:val="28"/>
           <w:szCs w:val="20"/>
         </w:rPr>
+        <w:t xml:space="preserve">Также была проверена обработка некорректного ввода при добавлении пирамиды. В отдельные поля были введены значения, не являющиеся </w:t>
+      </w:r>
+      <w:r>
+        <w:rPr>
+          <w:sz w:val="28"/>
+          <w:szCs w:val="20"/>
+        </w:rPr>
         <w:lastRenderedPageBreak/>
-        <w:t xml:space="preserve">Также была проверена обработка некорректного ввода при добавлении пирамиды. В отдельные поля были введены значения, не являющиеся положительными конечными числами. В результате программа заблокировала создание фигуры, выделила ошибочно заполненные поля и вывела сообщение о необходимости ввести корректные значения длины, ширины и высоты. Данный результат представлен на рисунке </w:t>
+        <w:t xml:space="preserve">положительными конечными числами. В результате программа заблокировала создание фигуры, выделила ошибочно заполненные поля и вывела сообщение о необходимости ввести корректные значения длины, ширины и высоты. Данный результат представлен на рисунке </w:t>
       </w:r>
       <w:r>
         <w:rPr>
@@ -9399,8 +8588,15 @@
           <w:sz w:val="28"/>
           <w:szCs w:val="20"/>
         </w:rPr>
+        <w:t xml:space="preserve">После проверки ошибочных ситуаций было выполнено добавление фигур с корректными параметрами. В результате объекты были успешно </w:t>
+      </w:r>
+      <w:r>
+        <w:rPr>
+          <w:sz w:val="28"/>
+          <w:szCs w:val="20"/>
+        </w:rPr>
         <w:lastRenderedPageBreak/>
-        <w:t xml:space="preserve">После проверки ошибочных ситуаций было выполнено добавление фигур с корректными параметрами. В результате объекты были успешно созданы и добавлены в таблицу главного окна программы. Для каждой фигуры в списке отображаются её тип, рассчитанный объём и текстовое описание с введёнными параметрами. Результат добавления фигур представлен на рисунке </w:t>
+        <w:t xml:space="preserve">созданы и добавлены в таблицу главного окна программы. Для каждой фигуры в списке отображаются её тип, рассчитанный объём и текстовое описание с введёнными параметрами. Результат добавления фигур представлен на рисунке </w:t>
       </w:r>
       <w:r>
         <w:rPr>
@@ -9703,73 +8899,7 @@
           <w:sz w:val="28"/>
           <w:szCs w:val="20"/>
         </w:rPr>
-        <w:t xml:space="preserve">После выбора команды открывается стандартное диалоговое окно, в котором необходимо указать имя файла и место его размещения. По умолчанию программе предлагается имя </w:t>
-      </w:r>
-      <w:proofErr w:type="spellStart"/>
-      <w:proofErr w:type="gramStart"/>
-      <w:r>
-        <w:rPr>
-          <w:sz w:val="28"/>
-          <w:szCs w:val="20"/>
-        </w:rPr>
-        <w:t>figures.vfig</w:t>
-      </w:r>
-      <w:proofErr w:type="spellEnd"/>
-      <w:proofErr w:type="gramEnd"/>
-      <w:r>
-        <w:rPr>
-          <w:sz w:val="28"/>
-          <w:szCs w:val="20"/>
-        </w:rPr>
-        <w:t xml:space="preserve">, а данные сохраняются в формате </w:t>
-      </w:r>
-      <w:proofErr w:type="spellStart"/>
-      <w:r>
-        <w:rPr>
-          <w:sz w:val="28"/>
-          <w:szCs w:val="20"/>
-        </w:rPr>
-        <w:t>Volume</w:t>
-      </w:r>
-      <w:proofErr w:type="spellEnd"/>
-      <w:r>
-        <w:rPr>
-          <w:sz w:val="28"/>
-          <w:szCs w:val="20"/>
-        </w:rPr>
-        <w:t xml:space="preserve"> </w:t>
-      </w:r>
-      <w:proofErr w:type="spellStart"/>
-      <w:r>
-        <w:rPr>
-          <w:sz w:val="28"/>
-          <w:szCs w:val="20"/>
-        </w:rPr>
-        <w:t>Figures</w:t>
-      </w:r>
-      <w:proofErr w:type="spellEnd"/>
-      <w:r>
-        <w:rPr>
-          <w:sz w:val="28"/>
-          <w:szCs w:val="20"/>
-        </w:rPr>
-        <w:t xml:space="preserve"> File (*.</w:t>
-      </w:r>
-      <w:proofErr w:type="spellStart"/>
-      <w:r>
-        <w:rPr>
-          <w:sz w:val="28"/>
-          <w:szCs w:val="20"/>
-        </w:rPr>
-        <w:t>vfig</w:t>
-      </w:r>
-      <w:proofErr w:type="spellEnd"/>
-      <w:r>
-        <w:rPr>
-          <w:sz w:val="28"/>
-          <w:szCs w:val="20"/>
-        </w:rPr>
-        <w:t>). Окно выбора файла представлено на рисунке 13.</w:t>
+        <w:t>После выбора команды открывается стандартное диалоговое окно, в котором необходимо указать имя файла и место его размещения. По умолчанию программе предлагается имя figures.vfig, а данные сохраняются в формате Volume Figures File (*.vfig). Окно выбора файла представлено на рисунке 13.</w:t>
       </w:r>
     </w:p>
     <w:p>
@@ -9994,17 +9124,7 @@
     </w:p>
     <w:p>
       <w:r>
-        <w:t xml:space="preserve">Для дополнительной проверки был открыт каталог, выбранный при сохранении. В результате в нём был обнаружен файл </w:t>
-      </w:r>
-      <w:proofErr w:type="spellStart"/>
-      <w:proofErr w:type="gramStart"/>
-      <w:r>
-        <w:t>figures.vfig</w:t>
-      </w:r>
-      <w:proofErr w:type="spellEnd"/>
-      <w:proofErr w:type="gramEnd"/>
-      <w:r>
-        <w:t>, что подтверждает успешную запись данных на диск. Результат сохранения файла представлен на рисунке</w:t>
+        <w:t>Для дополнительной проверки был открыт каталог, выбранный при сохранении. В результате в нём был обнаружен файл figures.vfig, что подтверждает успешную запись данных на диск. Результат сохранения файла представлен на рисунке</w:t>
       </w:r>
       <w:r>
         <w:t xml:space="preserve"> </w:t>
@@ -10134,20 +9254,7 @@
     </w:p>
     <w:p>
       <w:r>
-        <w:t xml:space="preserve">Таким образом, в результате тестирования было установлено, что функция сохранения работает корректно. Программа позволяет выбрать место сохранения файла, задать имя файла и сохранить текущий список фигур в файл с </w:t>
-      </w:r>
-      <w:proofErr w:type="gramStart"/>
-      <w:r>
-        <w:t>расширением .</w:t>
-      </w:r>
-      <w:proofErr w:type="spellStart"/>
-      <w:r>
-        <w:t>vfig</w:t>
-      </w:r>
-      <w:proofErr w:type="spellEnd"/>
-      <w:proofErr w:type="gramEnd"/>
-      <w:r>
-        <w:t>.</w:t>
+        <w:t>Таким образом, в результате тестирования было установлено, что функция сохранения работает корректно. Программа позволяет выбрать место сохранения файла, задать имя файла и сохранить текущий список фигур в файл с расширением .vfig.</w:t>
       </w:r>
     </w:p>
     <w:p>
@@ -10169,13 +9276,8 @@
         <w:t xml:space="preserve">В данном разделе проверяется возможность загрузки ранее сохранённого списка фигур из файла. Для выполнения данной операции пользователь открывает меню «Файл» и выбирает команду «Загрузить». После этого открывается стандартное диалоговое окно, в котором необходимо выбрать файл с </w:t>
       </w:r>
       <w:r>
-        <w:t xml:space="preserve">расширением. </w:t>
-      </w:r>
-      <w:proofErr w:type="spellStart"/>
-      <w:r>
-        <w:t>vfig</w:t>
-      </w:r>
-      <w:proofErr w:type="spellEnd"/>
+        <w:t>расширением. vfig</w:t>
+      </w:r>
       <w:r>
         <w:t>.</w:t>
       </w:r>
@@ -11203,6 +10305,24 @@
     </w:p>
     <w:p>
       <w:pPr>
+        <w:pStyle w:val="1"/>
+        <w:numPr>
+          <w:ilvl w:val="0"/>
+          <w:numId w:val="27"/>
+        </w:numPr>
+        <w:spacing w:after="120"/>
+        <w:jc w:val="center"/>
+      </w:pPr>
+      <w:r>
+        <w:rPr>
+          <w:lang w:val="en-US"/>
+        </w:rPr>
+        <w:t>Тестирование памяти и загруженности процессора</w:t>
+      </w:r>
+    </w:p>
+    <w:p/>
+    <w:p>
+      <w:pPr>
         <w:spacing w:after="160" w:line="278" w:lineRule="auto"/>
         <w:ind w:firstLine="0"/>
         <w:contextualSpacing w:val="0"/>
@@ -11300,7 +10420,6 @@
         </w:rPr>
         <w:t xml:space="preserve">Программа для </w:t>
       </w:r>
-      <w:commentRangeStart w:id="35"/>
       <w:r>
         <w:rPr>
           <w:rFonts w:eastAsia="Calibri" w:cs="Times New Roman"/>
@@ -11309,20 +10428,9 @@
           <w:szCs w:val="28"/>
           <w14:ligatures w14:val="none"/>
         </w:rPr>
-        <w:t>учета списка работников фирмы</w:t>
-      </w:r>
-      <w:commentRangeEnd w:id="35"/>
-      <w:r>
-        <w:rPr>
-          <w:rStyle w:val="af2"/>
-        </w:rPr>
-        <w:commentReference w:id="35"/>
-      </w:r>
-    </w:p>
-    <w:p>
-      <w:pPr>
-        <w:spacing w:line="360" w:lineRule="auto"/>
-        <w:jc w:val="center"/>
+        <w:t xml:space="preserve">расчета объёма </w:t>
+      </w:r>
+      <w:r>
         <w:rPr>
           <w:rFonts w:eastAsia="Calibri" w:cs="Times New Roman"/>
           <w:iCs/>
@@ -11330,7 +10438,8 @@
           <w:szCs w:val="28"/>
           <w14:ligatures w14:val="none"/>
         </w:rPr>
-      </w:pPr>
+        <w:t>фигур сфера, пирамида, параллелепипеда</w:t>
+      </w:r>
     </w:p>
     <w:p>
       <w:pPr>
@@ -11451,7 +10560,8 @@
     </w:p>
     <w:p>
       <w:pPr>
-        <w:spacing w:before="4200" w:line="360" w:lineRule="auto"/>
+        <w:spacing w:line="360" w:lineRule="auto"/>
+        <w:jc w:val="center"/>
         <w:rPr>
           <w:rFonts w:eastAsia="Calibri" w:cs="Times New Roman"/>
           <w:iCs/>
@@ -11460,7 +10570,10 @@
           <w14:ligatures w14:val="none"/>
         </w:rPr>
       </w:pPr>
-      <w:r>
+    </w:p>
+    <w:p>
+      <w:pPr>
+        <w:spacing w:before="4200" w:line="360" w:lineRule="auto"/>
         <w:rPr>
           <w:rFonts w:eastAsia="Calibri" w:cs="Times New Roman"/>
           <w:iCs/>
@@ -11468,12 +10581,8 @@
           <w:szCs w:val="28"/>
           <w14:ligatures w14:val="none"/>
         </w:rPr>
-        <w:t>Разработчик: студент гр. О-5КМ41 Рустамов Р.А.</w:t>
-      </w:r>
-    </w:p>
-    <w:p>
-      <w:pPr>
-        <w:spacing w:line="360" w:lineRule="auto"/>
+      </w:pPr>
+      <w:r>
         <w:rPr>
           <w:rFonts w:eastAsia="Calibri" w:cs="Times New Roman"/>
           <w:iCs/>
@@ -11481,8 +10590,12 @@
           <w:szCs w:val="28"/>
           <w14:ligatures w14:val="none"/>
         </w:rPr>
-      </w:pPr>
-      <w:r>
+        <w:t>Разработчик: студент гр. О-5КМ41 Рустамов Р.А.</w:t>
+      </w:r>
+    </w:p>
+    <w:p>
+      <w:pPr>
+        <w:spacing w:line="360" w:lineRule="auto"/>
         <w:rPr>
           <w:rFonts w:eastAsia="Calibri" w:cs="Times New Roman"/>
           <w:iCs/>
@@ -11490,9 +10603,7 @@
           <w:szCs w:val="28"/>
           <w14:ligatures w14:val="none"/>
         </w:rPr>
-        <w:t xml:space="preserve">Заказчик: к.т.н., доцент </w:t>
-      </w:r>
-      <w:proofErr w:type="spellStart"/>
+      </w:pPr>
       <w:r>
         <w:rPr>
           <w:rFonts w:eastAsia="Calibri" w:cs="Times New Roman"/>
@@ -11501,43 +10612,8 @@
           <w:szCs w:val="28"/>
           <w14:ligatures w14:val="none"/>
         </w:rPr>
-        <w:t>Калентьев</w:t>
-      </w:r>
-      <w:proofErr w:type="spellEnd"/>
-      <w:r>
-        <w:rPr>
-          <w:rFonts w:eastAsia="Calibri" w:cs="Times New Roman"/>
-          <w:iCs/>
-          <w:kern w:val="0"/>
-          <w:szCs w:val="28"/>
-          <w14:ligatures w14:val="none"/>
-        </w:rPr>
-        <w:t xml:space="preserve"> А.А.</w:t>
-      </w:r>
-    </w:p>
-    <w:p>
-      <w:pPr>
-        <w:jc w:val="center"/>
-        <w:rPr>
-          <w:rFonts w:eastAsia="Calibri" w:cs="Times New Roman"/>
-          <w:iCs/>
-          <w:kern w:val="0"/>
-          <w:szCs w:val="28"/>
-          <w14:ligatures w14:val="none"/>
-        </w:rPr>
-      </w:pPr>
-    </w:p>
-    <w:p>
-      <w:pPr>
-        <w:jc w:val="center"/>
-        <w:rPr>
-          <w:rFonts w:eastAsia="Calibri" w:cs="Times New Roman"/>
-          <w:iCs/>
-          <w:kern w:val="0"/>
-          <w:szCs w:val="28"/>
-          <w14:ligatures w14:val="none"/>
-        </w:rPr>
-      </w:pPr>
+        <w:t>Заказчик: к.т.н., доцент Калентьев А.А.</w:t>
+      </w:r>
     </w:p>
     <w:p>
       <w:pPr>
@@ -11888,29 +10964,7 @@
           <w:szCs w:val="28"/>
           <w14:ligatures w14:val="none"/>
         </w:rPr>
-        <w:t xml:space="preserve">Заказчик: к.т.н., доцент </w:t>
-      </w:r>
-      <w:proofErr w:type="spellStart"/>
-      <w:r>
-        <w:rPr>
-          <w:rFonts w:eastAsia="Calibri" w:cs="Times New Roman"/>
-          <w:iCs/>
-          <w:kern w:val="0"/>
-          <w:szCs w:val="28"/>
-          <w14:ligatures w14:val="none"/>
-        </w:rPr>
-        <w:t>Калентьев</w:t>
-      </w:r>
-      <w:proofErr w:type="spellEnd"/>
-      <w:r>
-        <w:rPr>
-          <w:rFonts w:eastAsia="Calibri" w:cs="Times New Roman"/>
-          <w:iCs/>
-          <w:kern w:val="0"/>
-          <w:szCs w:val="28"/>
-          <w14:ligatures w14:val="none"/>
-        </w:rPr>
-        <w:t xml:space="preserve"> А.А.</w:t>
+        <w:t>Заказчик: к.т.н., доцент Калентьев А.А.</w:t>
       </w:r>
     </w:p>
     <w:p>
@@ -12505,51 +11559,7 @@
           <w:szCs w:val="28"/>
           <w14:ligatures w14:val="none"/>
         </w:rPr>
-        <w:t xml:space="preserve">Для решения данной проблемы разрабатывается программа «RusWin3 </w:t>
-      </w:r>
-      <w:proofErr w:type="spellStart"/>
-      <w:r>
-        <w:rPr>
-          <w:rFonts w:eastAsia="Calibri" w:cs="Times New Roman"/>
-          <w:iCs/>
-          <w:kern w:val="0"/>
-          <w:szCs w:val="28"/>
-          <w14:ligatures w14:val="none"/>
-        </w:rPr>
-        <w:t>Volume</w:t>
-      </w:r>
-      <w:proofErr w:type="spellEnd"/>
-      <w:r>
-        <w:rPr>
-          <w:rFonts w:eastAsia="Calibri" w:cs="Times New Roman"/>
-          <w:iCs/>
-          <w:kern w:val="0"/>
-          <w:szCs w:val="28"/>
-          <w14:ligatures w14:val="none"/>
-        </w:rPr>
-        <w:t xml:space="preserve"> </w:t>
-      </w:r>
-      <w:proofErr w:type="spellStart"/>
-      <w:r>
-        <w:rPr>
-          <w:rFonts w:eastAsia="Calibri" w:cs="Times New Roman"/>
-          <w:iCs/>
-          <w:kern w:val="0"/>
-          <w:szCs w:val="28"/>
-          <w14:ligatures w14:val="none"/>
-        </w:rPr>
-        <w:t>edition</w:t>
-      </w:r>
-      <w:proofErr w:type="spellEnd"/>
-      <w:r>
-        <w:rPr>
-          <w:rFonts w:eastAsia="Calibri" w:cs="Times New Roman"/>
-          <w:iCs/>
-          <w:kern w:val="0"/>
-          <w:szCs w:val="28"/>
-          <w14:ligatures w14:val="none"/>
-        </w:rPr>
-        <w:t>», позволяющая хранить список фигур, автоматически рассчитывать их объёмы, выполнять поиск по заданным условиям, а также сохранять и загружать данные из файла.</w:t>
+        <w:t>Для решения данной проблемы разрабатывается программа «RusWin3 Volume edition», позволяющая хранить список фигур, автоматически рассчитывать их объёмы, выполнять поиск по заданным условиям, а также сохранять и загружать данные из файла.</w:t>
       </w:r>
     </w:p>
     <w:p>
@@ -13168,7 +12178,7 @@
       <w:r>
         <w:t xml:space="preserve">Система должна функционировать под управлением операционной </w:t>
       </w:r>
-      <w:commentRangeStart w:id="36"/>
+      <w:commentRangeStart w:id="35"/>
       <w:r>
         <w:t>системы Windows 10 версии 22</w:t>
       </w:r>
@@ -13181,31 +12191,17 @@
       <w:r>
         <w:t>2 или Windows 11</w:t>
       </w:r>
-      <w:commentRangeEnd w:id="36"/>
+      <w:commentRangeEnd w:id="35"/>
       <w:r>
         <w:rPr>
           <w:rStyle w:val="af2"/>
-        </w:rPr>
-        <w:commentReference w:id="36"/>
-      </w:r>
-      <w:r>
-        <w:t xml:space="preserve">. Поддержка </w:t>
-      </w:r>
-      <w:proofErr w:type="spellStart"/>
-      <w:r>
-        <w:t>macOS</w:t>
-      </w:r>
-      <w:proofErr w:type="spellEnd"/>
-      <w:r>
-        <w:t xml:space="preserve"> и Linux не предусмотрена, так как приложение разработано как настольное Windows </w:t>
-      </w:r>
-      <w:proofErr w:type="spellStart"/>
-      <w:r>
-        <w:t>Forms</w:t>
-      </w:r>
-      <w:proofErr w:type="spellEnd"/>
-      <w:r>
-        <w:t>-приложение.</w:t>
+          <w:sz w:val="28"/>
+          <w:szCs w:val="24"/>
+        </w:rPr>
+        <w:commentReference w:id="35"/>
+      </w:r>
+      <w:r>
+        <w:t>. Поддержка macOS и Linux не предусмотрена, так как приложение разработано как настольное Windows Forms-приложение.</w:t>
       </w:r>
     </w:p>
     <w:p>
@@ -13216,15 +12212,7 @@
         </w:numPr>
       </w:pPr>
       <w:r>
-        <w:t xml:space="preserve">На целевой системе должен быть установлен .NET 8.0 Desktop </w:t>
-      </w:r>
-      <w:proofErr w:type="spellStart"/>
-      <w:r>
-        <w:t>Runtime</w:t>
-      </w:r>
-      <w:proofErr w:type="spellEnd"/>
-      <w:r>
-        <w:t xml:space="preserve"> или выше.</w:t>
+        <w:t>На целевой системе должен быть установлен .NET 8.0 Desktop Runtime или выше.</w:t>
       </w:r>
     </w:p>
     <w:p>
@@ -13318,21 +12306,14 @@
         </w:rPr>
       </w:pPr>
       <w:r>
-        <w:t xml:space="preserve">Данные о фигурах должны храниться в файлах с расширением </w:t>
-      </w:r>
-      <w:proofErr w:type="gramStart"/>
-      <w:r>
-        <w:t>*.</w:t>
-      </w:r>
-      <w:proofErr w:type="spellStart"/>
+        <w:t>Данные о фигурах должны храниться в файлах с расширением *.</w:t>
+      </w:r>
       <w:r>
         <w:rPr>
           <w:lang w:val="en-US"/>
         </w:rPr>
         <w:t>vfig</w:t>
       </w:r>
-      <w:proofErr w:type="spellEnd"/>
-      <w:proofErr w:type="gramEnd"/>
       <w:r>
         <w:t>.</w:t>
       </w:r>
@@ -13422,14 +12403,12 @@
       <w:r>
         <w:t>&lt;</w:t>
       </w:r>
-      <w:proofErr w:type="spellStart"/>
       <w:r>
         <w:rPr>
           <w:lang w:val="en-US"/>
         </w:rPr>
         <w:t>FiguresFileData</w:t>
       </w:r>
-      <w:proofErr w:type="spellEnd"/>
       <w:r>
         <w:t>&gt;</w:t>
       </w:r>
@@ -13462,472 +12441,258 @@
         <w:rPr>
           <w:lang w:val="en-US"/>
         </w:rPr>
-        <w:t xml:space="preserve">    &lt;</w:t>
-      </w:r>
-      <w:proofErr w:type="spellStart"/>
-      <w:r>
+        <w:t xml:space="preserve">    &lt;FigureData&gt;</w:t>
+      </w:r>
+    </w:p>
+    <w:p>
+      <w:pPr>
+        <w:spacing w:line="240" w:lineRule="auto"/>
         <w:rPr>
           <w:lang w:val="en-US"/>
         </w:rPr>
+      </w:pPr>
+      <w:r>
+        <w:rPr>
+          <w:lang w:val="en-US"/>
+        </w:rPr>
+        <w:t xml:space="preserve">      &lt;FigureKind&gt;Sphere&lt;/FigureKind&gt;</w:t>
+      </w:r>
+    </w:p>
+    <w:p>
+      <w:pPr>
+        <w:spacing w:line="240" w:lineRule="auto"/>
+        <w:rPr>
+          <w:lang w:val="en-US"/>
+        </w:rPr>
+      </w:pPr>
+      <w:r>
+        <w:rPr>
+          <w:lang w:val="en-US"/>
+        </w:rPr>
+        <w:t xml:space="preserve">      &lt;Radius&gt;5&lt;/Radius&gt;</w:t>
+      </w:r>
+    </w:p>
+    <w:p>
+      <w:pPr>
+        <w:spacing w:line="240" w:lineRule="auto"/>
+        <w:rPr>
+          <w:lang w:val="en-US"/>
+        </w:rPr>
+      </w:pPr>
+      <w:r>
+        <w:rPr>
+          <w:lang w:val="en-US"/>
+        </w:rPr>
+        <w:t xml:space="preserve">    &lt;/FigureData&gt;</w:t>
+      </w:r>
+    </w:p>
+    <w:p>
+      <w:pPr>
+        <w:spacing w:line="240" w:lineRule="auto"/>
+        <w:rPr>
+          <w:lang w:val="en-US"/>
+        </w:rPr>
+      </w:pPr>
+      <w:r>
+        <w:rPr>
+          <w:lang w:val="en-US"/>
+        </w:rPr>
+        <w:t xml:space="preserve">    &lt;FigureData&gt;</w:t>
+      </w:r>
+    </w:p>
+    <w:p>
+      <w:pPr>
+        <w:spacing w:line="240" w:lineRule="auto"/>
+        <w:rPr>
+          <w:lang w:val="en-US"/>
+        </w:rPr>
+      </w:pPr>
+      <w:r>
+        <w:rPr>
+          <w:lang w:val="en-US"/>
+        </w:rPr>
+        <w:t xml:space="preserve">      &lt;FigureKind&gt;Pyramid&lt;/FigureKind&gt;</w:t>
+      </w:r>
+    </w:p>
+    <w:p>
+      <w:pPr>
+        <w:spacing w:line="240" w:lineRule="auto"/>
+        <w:rPr>
+          <w:lang w:val="en-US"/>
+        </w:rPr>
+      </w:pPr>
+      <w:r>
+        <w:rPr>
+          <w:lang w:val="en-US"/>
+        </w:rPr>
+        <w:t xml:space="preserve">      &lt;BaseLength&gt;2&lt;/BaseLength&gt;</w:t>
+      </w:r>
+    </w:p>
+    <w:p>
+      <w:pPr>
+        <w:spacing w:line="240" w:lineRule="auto"/>
+        <w:rPr>
+          <w:lang w:val="en-US"/>
+        </w:rPr>
+      </w:pPr>
+      <w:r>
+        <w:rPr>
+          <w:lang w:val="en-US"/>
+        </w:rPr>
+        <w:t xml:space="preserve">      &lt;BaseWidth&gt;1&lt;/BaseWidth&gt;</w:t>
+      </w:r>
+    </w:p>
+    <w:p>
+      <w:pPr>
+        <w:spacing w:line="240" w:lineRule="auto"/>
+        <w:rPr>
+          <w:lang w:val="en-US"/>
+        </w:rPr>
+      </w:pPr>
+      <w:r>
+        <w:rPr>
+          <w:lang w:val="en-US"/>
+        </w:rPr>
+        <w:t xml:space="preserve">      &lt;Height&gt;3&lt;/Height&gt;</w:t>
+      </w:r>
+    </w:p>
+    <w:p>
+      <w:pPr>
+        <w:spacing w:line="240" w:lineRule="auto"/>
+        <w:rPr>
+          <w:lang w:val="en-US"/>
+        </w:rPr>
+      </w:pPr>
+      <w:r>
+        <w:rPr>
+          <w:lang w:val="en-US"/>
+        </w:rPr>
+        <w:t xml:space="preserve">    &lt;/FigureData&gt;</w:t>
+      </w:r>
+    </w:p>
+    <w:p>
+      <w:pPr>
+        <w:spacing w:line="240" w:lineRule="auto"/>
+        <w:rPr>
+          <w:lang w:val="en-US"/>
+        </w:rPr>
+      </w:pPr>
+      <w:r>
+        <w:rPr>
+          <w:lang w:val="en-US"/>
+        </w:rPr>
+        <w:t xml:space="preserve">    &lt;FigureData&gt;</w:t>
+      </w:r>
+    </w:p>
+    <w:p>
+      <w:pPr>
+        <w:spacing w:line="240" w:lineRule="auto"/>
+        <w:rPr>
+          <w:lang w:val="en-US"/>
+        </w:rPr>
+      </w:pPr>
+      <w:r>
+        <w:rPr>
+          <w:lang w:val="en-US"/>
+        </w:rPr>
+        <w:t xml:space="preserve">      &lt;FigureKind&gt;Parallelepiped&lt;/FigureKind&gt;</w:t>
+      </w:r>
+    </w:p>
+    <w:p>
+      <w:pPr>
+        <w:spacing w:line="240" w:lineRule="auto"/>
+        <w:rPr>
+          <w:lang w:val="en-US"/>
+        </w:rPr>
+      </w:pPr>
+      <w:r>
+        <w:rPr>
+          <w:lang w:val="en-US"/>
+        </w:rPr>
+        <w:t xml:space="preserve">      &lt;Length&gt;1&lt;/Length&gt;</w:t>
+      </w:r>
+    </w:p>
+    <w:p>
+      <w:pPr>
+        <w:spacing w:line="240" w:lineRule="auto"/>
+        <w:rPr>
+          <w:lang w:val="en-US"/>
+        </w:rPr>
+      </w:pPr>
+      <w:r>
+        <w:rPr>
+          <w:lang w:val="en-US"/>
+        </w:rPr>
+        <w:t xml:space="preserve">      &lt;Width&gt;2&lt;/Width&gt;</w:t>
+      </w:r>
+    </w:p>
+    <w:p>
+      <w:pPr>
+        <w:spacing w:line="240" w:lineRule="auto"/>
+        <w:rPr>
+          <w:lang w:val="en-US"/>
+        </w:rPr>
+      </w:pPr>
+      <w:r>
+        <w:rPr>
+          <w:lang w:val="en-US"/>
+        </w:rPr>
+        <w:t xml:space="preserve">      &lt;Height&gt;3&lt;/Height&gt;</w:t>
+      </w:r>
+    </w:p>
+    <w:p>
+      <w:pPr>
+        <w:spacing w:line="240" w:lineRule="auto"/>
+      </w:pPr>
+      <w:r>
+        <w:rPr>
+          <w:lang w:val="en-US"/>
+        </w:rPr>
+        <w:t xml:space="preserve">    </w:t>
+      </w:r>
+      <w:r>
+        <w:t>&lt;/</w:t>
+      </w:r>
+      <w:r>
+        <w:rPr>
+          <w:lang w:val="en-US"/>
+        </w:rPr>
         <w:t>FigureData</w:t>
       </w:r>
-      <w:proofErr w:type="spellEnd"/>
+      <w:r>
+        <w:t>&gt;</w:t>
+      </w:r>
+    </w:p>
+    <w:p>
+      <w:pPr>
+        <w:spacing w:line="240" w:lineRule="auto"/>
+      </w:pPr>
+      <w:r>
+        <w:t xml:space="preserve">  &lt;/</w:t>
+      </w:r>
       <w:r>
         <w:rPr>
           <w:lang w:val="en-US"/>
         </w:rPr>
+        <w:t>Figures</w:t>
+      </w:r>
+      <w:r>
         <w:t>&gt;</w:t>
       </w:r>
     </w:p>
     <w:p>
       <w:pPr>
         <w:spacing w:line="240" w:lineRule="auto"/>
+      </w:pPr>
+      <w:r>
+        <w:t>&lt;/</w:t>
+      </w:r>
+      <w:r>
         <w:rPr>
           <w:lang w:val="en-US"/>
         </w:rPr>
-      </w:pPr>
-      <w:r>
-        <w:rPr>
-          <w:lang w:val="en-US"/>
-        </w:rPr>
-        <w:t xml:space="preserve">      &lt;</w:t>
-      </w:r>
-      <w:proofErr w:type="spellStart"/>
-      <w:r>
-        <w:rPr>
-          <w:lang w:val="en-US"/>
-        </w:rPr>
-        <w:t>FigureKind</w:t>
-      </w:r>
-      <w:proofErr w:type="spellEnd"/>
-      <w:r>
-        <w:rPr>
-          <w:lang w:val="en-US"/>
-        </w:rPr>
-        <w:t>&gt;Sphere&lt;/</w:t>
-      </w:r>
-      <w:proofErr w:type="spellStart"/>
-      <w:r>
-        <w:rPr>
-          <w:lang w:val="en-US"/>
-        </w:rPr>
-        <w:t>FigureKind</w:t>
-      </w:r>
-      <w:proofErr w:type="spellEnd"/>
-      <w:r>
-        <w:rPr>
-          <w:lang w:val="en-US"/>
-        </w:rPr>
-        <w:t>&gt;</w:t>
-      </w:r>
-    </w:p>
-    <w:p>
-      <w:pPr>
-        <w:spacing w:line="240" w:lineRule="auto"/>
-        <w:rPr>
-          <w:lang w:val="en-US"/>
-        </w:rPr>
-      </w:pPr>
-      <w:r>
-        <w:rPr>
-          <w:lang w:val="en-US"/>
-        </w:rPr>
-        <w:t xml:space="preserve">      &lt;Radius&gt;5&lt;/Radius&gt;</w:t>
-      </w:r>
-    </w:p>
-    <w:p>
-      <w:pPr>
-        <w:spacing w:line="240" w:lineRule="auto"/>
-        <w:rPr>
-          <w:lang w:val="en-US"/>
-        </w:rPr>
-      </w:pPr>
-      <w:r>
-        <w:rPr>
-          <w:lang w:val="en-US"/>
-        </w:rPr>
-        <w:t xml:space="preserve">    &lt;/</w:t>
-      </w:r>
-      <w:proofErr w:type="spellStart"/>
-      <w:r>
-        <w:rPr>
-          <w:lang w:val="en-US"/>
-        </w:rPr>
-        <w:t>FigureData</w:t>
-      </w:r>
-      <w:proofErr w:type="spellEnd"/>
-      <w:r>
-        <w:rPr>
-          <w:lang w:val="en-US"/>
-        </w:rPr>
-        <w:t>&gt;</w:t>
-      </w:r>
-    </w:p>
-    <w:p>
-      <w:pPr>
-        <w:spacing w:line="240" w:lineRule="auto"/>
-        <w:rPr>
-          <w:lang w:val="en-US"/>
-        </w:rPr>
-      </w:pPr>
-      <w:r>
-        <w:rPr>
-          <w:lang w:val="en-US"/>
-        </w:rPr>
-        <w:t xml:space="preserve">    &lt;</w:t>
-      </w:r>
-      <w:proofErr w:type="spellStart"/>
-      <w:r>
-        <w:rPr>
-          <w:lang w:val="en-US"/>
-        </w:rPr>
-        <w:t>FigureData</w:t>
-      </w:r>
-      <w:proofErr w:type="spellEnd"/>
-      <w:r>
-        <w:rPr>
-          <w:lang w:val="en-US"/>
-        </w:rPr>
-        <w:t>&gt;</w:t>
-      </w:r>
-    </w:p>
-    <w:p>
-      <w:pPr>
-        <w:spacing w:line="240" w:lineRule="auto"/>
-        <w:rPr>
-          <w:lang w:val="en-US"/>
-        </w:rPr>
-      </w:pPr>
-      <w:r>
-        <w:rPr>
-          <w:lang w:val="en-US"/>
-        </w:rPr>
-        <w:t xml:space="preserve">      &lt;</w:t>
-      </w:r>
-      <w:proofErr w:type="spellStart"/>
-      <w:r>
-        <w:rPr>
-          <w:lang w:val="en-US"/>
-        </w:rPr>
-        <w:t>FigureKind</w:t>
-      </w:r>
-      <w:proofErr w:type="spellEnd"/>
-      <w:r>
-        <w:rPr>
-          <w:lang w:val="en-US"/>
-        </w:rPr>
-        <w:t>&gt;Pyramid&lt;/</w:t>
-      </w:r>
-      <w:proofErr w:type="spellStart"/>
-      <w:r>
-        <w:rPr>
-          <w:lang w:val="en-US"/>
-        </w:rPr>
-        <w:t>FigureKind</w:t>
-      </w:r>
-      <w:proofErr w:type="spellEnd"/>
-      <w:r>
-        <w:rPr>
-          <w:lang w:val="en-US"/>
-        </w:rPr>
-        <w:t>&gt;</w:t>
-      </w:r>
-    </w:p>
-    <w:p>
-      <w:pPr>
-        <w:spacing w:line="240" w:lineRule="auto"/>
-        <w:rPr>
-          <w:lang w:val="en-US"/>
-        </w:rPr>
-      </w:pPr>
-      <w:r>
-        <w:rPr>
-          <w:lang w:val="en-US"/>
-        </w:rPr>
-        <w:t xml:space="preserve">      &lt;</w:t>
-      </w:r>
-      <w:proofErr w:type="spellStart"/>
-      <w:r>
-        <w:rPr>
-          <w:lang w:val="en-US"/>
-        </w:rPr>
-        <w:t>BaseLength</w:t>
-      </w:r>
-      <w:proofErr w:type="spellEnd"/>
-      <w:r>
-        <w:rPr>
-          <w:lang w:val="en-US"/>
-        </w:rPr>
-        <w:t>&gt;2&lt;/</w:t>
-      </w:r>
-      <w:proofErr w:type="spellStart"/>
-      <w:r>
-        <w:rPr>
-          <w:lang w:val="en-US"/>
-        </w:rPr>
-        <w:t>BaseLength</w:t>
-      </w:r>
-      <w:proofErr w:type="spellEnd"/>
-      <w:r>
-        <w:rPr>
-          <w:lang w:val="en-US"/>
-        </w:rPr>
-        <w:t>&gt;</w:t>
-      </w:r>
-    </w:p>
-    <w:p>
-      <w:pPr>
-        <w:spacing w:line="240" w:lineRule="auto"/>
-        <w:rPr>
-          <w:lang w:val="en-US"/>
-        </w:rPr>
-      </w:pPr>
-      <w:r>
-        <w:rPr>
-          <w:lang w:val="en-US"/>
-        </w:rPr>
-        <w:t xml:space="preserve">      &lt;</w:t>
-      </w:r>
-      <w:proofErr w:type="spellStart"/>
-      <w:r>
-        <w:rPr>
-          <w:lang w:val="en-US"/>
-        </w:rPr>
-        <w:t>BaseWidth</w:t>
-      </w:r>
-      <w:proofErr w:type="spellEnd"/>
-      <w:r>
-        <w:rPr>
-          <w:lang w:val="en-US"/>
-        </w:rPr>
-        <w:t>&gt;1&lt;/</w:t>
-      </w:r>
-      <w:proofErr w:type="spellStart"/>
-      <w:r>
-        <w:rPr>
-          <w:lang w:val="en-US"/>
-        </w:rPr>
-        <w:t>BaseWidth</w:t>
-      </w:r>
-      <w:proofErr w:type="spellEnd"/>
-      <w:r>
-        <w:rPr>
-          <w:lang w:val="en-US"/>
-        </w:rPr>
-        <w:t>&gt;</w:t>
-      </w:r>
-    </w:p>
-    <w:p>
-      <w:pPr>
-        <w:spacing w:line="240" w:lineRule="auto"/>
-        <w:rPr>
-          <w:lang w:val="en-US"/>
-        </w:rPr>
-      </w:pPr>
-      <w:r>
-        <w:rPr>
-          <w:lang w:val="en-US"/>
-        </w:rPr>
-        <w:t xml:space="preserve">      &lt;Height&gt;3&lt;/Height&gt;</w:t>
-      </w:r>
-    </w:p>
-    <w:p>
-      <w:pPr>
-        <w:spacing w:line="240" w:lineRule="auto"/>
-        <w:rPr>
-          <w:lang w:val="en-US"/>
-        </w:rPr>
-      </w:pPr>
-      <w:r>
-        <w:rPr>
-          <w:lang w:val="en-US"/>
-        </w:rPr>
-        <w:t xml:space="preserve">    &lt;/</w:t>
-      </w:r>
-      <w:proofErr w:type="spellStart"/>
-      <w:r>
-        <w:rPr>
-          <w:lang w:val="en-US"/>
-        </w:rPr>
-        <w:t>FigureData</w:t>
-      </w:r>
-      <w:proofErr w:type="spellEnd"/>
-      <w:r>
-        <w:rPr>
-          <w:lang w:val="en-US"/>
-        </w:rPr>
-        <w:t>&gt;</w:t>
-      </w:r>
-    </w:p>
-    <w:p>
-      <w:pPr>
-        <w:spacing w:line="240" w:lineRule="auto"/>
-        <w:rPr>
-          <w:lang w:val="en-US"/>
-        </w:rPr>
-      </w:pPr>
-      <w:r>
-        <w:rPr>
-          <w:lang w:val="en-US"/>
-        </w:rPr>
-        <w:t xml:space="preserve">    &lt;</w:t>
-      </w:r>
-      <w:proofErr w:type="spellStart"/>
-      <w:r>
-        <w:rPr>
-          <w:lang w:val="en-US"/>
-        </w:rPr>
-        <w:t>FigureData</w:t>
-      </w:r>
-      <w:proofErr w:type="spellEnd"/>
-      <w:r>
-        <w:rPr>
-          <w:lang w:val="en-US"/>
-        </w:rPr>
-        <w:t>&gt;</w:t>
-      </w:r>
-    </w:p>
-    <w:p>
-      <w:pPr>
-        <w:spacing w:line="240" w:lineRule="auto"/>
-        <w:rPr>
-          <w:lang w:val="en-US"/>
-        </w:rPr>
-      </w:pPr>
-      <w:r>
-        <w:rPr>
-          <w:lang w:val="en-US"/>
-        </w:rPr>
-        <w:t xml:space="preserve">      &lt;</w:t>
-      </w:r>
-      <w:proofErr w:type="spellStart"/>
-      <w:r>
-        <w:rPr>
-          <w:lang w:val="en-US"/>
-        </w:rPr>
-        <w:t>FigureKind</w:t>
-      </w:r>
-      <w:proofErr w:type="spellEnd"/>
-      <w:r>
-        <w:rPr>
-          <w:lang w:val="en-US"/>
-        </w:rPr>
-        <w:t>&gt;Parallelepiped&lt;/</w:t>
-      </w:r>
-      <w:proofErr w:type="spellStart"/>
-      <w:r>
-        <w:rPr>
-          <w:lang w:val="en-US"/>
-        </w:rPr>
-        <w:t>FigureKind</w:t>
-      </w:r>
-      <w:proofErr w:type="spellEnd"/>
-      <w:r>
-        <w:rPr>
-          <w:lang w:val="en-US"/>
-        </w:rPr>
-        <w:t>&gt;</w:t>
-      </w:r>
-    </w:p>
-    <w:p>
-      <w:pPr>
-        <w:spacing w:line="240" w:lineRule="auto"/>
-        <w:rPr>
-          <w:lang w:val="en-US"/>
-        </w:rPr>
-      </w:pPr>
-      <w:r>
-        <w:rPr>
-          <w:lang w:val="en-US"/>
-        </w:rPr>
-        <w:t xml:space="preserve">      &lt;Length&gt;1&lt;/Length&gt;</w:t>
-      </w:r>
-    </w:p>
-    <w:p>
-      <w:pPr>
-        <w:spacing w:line="240" w:lineRule="auto"/>
-        <w:rPr>
-          <w:lang w:val="en-US"/>
-        </w:rPr>
-      </w:pPr>
-      <w:r>
-        <w:rPr>
-          <w:lang w:val="en-US"/>
-        </w:rPr>
-        <w:t xml:space="preserve">      &lt;Width&gt;2&lt;/Width&gt;</w:t>
-      </w:r>
-    </w:p>
-    <w:p>
-      <w:pPr>
-        <w:spacing w:line="240" w:lineRule="auto"/>
-        <w:rPr>
-          <w:lang w:val="en-US"/>
-        </w:rPr>
-      </w:pPr>
-      <w:r>
-        <w:rPr>
-          <w:lang w:val="en-US"/>
-        </w:rPr>
-        <w:t xml:space="preserve">      &lt;Height&gt;3&lt;/Height&gt;</w:t>
-      </w:r>
-    </w:p>
-    <w:p>
-      <w:pPr>
-        <w:spacing w:line="240" w:lineRule="auto"/>
-      </w:pPr>
-      <w:r>
-        <w:rPr>
-          <w:lang w:val="en-US"/>
-        </w:rPr>
-        <w:t xml:space="preserve">    </w:t>
-      </w:r>
-      <w:r>
-        <w:t>&lt;/</w:t>
-      </w:r>
-      <w:proofErr w:type="spellStart"/>
-      <w:r>
-        <w:rPr>
-          <w:lang w:val="en-US"/>
-        </w:rPr>
-        <w:t>FigureData</w:t>
-      </w:r>
-      <w:proofErr w:type="spellEnd"/>
-      <w:r>
-        <w:t>&gt;</w:t>
-      </w:r>
-    </w:p>
-    <w:p>
-      <w:pPr>
-        <w:spacing w:line="240" w:lineRule="auto"/>
-      </w:pPr>
-      <w:r>
-        <w:t xml:space="preserve">  &lt;/</w:t>
-      </w:r>
-      <w:r>
-        <w:rPr>
-          <w:lang w:val="en-US"/>
-        </w:rPr>
-        <w:t>Figures</w:t>
-      </w:r>
-      <w:r>
-        <w:t>&gt;</w:t>
-      </w:r>
-    </w:p>
-    <w:p>
-      <w:pPr>
-        <w:spacing w:line="240" w:lineRule="auto"/>
-      </w:pPr>
-      <w:r>
-        <w:t>&lt;/</w:t>
-      </w:r>
-      <w:proofErr w:type="spellStart"/>
-      <w:r>
-        <w:rPr>
-          <w:lang w:val="en-US"/>
-        </w:rPr>
         <w:t>FiguresFileData</w:t>
       </w:r>
-      <w:proofErr w:type="spellEnd"/>
       <w:r>
         <w:t>&gt;</w:t>
       </w:r>
@@ -14972,7 +13737,7 @@
           <w:lang w:val="en-US"/>
         </w:rPr>
       </w:pPr>
-      <w:bookmarkStart w:id="37" w:name="_Toc232211105"/>
+      <w:bookmarkStart w:id="36" w:name="_Toc232211105"/>
       <w:r>
         <w:rPr>
           <w:rFonts w:eastAsiaTheme="majorEastAsia" w:cstheme="majorBidi"/>
@@ -14991,7 +13756,7 @@
         </w:rPr>
         <w:t>B</w:t>
       </w:r>
-      <w:bookmarkEnd w:id="37"/>
+      <w:bookmarkEnd w:id="36"/>
     </w:p>
     <w:p>
       <w:pPr>
@@ -15099,21 +13864,8 @@
 </file>
 
 <file path=word/comments.xml><?xml version="1.0" encoding="utf-8"?>
-<w:comments xmlns:wpc="http://schemas.microsoft.com/office/word/2010/wordprocessingCanvas" xmlns:cx="http://schemas.microsoft.com/office/drawing/2014/chartex" xmlns:cx1="http://schemas.microsoft.com/office/drawing/2015/9/8/chartex" xmlns:cx2="http://schemas.microsoft.com/office/drawing/2015/10/21/chartex" xmlns:cx3="http://schemas.microsoft.com/office/drawing/2016/5/9/chartex" xmlns:cx4="http://schemas.microsoft.com/office/drawing/2016/5/10/chartex" xmlns:cx5="http://schemas.microsoft.com/office/drawing/2016/5/11/chartex" xmlns:cx6="http://schemas.microsoft.com/office/drawing/2016/5/12/chartex" xmlns:cx7="http://schemas.microsoft.com/office/drawing/2016/5/13/chartex" xmlns:cx8="http://schemas.microsoft.com/office/drawing/2016/5/14/chartex" xmlns:mc="http://schemas.openxmlformats.org/markup-compatibility/2006" xmlns:aink="http://schemas.microsoft.com/office/drawing/2016/ink" xmlns:am3d="http://schemas.microsoft.com/office/drawing/2017/model3d" xmlns:o="urn:schemas-microsoft-com:office:office" xmlns:r="http://schemas.openxmlformats.org/officeDocument/2006/relationships" xmlns:m="http://schemas.openxmlformats.org/officeDocument/2006/math" xmlns:v="urn:schemas-microsoft-com:vml" xmlns:wp14="http://schemas.microsoft.com/office/word/2010/wordprocessingDrawing" xmlns:wp="http://schemas.openxmlformats.org/drawingml/2006/wordprocessingDrawing" xmlns:w10="urn:schemas-microsoft-com:office:word" xmlns:w="http://schemas.openxmlformats.org/wordprocessingml/2006/main" xmlns:w14="http://schemas.microsoft.com/office/word/2010/wordml" xmlns:w15="http://schemas.microsoft.com/office/word/2012/wordml" xmlns:w16cex="http://schemas.microsoft.com/office/word/2018/wordml/cex" xmlns:w16cid="http://schemas.microsoft.com/office/word/2016/wordml/cid" xmlns:w16="http://schemas.microsoft.com/office/word/2018/wordml" xmlns:w16sdtdh="http://schemas.microsoft.com/office/word/2020/wordml/sdtdatahash" xmlns:w16se="http://schemas.microsoft.com/office/word/2015/wordml/symex" xmlns:wpg="http://schemas.microsoft.com/office/word/2010/wordprocessingGroup" xmlns:wpi="http://schemas.microsoft.com/office/word/2010/wordprocessingInk" xmlns:wne="http://schemas.microsoft.com/office/word/2006/wordml" xmlns:wps="http://schemas.microsoft.com/office/word/2010/wordprocessingShape" mc:Ignorable="w14 w15 w16se w16cid w16 w16cex w16sdtdh wp14">
-  <w:comment w:id="35" w:author="Aleksey A. Kalentev" w:date="2026-06-13T13:32:00Z" w:initials="AAK">
-    <w:p>
-      <w:pPr>
-        <w:pStyle w:val="af3"/>
-      </w:pPr>
-      <w:r>
-        <w:rPr>
-          <w:rStyle w:val="af2"/>
-        </w:rPr>
-        <w:annotationRef/>
-      </w:r>
-    </w:p>
-  </w:comment>
-  <w:comment w:id="36" w:author="Aleksey A. Kalentev" w:date="2026-06-13T13:33:00Z" w:initials="AAK">
+<w:comments xmlns:wpc="http://schemas.microsoft.com/office/word/2010/wordprocessingCanvas" xmlns:cx="http://schemas.microsoft.com/office/drawing/2014/chartex" xmlns:cx1="http://schemas.microsoft.com/office/drawing/2015/9/8/chartex" xmlns:cx2="http://schemas.microsoft.com/office/drawing/2015/10/21/chartex" xmlns:cx3="http://schemas.microsoft.com/office/drawing/2016/5/9/chartex" xmlns:cx4="http://schemas.microsoft.com/office/drawing/2016/5/10/chartex" xmlns:cx5="http://schemas.microsoft.com/office/drawing/2016/5/11/chartex" xmlns:cx6="http://schemas.microsoft.com/office/drawing/2016/5/12/chartex" xmlns:cx7="http://schemas.microsoft.com/office/drawing/2016/5/13/chartex" xmlns:cx8="http://schemas.microsoft.com/office/drawing/2016/5/14/chartex" xmlns:mc="http://schemas.openxmlformats.org/markup-compatibility/2006" xmlns:aink="http://schemas.microsoft.com/office/drawing/2016/ink" xmlns:am3d="http://schemas.microsoft.com/office/drawing/2017/model3d" xmlns:o="urn:schemas-microsoft-com:office:office" xmlns:oel="http://schemas.microsoft.com/office/2019/extlst" xmlns:r="http://schemas.openxmlformats.org/officeDocument/2006/relationships" xmlns:m="http://schemas.openxmlformats.org/officeDocument/2006/math" xmlns:v="urn:schemas-microsoft-com:vml" xmlns:wp14="http://schemas.microsoft.com/office/word/2010/wordprocessingDrawing" xmlns:wp="http://schemas.openxmlformats.org/drawingml/2006/wordprocessingDrawing" xmlns:w10="urn:schemas-microsoft-com:office:word" xmlns:w="http://schemas.openxmlformats.org/wordprocessingml/2006/main" xmlns:w14="http://schemas.microsoft.com/office/word/2010/wordml" xmlns:w15="http://schemas.microsoft.com/office/word/2012/wordml" xmlns:w16cex="http://schemas.microsoft.com/office/word/2018/wordml/cex" xmlns:w16cid="http://schemas.microsoft.com/office/word/2016/wordml/cid" xmlns:w16="http://schemas.microsoft.com/office/word/2018/wordml" xmlns:w16du="http://schemas.microsoft.com/office/word/2023/wordml/word16du" xmlns:w16sdtdh="http://schemas.microsoft.com/office/word/2020/wordml/sdtdatahash" xmlns:w16sdtfl="http://schemas.microsoft.com/office/word/2024/wordml/sdtformatlock" xmlns:w16se="http://schemas.microsoft.com/office/word/2015/wordml/symex" xmlns:wpg="http://schemas.microsoft.com/office/word/2010/wordprocessingGroup" xmlns:wpi="http://schemas.microsoft.com/office/word/2010/wordprocessingInk" xmlns:wne="http://schemas.microsoft.com/office/word/2006/wordml" xmlns:wps="http://schemas.microsoft.com/office/word/2010/wordprocessingShape" mc:Ignorable="w14 w15 w16se w16cid w16 w16cex w16sdtdh w16sdtfl w16du wp14">
+  <w:comment w:id="35" w:author="Aleksey A. Kalentev" w:date="2026-06-13T13:33:00Z" w:initials="AAK">
     <w:p>
       <w:pPr>
         <w:pStyle w:val="af3"/>
@@ -15130,28 +13882,25 @@
 </file>
 
 <file path=word/commentsExtended.xml><?xml version="1.0" encoding="utf-8"?>
-<w15:commentsEx xmlns:wpc="http://schemas.microsoft.com/office/word/2010/wordprocessingCanvas" xmlns:cx="http://schemas.microsoft.com/office/drawing/2014/chartex" xmlns:cx1="http://schemas.microsoft.com/office/drawing/2015/9/8/chartex" xmlns:cx2="http://schemas.microsoft.com/office/drawing/2015/10/21/chartex" xmlns:cx3="http://schemas.microsoft.com/office/drawing/2016/5/9/chartex" xmlns:cx4="http://schemas.microsoft.com/office/drawing/2016/5/10/chartex" xmlns:cx5="http://schemas.microsoft.com/office/drawing/2016/5/11/chartex" xmlns:cx6="http://schemas.microsoft.com/office/drawing/2016/5/12/chartex" xmlns:cx7="http://schemas.microsoft.com/office/drawing/2016/5/13/chartex" xmlns:cx8="http://schemas.microsoft.com/office/drawing/2016/5/14/chartex" xmlns:mc="http://schemas.openxmlformats.org/markup-compatibility/2006" xmlns:aink="http://schemas.microsoft.com/office/drawing/2016/ink" xmlns:am3d="http://schemas.microsoft.com/office/drawing/2017/model3d" xmlns:o="urn:schemas-microsoft-com:office:office" xmlns:r="http://schemas.openxmlformats.org/officeDocument/2006/relationships" xmlns:m="http://schemas.openxmlformats.org/officeDocument/2006/math" xmlns:v="urn:schemas-microsoft-com:vml" xmlns:wp14="http://schemas.microsoft.com/office/word/2010/wordprocessingDrawing" xmlns:wp="http://schemas.openxmlformats.org/drawingml/2006/wordprocessingDrawing" xmlns:w10="urn:schemas-microsoft-com:office:word" xmlns:w="http://schemas.openxmlformats.org/wordprocessingml/2006/main" xmlns:w14="http://schemas.microsoft.com/office/word/2010/wordml" xmlns:w15="http://schemas.microsoft.com/office/word/2012/wordml" xmlns:w16cex="http://schemas.microsoft.com/office/word/2018/wordml/cex" xmlns:w16cid="http://schemas.microsoft.com/office/word/2016/wordml/cid" xmlns:w16="http://schemas.microsoft.com/office/word/2018/wordml" xmlns:w16sdtdh="http://schemas.microsoft.com/office/word/2020/wordml/sdtdatahash" xmlns:w16se="http://schemas.microsoft.com/office/word/2015/wordml/symex" xmlns:wpg="http://schemas.microsoft.com/office/word/2010/wordprocessingGroup" xmlns:wpi="http://schemas.microsoft.com/office/word/2010/wordprocessingInk" xmlns:wne="http://schemas.microsoft.com/office/word/2006/wordml" xmlns:wps="http://schemas.microsoft.com/office/word/2010/wordprocessingShape" mc:Ignorable="w14 w15 w16se w16cid w16 w16cex w16sdtdh wp14">
-  <w15:commentEx w15:paraId="5567F18E" w15:done="0"/>
+<w15:commentsEx xmlns:wpc="http://schemas.microsoft.com/office/word/2010/wordprocessingCanvas" xmlns:cx="http://schemas.microsoft.com/office/drawing/2014/chartex" xmlns:cx1="http://schemas.microsoft.com/office/drawing/2015/9/8/chartex" xmlns:cx2="http://schemas.microsoft.com/office/drawing/2015/10/21/chartex" xmlns:cx3="http://schemas.microsoft.com/office/drawing/2016/5/9/chartex" xmlns:cx4="http://schemas.microsoft.com/office/drawing/2016/5/10/chartex" xmlns:cx5="http://schemas.microsoft.com/office/drawing/2016/5/11/chartex" xmlns:cx6="http://schemas.microsoft.com/office/drawing/2016/5/12/chartex" xmlns:cx7="http://schemas.microsoft.com/office/drawing/2016/5/13/chartex" xmlns:cx8="http://schemas.microsoft.com/office/drawing/2016/5/14/chartex" xmlns:mc="http://schemas.openxmlformats.org/markup-compatibility/2006" xmlns:aink="http://schemas.microsoft.com/office/drawing/2016/ink" xmlns:am3d="http://schemas.microsoft.com/office/drawing/2017/model3d" xmlns:o="urn:schemas-microsoft-com:office:office" xmlns:oel="http://schemas.microsoft.com/office/2019/extlst" xmlns:r="http://schemas.openxmlformats.org/officeDocument/2006/relationships" xmlns:m="http://schemas.openxmlformats.org/officeDocument/2006/math" xmlns:v="urn:schemas-microsoft-com:vml" xmlns:wp14="http://schemas.microsoft.com/office/word/2010/wordprocessingDrawing" xmlns:wp="http://schemas.openxmlformats.org/drawingml/2006/wordprocessingDrawing" xmlns:w10="urn:schemas-microsoft-com:office:word" xmlns:w="http://schemas.openxmlformats.org/wordprocessingml/2006/main" xmlns:w14="http://schemas.microsoft.com/office/word/2010/wordml" xmlns:w15="http://schemas.microsoft.com/office/word/2012/wordml" xmlns:w16cex="http://schemas.microsoft.com/office/word/2018/wordml/cex" xmlns:w16cid="http://schemas.microsoft.com/office/word/2016/wordml/cid" xmlns:w16="http://schemas.microsoft.com/office/word/2018/wordml" xmlns:w16du="http://schemas.microsoft.com/office/word/2023/wordml/word16du" xmlns:w16sdtdh="http://schemas.microsoft.com/office/word/2020/wordml/sdtdatahash" xmlns:w16sdtfl="http://schemas.microsoft.com/office/word/2024/wordml/sdtformatlock" xmlns:w16se="http://schemas.microsoft.com/office/word/2015/wordml/symex" xmlns:wpg="http://schemas.microsoft.com/office/word/2010/wordprocessingGroup" xmlns:wpi="http://schemas.microsoft.com/office/word/2010/wordprocessingInk" xmlns:wne="http://schemas.microsoft.com/office/word/2006/wordml" xmlns:wps="http://schemas.microsoft.com/office/word/2010/wordprocessingShape" mc:Ignorable="w14 w15 w16se w16cid w16 w16cex w16sdtdh w16sdtfl w16du wp14">
   <w15:commentEx w15:paraId="24BB3D33" w15:done="0"/>
 </w15:commentsEx>
 </file>
 
 <file path=word/commentsExtensible.xml><?xml version="1.0" encoding="utf-8"?>
-<w16cex:commentsExtensible xmlns:wpc="http://schemas.microsoft.com/office/word/2010/wordprocessingCanvas" xmlns:cx="http://schemas.microsoft.com/office/drawing/2014/chartex" xmlns:cx1="http://schemas.microsoft.com/office/drawing/2015/9/8/chartex" xmlns:cx2="http://schemas.microsoft.com/office/drawing/2015/10/21/chartex" xmlns:cx3="http://schemas.microsoft.com/office/drawing/2016/5/9/chartex" xmlns:cx4="http://schemas.microsoft.com/office/drawing/2016/5/10/chartex" xmlns:cx5="http://schemas.microsoft.com/office/drawing/2016/5/11/chartex" xmlns:cx6="http://schemas.microsoft.com/office/drawing/2016/5/12/chartex" xmlns:cx7="http://schemas.microsoft.com/office/drawing/2016/5/13/chartex" xmlns:cx8="http://schemas.microsoft.com/office/drawing/2016/5/14/chartex" xmlns:mc="http://schemas.openxmlformats.org/markup-compatibility/2006" xmlns:aink="http://schemas.microsoft.com/office/drawing/2016/ink" xmlns:am3d="http://schemas.microsoft.com/office/drawing/2017/model3d" xmlns:o="urn:schemas-microsoft-com:office:office" xmlns:r="http://schemas.openxmlformats.org/officeDocument/2006/relationships" xmlns:m="http://schemas.openxmlformats.org/officeDocument/2006/math" xmlns:v="urn:schemas-microsoft-com:vml" xmlns:wp14="http://schemas.microsoft.com/office/word/2010/wordprocessingDrawing" xmlns:wp="http://schemas.openxmlformats.org/drawingml/2006/wordprocessingDrawing" xmlns:w10="urn:schemas-microsoft-com:office:word" xmlns:w="http://schemas.openxmlformats.org/wordprocessingml/2006/main" xmlns:w14="http://schemas.microsoft.com/office/word/2010/wordml" xmlns:w15="http://schemas.microsoft.com/office/word/2012/wordml" xmlns:w16cex="http://schemas.microsoft.com/office/word/2018/wordml/cex" xmlns:w16cid="http://schemas.microsoft.com/office/word/2016/wordml/cid" xmlns:w16="http://schemas.microsoft.com/office/word/2018/wordml" xmlns:w16sdtdh="http://schemas.microsoft.com/office/word/2020/wordml/sdtdatahash" xmlns:w16se="http://schemas.microsoft.com/office/word/2015/wordml/symex" xmlns:wpg="http://schemas.microsoft.com/office/word/2010/wordprocessingGroup" xmlns:wpi="http://schemas.microsoft.com/office/word/2010/wordprocessingInk" xmlns:wne="http://schemas.microsoft.com/office/word/2006/wordml" xmlns:wps="http://schemas.microsoft.com/office/word/2010/wordprocessingShape" mc:Ignorable="w14 w15 w16se w16cid w16 w16cex w16sdtdh wp14">
-  <w16cex:commentExtensible w16cex:durableId="2DD7DA7F" w16cex:dateUtc="2026-06-13T06:32:00Z"/>
+<w16cex:commentsExtensible xmlns:wpc="http://schemas.microsoft.com/office/word/2010/wordprocessingCanvas" xmlns:cx="http://schemas.microsoft.com/office/drawing/2014/chartex" xmlns:cx1="http://schemas.microsoft.com/office/drawing/2015/9/8/chartex" xmlns:cx2="http://schemas.microsoft.com/office/drawing/2015/10/21/chartex" xmlns:cx3="http://schemas.microsoft.com/office/drawing/2016/5/9/chartex" xmlns:cx4="http://schemas.microsoft.com/office/drawing/2016/5/10/chartex" xmlns:cx5="http://schemas.microsoft.com/office/drawing/2016/5/11/chartex" xmlns:cx6="http://schemas.microsoft.com/office/drawing/2016/5/12/chartex" xmlns:cx7="http://schemas.microsoft.com/office/drawing/2016/5/13/chartex" xmlns:cx8="http://schemas.microsoft.com/office/drawing/2016/5/14/chartex" xmlns:cr="http://schemas.microsoft.com/office/comments/2020/reactions" xmlns:mc="http://schemas.openxmlformats.org/markup-compatibility/2006" xmlns:aink="http://schemas.microsoft.com/office/drawing/2016/ink" xmlns:am3d="http://schemas.microsoft.com/office/drawing/2017/model3d" xmlns:o="urn:schemas-microsoft-com:office:office" xmlns:oel="http://schemas.microsoft.com/office/2019/extlst" xmlns:r="http://schemas.openxmlformats.org/officeDocument/2006/relationships" xmlns:m="http://schemas.openxmlformats.org/officeDocument/2006/math" xmlns:v="urn:schemas-microsoft-com:vml" xmlns:wp14="http://schemas.microsoft.com/office/word/2010/wordprocessingDrawing" xmlns:wp="http://schemas.openxmlformats.org/drawingml/2006/wordprocessingDrawing" xmlns:w10="urn:schemas-microsoft-com:office:word" xmlns:w="http://schemas.openxmlformats.org/wordprocessingml/2006/main" xmlns:w14="http://schemas.microsoft.com/office/word/2010/wordml" xmlns:w15="http://schemas.microsoft.com/office/word/2012/wordml" xmlns:w16cex="http://schemas.microsoft.com/office/word/2018/wordml/cex" xmlns:w16cid="http://schemas.microsoft.com/office/word/2016/wordml/cid" xmlns:w16="http://schemas.microsoft.com/office/word/2018/wordml" xmlns:w16du="http://schemas.microsoft.com/office/word/2023/wordml/word16du" xmlns:w16sdtdh="http://schemas.microsoft.com/office/word/2020/wordml/sdtdatahash" xmlns:w16sdtfl="http://schemas.microsoft.com/office/word/2024/wordml/sdtformatlock" xmlns:w16se="http://schemas.microsoft.com/office/word/2015/wordml/symex" xmlns:wpg="http://schemas.microsoft.com/office/word/2010/wordprocessingGroup" xmlns:wpi="http://schemas.microsoft.com/office/word/2010/wordprocessingInk" xmlns:wne="http://schemas.microsoft.com/office/word/2006/wordml" xmlns:wps="http://schemas.microsoft.com/office/word/2010/wordprocessingShape" mc:Ignorable="w14 w15 w16se w16cid w16 w16cex w16sdtdh w16sdtfl cr w16du wp14">
   <w16cex:commentExtensible w16cex:durableId="2DD7DAA8" w16cex:dateUtc="2026-06-13T06:33:00Z"/>
 </w16cex:commentsExtensible>
 </file>
 
 <file path=word/commentsIds.xml><?xml version="1.0" encoding="utf-8"?>
-<w16cid:commentsIds xmlns:wpc="http://schemas.microsoft.com/office/word/2010/wordprocessingCanvas" xmlns:cx="http://schemas.microsoft.com/office/drawing/2014/chartex" xmlns:cx1="http://schemas.microsoft.com/office/drawing/2015/9/8/chartex" xmlns:cx2="http://schemas.microsoft.com/office/drawing/2015/10/21/chartex" xmlns:cx3="http://schemas.microsoft.com/office/drawing/2016/5/9/chartex" xmlns:cx4="http://schemas.microsoft.com/office/drawing/2016/5/10/chartex" xmlns:cx5="http://schemas.microsoft.com/office/drawing/2016/5/11/chartex" xmlns:cx6="http://schemas.microsoft.com/office/drawing/2016/5/12/chartex" xmlns:cx7="http://schemas.microsoft.com/office/drawing/2016/5/13/chartex" xmlns:cx8="http://schemas.microsoft.com/office/drawing/2016/5/14/chartex" xmlns:mc="http://schemas.openxmlformats.org/markup-compatibility/2006" xmlns:aink="http://schemas.microsoft.com/office/drawing/2016/ink" xmlns:am3d="http://schemas.microsoft.com/office/drawing/2017/model3d" xmlns:o="urn:schemas-microsoft-com:office:office" xmlns:r="http://schemas.openxmlformats.org/officeDocument/2006/relationships" xmlns:m="http://schemas.openxmlformats.org/officeDocument/2006/math" xmlns:v="urn:schemas-microsoft-com:vml" xmlns:wp14="http://schemas.microsoft.com/office/word/2010/wordprocessingDrawing" xmlns:wp="http://schemas.openxmlformats.org/drawingml/2006/wordprocessingDrawing" xmlns:w10="urn:schemas-microsoft-com:office:word" xmlns:w="http://schemas.openxmlformats.org/wordprocessingml/2006/main" xmlns:w14="http://schemas.microsoft.com/office/word/2010/wordml" xmlns:w15="http://schemas.microsoft.com/office/word/2012/wordml" xmlns:w16cex="http://schemas.microsoft.com/office/word/2018/wordml/cex" xmlns:w16cid="http://schemas.microsoft.com/office/word/2016/wordml/cid" xmlns:w16="http://schemas.microsoft.com/office/word/2018/wordml" xmlns:w16sdtdh="http://schemas.microsoft.com/office/word/2020/wordml/sdtdatahash" xmlns:w16se="http://schemas.microsoft.com/office/word/2015/wordml/symex" xmlns:wpg="http://schemas.microsoft.com/office/word/2010/wordprocessingGroup" xmlns:wpi="http://schemas.microsoft.com/office/word/2010/wordprocessingInk" xmlns:wne="http://schemas.microsoft.com/office/word/2006/wordml" xmlns:wps="http://schemas.microsoft.com/office/word/2010/wordprocessingShape" mc:Ignorable="w14 w15 w16se w16cid w16 w16cex w16sdtdh wp14">
-  <w16cid:commentId w16cid:paraId="5567F18E" w16cid:durableId="2DD7DA7F"/>
+<w16cid:commentsIds xmlns:wpc="http://schemas.microsoft.com/office/word/2010/wordprocessingCanvas" xmlns:cx="http://schemas.microsoft.com/office/drawing/2014/chartex" xmlns:cx1="http://schemas.microsoft.com/office/drawing/2015/9/8/chartex" xmlns:cx2="http://schemas.microsoft.com/office/drawing/2015/10/21/chartex" xmlns:cx3="http://schemas.microsoft.com/office/drawing/2016/5/9/chartex" xmlns:cx4="http://schemas.microsoft.com/office/drawing/2016/5/10/chartex" xmlns:cx5="http://schemas.microsoft.com/office/drawing/2016/5/11/chartex" xmlns:cx6="http://schemas.microsoft.com/office/drawing/2016/5/12/chartex" xmlns:cx7="http://schemas.microsoft.com/office/drawing/2016/5/13/chartex" xmlns:cx8="http://schemas.microsoft.com/office/drawing/2016/5/14/chartex" xmlns:mc="http://schemas.openxmlformats.org/markup-compatibility/2006" xmlns:aink="http://schemas.microsoft.com/office/drawing/2016/ink" xmlns:am3d="http://schemas.microsoft.com/office/drawing/2017/model3d" xmlns:o="urn:schemas-microsoft-com:office:office" xmlns:oel="http://schemas.microsoft.com/office/2019/extlst" xmlns:r="http://schemas.openxmlformats.org/officeDocument/2006/relationships" xmlns:m="http://schemas.openxmlformats.org/officeDocument/2006/math" xmlns:v="urn:schemas-microsoft-com:vml" xmlns:wp14="http://schemas.microsoft.com/office/word/2010/wordprocessingDrawing" xmlns:wp="http://schemas.openxmlformats.org/drawingml/2006/wordprocessingDrawing" xmlns:w10="urn:schemas-microsoft-com:office:word" xmlns:w="http://schemas.openxmlformats.org/wordprocessingml/2006/main" xmlns:w14="http://schemas.microsoft.com/office/word/2010/wordml" xmlns:w15="http://schemas.microsoft.com/office/word/2012/wordml" xmlns:w16cex="http://schemas.microsoft.com/office/word/2018/wordml/cex" xmlns:w16cid="http://schemas.microsoft.com/office/word/2016/wordml/cid" xmlns:w16="http://schemas.microsoft.com/office/word/2018/wordml" xmlns:w16du="http://schemas.microsoft.com/office/word/2023/wordml/word16du" xmlns:w16sdtdh="http://schemas.microsoft.com/office/word/2020/wordml/sdtdatahash" xmlns:w16sdtfl="http://schemas.microsoft.com/office/word/2024/wordml/sdtformatlock" xmlns:w16se="http://schemas.microsoft.com/office/word/2015/wordml/symex" xmlns:wpg="http://schemas.microsoft.com/office/word/2010/wordprocessingGroup" xmlns:wpi="http://schemas.microsoft.com/office/word/2010/wordprocessingInk" xmlns:wne="http://schemas.microsoft.com/office/word/2006/wordml" xmlns:wps="http://schemas.microsoft.com/office/word/2010/wordprocessingShape" mc:Ignorable="w14 w15 w16se w16cid w16 w16cex w16sdtdh w16sdtfl w16du wp14">
   <w16cid:commentId w16cid:paraId="24BB3D33" w16cid:durableId="2DD7DAA8"/>
 </w16cid:commentsIds>
 </file>
 
 <file path=word/endnotes.xml><?xml version="1.0" encoding="utf-8"?>
-<w:endnotes xmlns:wpc="http://schemas.microsoft.com/office/word/2010/wordprocessingCanvas" xmlns:cx="http://schemas.microsoft.com/office/drawing/2014/chartex" xmlns:cx1="http://schemas.microsoft.com/office/drawing/2015/9/8/chartex" xmlns:cx2="http://schemas.microsoft.com/office/drawing/2015/10/21/chartex" xmlns:cx3="http://schemas.microsoft.com/office/drawing/2016/5/9/chartex" xmlns:cx4="http://schemas.microsoft.com/office/drawing/2016/5/10/chartex" xmlns:cx5="http://schemas.microsoft.com/office/drawing/2016/5/11/chartex" xmlns:cx6="http://schemas.microsoft.com/office/drawing/2016/5/12/chartex" xmlns:cx7="http://schemas.microsoft.com/office/drawing/2016/5/13/chartex" xmlns:cx8="http://schemas.microsoft.com/office/drawing/2016/5/14/chartex" xmlns:mc="http://schemas.openxmlformats.org/markup-compatibility/2006" xmlns:aink="http://schemas.microsoft.com/office/drawing/2016/ink" xmlns:am3d="http://schemas.microsoft.com/office/drawing/2017/model3d" xmlns:o="urn:schemas-microsoft-com:office:office" xmlns:r="http://schemas.openxmlformats.org/officeDocument/2006/relationships" xmlns:m="http://schemas.openxmlformats.org/officeDocument/2006/math" xmlns:v="urn:schemas-microsoft-com:vml" xmlns:wp14="http://schemas.microsoft.com/office/word/2010/wordprocessingDrawing" xmlns:wp="http://schemas.openxmlformats.org/drawingml/2006/wordprocessingDrawing" xmlns:w10="urn:schemas-microsoft-com:office:word" xmlns:w="http://schemas.openxmlformats.org/wordprocessingml/2006/main" xmlns:w14="http://schemas.microsoft.com/office/word/2010/wordml" xmlns:w15="http://schemas.microsoft.com/office/word/2012/wordml" xmlns:w16cex="http://schemas.microsoft.com/office/word/2018/wordml/cex" xmlns:w16cid="http://schemas.microsoft.com/office/word/2016/wordml/cid" xmlns:w16="http://schemas.microsoft.com/office/word/2018/wordml" xmlns:w16sdtdh="http://schemas.microsoft.com/office/word/2020/wordml/sdtdatahash" xmlns:w16se="http://schemas.microsoft.com/office/word/2015/wordml/symex" xmlns:wpg="http://schemas.microsoft.com/office/word/2010/wordprocessingGroup" xmlns:wpi="http://schemas.microsoft.com/office/word/2010/wordprocessingInk" xmlns:wne="http://schemas.microsoft.com/office/word/2006/wordml" xmlns:wps="http://schemas.microsoft.com/office/word/2010/wordprocessingShape" mc:Ignorable="w14 w15 w16se w16cid w16 w16cex w16sdtdh wp14">
+<w:endnotes xmlns:wpc="http://schemas.microsoft.com/office/word/2010/wordprocessingCanvas" xmlns:cx="http://schemas.microsoft.com/office/drawing/2014/chartex" xmlns:cx1="http://schemas.microsoft.com/office/drawing/2015/9/8/chartex" xmlns:cx2="http://schemas.microsoft.com/office/drawing/2015/10/21/chartex" xmlns:cx3="http://schemas.microsoft.com/office/drawing/2016/5/9/chartex" xmlns:cx4="http://schemas.microsoft.com/office/drawing/2016/5/10/chartex" xmlns:cx5="http://schemas.microsoft.com/office/drawing/2016/5/11/chartex" xmlns:cx6="http://schemas.microsoft.com/office/drawing/2016/5/12/chartex" xmlns:cx7="http://schemas.microsoft.com/office/drawing/2016/5/13/chartex" xmlns:cx8="http://schemas.microsoft.com/office/drawing/2016/5/14/chartex" xmlns:mc="http://schemas.openxmlformats.org/markup-compatibility/2006" xmlns:aink="http://schemas.microsoft.com/office/drawing/2016/ink" xmlns:am3d="http://schemas.microsoft.com/office/drawing/2017/model3d" xmlns:o="urn:schemas-microsoft-com:office:office" xmlns:oel="http://schemas.microsoft.com/office/2019/extlst" xmlns:r="http://schemas.openxmlformats.org/officeDocument/2006/relationships" xmlns:m="http://schemas.openxmlformats.org/officeDocument/2006/math" xmlns:v="urn:schemas-microsoft-com:vml" xmlns:wp14="http://schemas.microsoft.com/office/word/2010/wordprocessingDrawing" xmlns:wp="http://schemas.openxmlformats.org/drawingml/2006/wordprocessingDrawing" xmlns:w10="urn:schemas-microsoft-com:office:word" xmlns:w="http://schemas.openxmlformats.org/wordprocessingml/2006/main" xmlns:w14="http://schemas.microsoft.com/office/word/2010/wordml" xmlns:w15="http://schemas.microsoft.com/office/word/2012/wordml" xmlns:w16cex="http://schemas.microsoft.com/office/word/2018/wordml/cex" xmlns:w16cid="http://schemas.microsoft.com/office/word/2016/wordml/cid" xmlns:w16="http://schemas.microsoft.com/office/word/2018/wordml" xmlns:w16du="http://schemas.microsoft.com/office/word/2023/wordml/word16du" xmlns:w16sdtdh="http://schemas.microsoft.com/office/word/2020/wordml/sdtdatahash" xmlns:w16sdtfl="http://schemas.microsoft.com/office/word/2024/wordml/sdtformatlock" xmlns:w16se="http://schemas.microsoft.com/office/word/2015/wordml/symex" xmlns:wpg="http://schemas.microsoft.com/office/word/2010/wordprocessingGroup" xmlns:wpi="http://schemas.microsoft.com/office/word/2010/wordprocessingInk" xmlns:wne="http://schemas.microsoft.com/office/word/2006/wordml" xmlns:wps="http://schemas.microsoft.com/office/word/2010/wordprocessingShape" mc:Ignorable="w14 w15 w16se w16cid w16 w16cex w16sdtdh w16sdtfl w16du wp14">
   <w:endnote w:type="separator" w:id="-1">
     <w:p>
       <w:pPr>
@@ -15176,7 +13925,7 @@
 </file>
 
 <file path=word/footer1.xml><?xml version="1.0" encoding="utf-8"?>
-<w:ftr xmlns:wpc="http://schemas.microsoft.com/office/word/2010/wordprocessingCanvas" xmlns:cx="http://schemas.microsoft.com/office/drawing/2014/chartex" xmlns:cx1="http://schemas.microsoft.com/office/drawing/2015/9/8/chartex" xmlns:cx2="http://schemas.microsoft.com/office/drawing/2015/10/21/chartex" xmlns:cx3="http://schemas.microsoft.com/office/drawing/2016/5/9/chartex" xmlns:cx4="http://schemas.microsoft.com/office/drawing/2016/5/10/chartex" xmlns:cx5="http://schemas.microsoft.com/office/drawing/2016/5/11/chartex" xmlns:cx6="http://schemas.microsoft.com/office/drawing/2016/5/12/chartex" xmlns:cx7="http://schemas.microsoft.com/office/drawing/2016/5/13/chartex" xmlns:cx8="http://schemas.microsoft.com/office/drawing/2016/5/14/chartex" xmlns:mc="http://schemas.openxmlformats.org/markup-compatibility/2006" xmlns:aink="http://schemas.microsoft.com/office/drawing/2016/ink" xmlns:am3d="http://schemas.microsoft.com/office/drawing/2017/model3d" xmlns:o="urn:schemas-microsoft-com:office:office" xmlns:r="http://schemas.openxmlformats.org/officeDocument/2006/relationships" xmlns:m="http://schemas.openxmlformats.org/officeDocument/2006/math" xmlns:v="urn:schemas-microsoft-com:vml" xmlns:wp14="http://schemas.microsoft.com/office/word/2010/wordprocessingDrawing" xmlns:wp="http://schemas.openxmlformats.org/drawingml/2006/wordprocessingDrawing" xmlns:w10="urn:schemas-microsoft-com:office:word" xmlns:w="http://schemas.openxmlformats.org/wordprocessingml/2006/main" xmlns:w14="http://schemas.microsoft.com/office/word/2010/wordml" xmlns:w15="http://schemas.microsoft.com/office/word/2012/wordml" xmlns:w16cex="http://schemas.microsoft.com/office/word/2018/wordml/cex" xmlns:w16cid="http://schemas.microsoft.com/office/word/2016/wordml/cid" xmlns:w16="http://schemas.microsoft.com/office/word/2018/wordml" xmlns:w16sdtdh="http://schemas.microsoft.com/office/word/2020/wordml/sdtdatahash" xmlns:w16se="http://schemas.microsoft.com/office/word/2015/wordml/symex" xmlns:wpg="http://schemas.microsoft.com/office/word/2010/wordprocessingGroup" xmlns:wpi="http://schemas.microsoft.com/office/word/2010/wordprocessingInk" xmlns:wne="http://schemas.microsoft.com/office/word/2006/wordml" xmlns:wps="http://schemas.microsoft.com/office/word/2010/wordprocessingShape" mc:Ignorable="w14 w15 w16se w16cid w16 w16cex w16sdtdh wp14">
+<w:ftr xmlns:wpc="http://schemas.microsoft.com/office/word/2010/wordprocessingCanvas" xmlns:cx="http://schemas.microsoft.com/office/drawing/2014/chartex" xmlns:cx1="http://schemas.microsoft.com/office/drawing/2015/9/8/chartex" xmlns:cx2="http://schemas.microsoft.com/office/drawing/2015/10/21/chartex" xmlns:cx3="http://schemas.microsoft.com/office/drawing/2016/5/9/chartex" xmlns:cx4="http://schemas.microsoft.com/office/drawing/2016/5/10/chartex" xmlns:cx5="http://schemas.microsoft.com/office/drawing/2016/5/11/chartex" xmlns:cx6="http://schemas.microsoft.com/office/drawing/2016/5/12/chartex" xmlns:cx7="http://schemas.microsoft.com/office/drawing/2016/5/13/chartex" xmlns:cx8="http://schemas.microsoft.com/office/drawing/2016/5/14/chartex" xmlns:mc="http://schemas.openxmlformats.org/markup-compatibility/2006" xmlns:aink="http://schemas.microsoft.com/office/drawing/2016/ink" xmlns:am3d="http://schemas.microsoft.com/office/drawing/2017/model3d" xmlns:o="urn:schemas-microsoft-com:office:office" xmlns:oel="http://schemas.microsoft.com/office/2019/extlst" xmlns:r="http://schemas.openxmlformats.org/officeDocument/2006/relationships" xmlns:m="http://schemas.openxmlformats.org/officeDocument/2006/math" xmlns:v="urn:schemas-microsoft-com:vml" xmlns:wp14="http://schemas.microsoft.com/office/word/2010/wordprocessingDrawing" xmlns:wp="http://schemas.openxmlformats.org/drawingml/2006/wordprocessingDrawing" xmlns:w10="urn:schemas-microsoft-com:office:word" xmlns:w="http://schemas.openxmlformats.org/wordprocessingml/2006/main" xmlns:w14="http://schemas.microsoft.com/office/word/2010/wordml" xmlns:w15="http://schemas.microsoft.com/office/word/2012/wordml" xmlns:w16cex="http://schemas.microsoft.com/office/word/2018/wordml/cex" xmlns:w16cid="http://schemas.microsoft.com/office/word/2016/wordml/cid" xmlns:w16="http://schemas.microsoft.com/office/word/2018/wordml" xmlns:w16du="http://schemas.microsoft.com/office/word/2023/wordml/word16du" xmlns:w16sdtdh="http://schemas.microsoft.com/office/word/2020/wordml/sdtdatahash" xmlns:w16sdtfl="http://schemas.microsoft.com/office/word/2024/wordml/sdtformatlock" xmlns:w16se="http://schemas.microsoft.com/office/word/2015/wordml/symex" xmlns:wpg="http://schemas.microsoft.com/office/word/2010/wordprocessingGroup" xmlns:wpi="http://schemas.microsoft.com/office/word/2010/wordprocessingInk" xmlns:wne="http://schemas.microsoft.com/office/word/2006/wordml" xmlns:wps="http://schemas.microsoft.com/office/word/2010/wordprocessingShape" mc:Ignorable="w14 w15 w16se w16cid w16 w16cex w16sdtdh w16sdtfl w16du wp14">
   <w:p>
     <w:pPr>
       <w:pStyle w:val="af"/>
@@ -15186,7 +13935,7 @@
 </file>
 
 <file path=word/footer2.xml><?xml version="1.0" encoding="utf-8"?>
-<w:ftr xmlns:wpc="http://schemas.microsoft.com/office/word/2010/wordprocessingCanvas" xmlns:cx="http://schemas.microsoft.com/office/drawing/2014/chartex" xmlns:cx1="http://schemas.microsoft.com/office/drawing/2015/9/8/chartex" xmlns:cx2="http://schemas.microsoft.com/office/drawing/2015/10/21/chartex" xmlns:cx3="http://schemas.microsoft.com/office/drawing/2016/5/9/chartex" xmlns:cx4="http://schemas.microsoft.com/office/drawing/2016/5/10/chartex" xmlns:cx5="http://schemas.microsoft.com/office/drawing/2016/5/11/chartex" xmlns:cx6="http://schemas.microsoft.com/office/drawing/2016/5/12/chartex" xmlns:cx7="http://schemas.microsoft.com/office/drawing/2016/5/13/chartex" xmlns:cx8="http://schemas.microsoft.com/office/drawing/2016/5/14/chartex" xmlns:mc="http://schemas.openxmlformats.org/markup-compatibility/2006" xmlns:aink="http://schemas.microsoft.com/office/drawing/2016/ink" xmlns:am3d="http://schemas.microsoft.com/office/drawing/2017/model3d" xmlns:o="urn:schemas-microsoft-com:office:office" xmlns:r="http://schemas.openxmlformats.org/officeDocument/2006/relationships" xmlns:m="http://schemas.openxmlformats.org/officeDocument/2006/math" xmlns:v="urn:schemas-microsoft-com:vml" xmlns:wp14="http://schemas.microsoft.com/office/word/2010/wordprocessingDrawing" xmlns:wp="http://schemas.openxmlformats.org/drawingml/2006/wordprocessingDrawing" xmlns:w10="urn:schemas-microsoft-com:office:word" xmlns:w="http://schemas.openxmlformats.org/wordprocessingml/2006/main" xmlns:w14="http://schemas.microsoft.com/office/word/2010/wordml" xmlns:w15="http://schemas.microsoft.com/office/word/2012/wordml" xmlns:w16cex="http://schemas.microsoft.com/office/word/2018/wordml/cex" xmlns:w16cid="http://schemas.microsoft.com/office/word/2016/wordml/cid" xmlns:w16="http://schemas.microsoft.com/office/word/2018/wordml" xmlns:w16sdtdh="http://schemas.microsoft.com/office/word/2020/wordml/sdtdatahash" xmlns:w16se="http://schemas.microsoft.com/office/word/2015/wordml/symex" xmlns:wpg="http://schemas.microsoft.com/office/word/2010/wordprocessingGroup" xmlns:wpi="http://schemas.microsoft.com/office/word/2010/wordprocessingInk" xmlns:wne="http://schemas.microsoft.com/office/word/2006/wordml" xmlns:wps="http://schemas.microsoft.com/office/word/2010/wordprocessingShape" mc:Ignorable="w14 w15 w16se w16cid w16 w16cex w16sdtdh wp14">
+<w:ftr xmlns:wpc="http://schemas.microsoft.com/office/word/2010/wordprocessingCanvas" xmlns:cx="http://schemas.microsoft.com/office/drawing/2014/chartex" xmlns:cx1="http://schemas.microsoft.com/office/drawing/2015/9/8/chartex" xmlns:cx2="http://schemas.microsoft.com/office/drawing/2015/10/21/chartex" xmlns:cx3="http://schemas.microsoft.com/office/drawing/2016/5/9/chartex" xmlns:cx4="http://schemas.microsoft.com/office/drawing/2016/5/10/chartex" xmlns:cx5="http://schemas.microsoft.com/office/drawing/2016/5/11/chartex" xmlns:cx6="http://schemas.microsoft.com/office/drawing/2016/5/12/chartex" xmlns:cx7="http://schemas.microsoft.com/office/drawing/2016/5/13/chartex" xmlns:cx8="http://schemas.microsoft.com/office/drawing/2016/5/14/chartex" xmlns:mc="http://schemas.openxmlformats.org/markup-compatibility/2006" xmlns:aink="http://schemas.microsoft.com/office/drawing/2016/ink" xmlns:am3d="http://schemas.microsoft.com/office/drawing/2017/model3d" xmlns:o="urn:schemas-microsoft-com:office:office" xmlns:oel="http://schemas.microsoft.com/office/2019/extlst" xmlns:r="http://schemas.openxmlformats.org/officeDocument/2006/relationships" xmlns:m="http://schemas.openxmlformats.org/officeDocument/2006/math" xmlns:v="urn:schemas-microsoft-com:vml" xmlns:wp14="http://schemas.microsoft.com/office/word/2010/wordprocessingDrawing" xmlns:wp="http://schemas.openxmlformats.org/drawingml/2006/wordprocessingDrawing" xmlns:w10="urn:schemas-microsoft-com:office:word" xmlns:w="http://schemas.openxmlformats.org/wordprocessingml/2006/main" xmlns:w14="http://schemas.microsoft.com/office/word/2010/wordml" xmlns:w15="http://schemas.microsoft.com/office/word/2012/wordml" xmlns:w16cex="http://schemas.microsoft.com/office/word/2018/wordml/cex" xmlns:w16cid="http://schemas.microsoft.com/office/word/2016/wordml/cid" xmlns:w16="http://schemas.microsoft.com/office/word/2018/wordml" xmlns:w16du="http://schemas.microsoft.com/office/word/2023/wordml/word16du" xmlns:w16sdtdh="http://schemas.microsoft.com/office/word/2020/wordml/sdtdatahash" xmlns:w16sdtfl="http://schemas.microsoft.com/office/word/2024/wordml/sdtformatlock" xmlns:w16se="http://schemas.microsoft.com/office/word/2015/wordml/symex" xmlns:wpg="http://schemas.microsoft.com/office/word/2010/wordprocessingGroup" xmlns:wpi="http://schemas.microsoft.com/office/word/2010/wordprocessingInk" xmlns:wne="http://schemas.microsoft.com/office/word/2006/wordml" xmlns:wps="http://schemas.microsoft.com/office/word/2010/wordprocessingShape" mc:Ignorable="w14 w15 w16se w16cid w16 w16cex w16sdtdh w16sdtfl w16du wp14">
   <w:sdt>
     <w:sdtPr>
       <w:id w:val="258421343"/>
@@ -15195,7 +13944,6 @@
         <w:docPartUnique/>
       </w:docPartObj>
     </w:sdtPr>
-    <w:sdtEndPr/>
     <w:sdtContent>
       <w:p>
         <w:pPr>
@@ -15224,7 +13972,7 @@
 </file>
 
 <file path=word/footer3.xml><?xml version="1.0" encoding="utf-8"?>
-<w:ftr xmlns:wpc="http://schemas.microsoft.com/office/word/2010/wordprocessingCanvas" xmlns:cx="http://schemas.microsoft.com/office/drawing/2014/chartex" xmlns:cx1="http://schemas.microsoft.com/office/drawing/2015/9/8/chartex" xmlns:cx2="http://schemas.microsoft.com/office/drawing/2015/10/21/chartex" xmlns:cx3="http://schemas.microsoft.com/office/drawing/2016/5/9/chartex" xmlns:cx4="http://schemas.microsoft.com/office/drawing/2016/5/10/chartex" xmlns:cx5="http://schemas.microsoft.com/office/drawing/2016/5/11/chartex" xmlns:cx6="http://schemas.microsoft.com/office/drawing/2016/5/12/chartex" xmlns:cx7="http://schemas.microsoft.com/office/drawing/2016/5/13/chartex" xmlns:cx8="http://schemas.microsoft.com/office/drawing/2016/5/14/chartex" xmlns:mc="http://schemas.openxmlformats.org/markup-compatibility/2006" xmlns:aink="http://schemas.microsoft.com/office/drawing/2016/ink" xmlns:am3d="http://schemas.microsoft.com/office/drawing/2017/model3d" xmlns:o="urn:schemas-microsoft-com:office:office" xmlns:r="http://schemas.openxmlformats.org/officeDocument/2006/relationships" xmlns:m="http://schemas.openxmlformats.org/officeDocument/2006/math" xmlns:v="urn:schemas-microsoft-com:vml" xmlns:wp14="http://schemas.microsoft.com/office/word/2010/wordprocessingDrawing" xmlns:wp="http://schemas.openxmlformats.org/drawingml/2006/wordprocessingDrawing" xmlns:w10="urn:schemas-microsoft-com:office:word" xmlns:w="http://schemas.openxmlformats.org/wordprocessingml/2006/main" xmlns:w14="http://schemas.microsoft.com/office/word/2010/wordml" xmlns:w15="http://schemas.microsoft.com/office/word/2012/wordml" xmlns:w16cex="http://schemas.microsoft.com/office/word/2018/wordml/cex" xmlns:w16cid="http://schemas.microsoft.com/office/word/2016/wordml/cid" xmlns:w16="http://schemas.microsoft.com/office/word/2018/wordml" xmlns:w16sdtdh="http://schemas.microsoft.com/office/word/2020/wordml/sdtdatahash" xmlns:w16se="http://schemas.microsoft.com/office/word/2015/wordml/symex" xmlns:wpg="http://schemas.microsoft.com/office/word/2010/wordprocessingGroup" xmlns:wpi="http://schemas.microsoft.com/office/word/2010/wordprocessingInk" xmlns:wne="http://schemas.microsoft.com/office/word/2006/wordml" xmlns:wps="http://schemas.microsoft.com/office/word/2010/wordprocessingShape" mc:Ignorable="w14 w15 w16se w16cid w16 w16cex w16sdtdh wp14">
+<w:ftr xmlns:wpc="http://schemas.microsoft.com/office/word/2010/wordprocessingCanvas" xmlns:cx="http://schemas.microsoft.com/office/drawing/2014/chartex" xmlns:cx1="http://schemas.microsoft.com/office/drawing/2015/9/8/chartex" xmlns:cx2="http://schemas.microsoft.com/office/drawing/2015/10/21/chartex" xmlns:cx3="http://schemas.microsoft.com/office/drawing/2016/5/9/chartex" xmlns:cx4="http://schemas.microsoft.com/office/drawing/2016/5/10/chartex" xmlns:cx5="http://schemas.microsoft.com/office/drawing/2016/5/11/chartex" xmlns:cx6="http://schemas.microsoft.com/office/drawing/2016/5/12/chartex" xmlns:cx7="http://schemas.microsoft.com/office/drawing/2016/5/13/chartex" xmlns:cx8="http://schemas.microsoft.com/office/drawing/2016/5/14/chartex" xmlns:mc="http://schemas.openxmlformats.org/markup-compatibility/2006" xmlns:aink="http://schemas.microsoft.com/office/drawing/2016/ink" xmlns:am3d="http://schemas.microsoft.com/office/drawing/2017/model3d" xmlns:o="urn:schemas-microsoft-com:office:office" xmlns:oel="http://schemas.microsoft.com/office/2019/extlst" xmlns:r="http://schemas.openxmlformats.org/officeDocument/2006/relationships" xmlns:m="http://schemas.openxmlformats.org/officeDocument/2006/math" xmlns:v="urn:schemas-microsoft-com:vml" xmlns:wp14="http://schemas.microsoft.com/office/word/2010/wordprocessingDrawing" xmlns:wp="http://schemas.openxmlformats.org/drawingml/2006/wordprocessingDrawing" xmlns:w10="urn:schemas-microsoft-com:office:word" xmlns:w="http://schemas.openxmlformats.org/wordprocessingml/2006/main" xmlns:w14="http://schemas.microsoft.com/office/word/2010/wordml" xmlns:w15="http://schemas.microsoft.com/office/word/2012/wordml" xmlns:w16cex="http://schemas.microsoft.com/office/word/2018/wordml/cex" xmlns:w16cid="http://schemas.microsoft.com/office/word/2016/wordml/cid" xmlns:w16="http://schemas.microsoft.com/office/word/2018/wordml" xmlns:w16du="http://schemas.microsoft.com/office/word/2023/wordml/word16du" xmlns:w16sdtdh="http://schemas.microsoft.com/office/word/2020/wordml/sdtdatahash" xmlns:w16sdtfl="http://schemas.microsoft.com/office/word/2024/wordml/sdtformatlock" xmlns:w16se="http://schemas.microsoft.com/office/word/2015/wordml/symex" xmlns:wpg="http://schemas.microsoft.com/office/word/2010/wordprocessingGroup" xmlns:wpi="http://schemas.microsoft.com/office/word/2010/wordprocessingInk" xmlns:wne="http://schemas.microsoft.com/office/word/2006/wordml" xmlns:wps="http://schemas.microsoft.com/office/word/2010/wordprocessingShape" mc:Ignorable="w14 w15 w16se w16cid w16 w16cex w16sdtdh w16sdtfl w16du wp14">
   <w:p>
     <w:pPr>
       <w:pStyle w:val="af"/>
@@ -15238,7 +13986,7 @@
 </file>
 
 <file path=word/footnotes.xml><?xml version="1.0" encoding="utf-8"?>
-<w:footnotes xmlns:wpc="http://schemas.microsoft.com/office/word/2010/wordprocessingCanvas" xmlns:cx="http://schemas.microsoft.com/office/drawing/2014/chartex" xmlns:cx1="http://schemas.microsoft.com/office/drawing/2015/9/8/chartex" xmlns:cx2="http://schemas.microsoft.com/office/drawing/2015/10/21/chartex" xmlns:cx3="http://schemas.microsoft.com/office/drawing/2016/5/9/chartex" xmlns:cx4="http://schemas.microsoft.com/office/drawing/2016/5/10/chartex" xmlns:cx5="http://schemas.microsoft.com/office/drawing/2016/5/11/chartex" xmlns:cx6="http://schemas.microsoft.com/office/drawing/2016/5/12/chartex" xmlns:cx7="http://schemas.microsoft.com/office/drawing/2016/5/13/chartex" xmlns:cx8="http://schemas.microsoft.com/office/drawing/2016/5/14/chartex" xmlns:mc="http://schemas.openxmlformats.org/markup-compatibility/2006" xmlns:aink="http://schemas.microsoft.com/office/drawing/2016/ink" xmlns:am3d="http://schemas.microsoft.com/office/drawing/2017/model3d" xmlns:o="urn:schemas-microsoft-com:office:office" xmlns:r="http://schemas.openxmlformats.org/officeDocument/2006/relationships" xmlns:m="http://schemas.openxmlformats.org/officeDocument/2006/math" xmlns:v="urn:schemas-microsoft-com:vml" xmlns:wp14="http://schemas.microsoft.com/office/word/2010/wordprocessingDrawing" xmlns:wp="http://schemas.openxmlformats.org/drawingml/2006/wordprocessingDrawing" xmlns:w10="urn:schemas-microsoft-com:office:word" xmlns:w="http://schemas.openxmlformats.org/wordprocessingml/2006/main" xmlns:w14="http://schemas.microsoft.com/office/word/2010/wordml" xmlns:w15="http://schemas.microsoft.com/office/word/2012/wordml" xmlns:w16cex="http://schemas.microsoft.com/office/word/2018/wordml/cex" xmlns:w16cid="http://schemas.microsoft.com/office/word/2016/wordml/cid" xmlns:w16="http://schemas.microsoft.com/office/word/2018/wordml" xmlns:w16sdtdh="http://schemas.microsoft.com/office/word/2020/wordml/sdtdatahash" xmlns:w16se="http://schemas.microsoft.com/office/word/2015/wordml/symex" xmlns:wpg="http://schemas.microsoft.com/office/word/2010/wordprocessingGroup" xmlns:wpi="http://schemas.microsoft.com/office/word/2010/wordprocessingInk" xmlns:wne="http://schemas.microsoft.com/office/word/2006/wordml" xmlns:wps="http://schemas.microsoft.com/office/word/2010/wordprocessingShape" mc:Ignorable="w14 w15 w16se w16cid w16 w16cex w16sdtdh wp14">
+<w:footnotes xmlns:wpc="http://schemas.microsoft.com/office/word/2010/wordprocessingCanvas" xmlns:cx="http://schemas.microsoft.com/office/drawing/2014/chartex" xmlns:cx1="http://schemas.microsoft.com/office/drawing/2015/9/8/chartex" xmlns:cx2="http://schemas.microsoft.com/office/drawing/2015/10/21/chartex" xmlns:cx3="http://schemas.microsoft.com/office/drawing/2016/5/9/chartex" xmlns:cx4="http://schemas.microsoft.com/office/drawing/2016/5/10/chartex" xmlns:cx5="http://schemas.microsoft.com/office/drawing/2016/5/11/chartex" xmlns:cx6="http://schemas.microsoft.com/office/drawing/2016/5/12/chartex" xmlns:cx7="http://schemas.microsoft.com/office/drawing/2016/5/13/chartex" xmlns:cx8="http://schemas.microsoft.com/office/drawing/2016/5/14/chartex" xmlns:mc="http://schemas.openxmlformats.org/markup-compatibility/2006" xmlns:aink="http://schemas.microsoft.com/office/drawing/2016/ink" xmlns:am3d="http://schemas.microsoft.com/office/drawing/2017/model3d" xmlns:o="urn:schemas-microsoft-com:office:office" xmlns:oel="http://schemas.microsoft.com/office/2019/extlst" xmlns:r="http://schemas.openxmlformats.org/officeDocument/2006/relationships" xmlns:m="http://schemas.openxmlformats.org/officeDocument/2006/math" xmlns:v="urn:schemas-microsoft-com:vml" xmlns:wp14="http://schemas.microsoft.com/office/word/2010/wordprocessingDrawing" xmlns:wp="http://schemas.openxmlformats.org/drawingml/2006/wordprocessingDrawing" xmlns:w10="urn:schemas-microsoft-com:office:word" xmlns:w="http://schemas.openxmlformats.org/wordprocessingml/2006/main" xmlns:w14="http://schemas.microsoft.com/office/word/2010/wordml" xmlns:w15="http://schemas.microsoft.com/office/word/2012/wordml" xmlns:w16cex="http://schemas.microsoft.com/office/word/2018/wordml/cex" xmlns:w16cid="http://schemas.microsoft.com/office/word/2016/wordml/cid" xmlns:w16="http://schemas.microsoft.com/office/word/2018/wordml" xmlns:w16du="http://schemas.microsoft.com/office/word/2023/wordml/word16du" xmlns:w16sdtdh="http://schemas.microsoft.com/office/word/2020/wordml/sdtdatahash" xmlns:w16sdtfl="http://schemas.microsoft.com/office/word/2024/wordml/sdtformatlock" xmlns:w16se="http://schemas.microsoft.com/office/word/2015/wordml/symex" xmlns:wpg="http://schemas.microsoft.com/office/word/2010/wordprocessingGroup" xmlns:wpi="http://schemas.microsoft.com/office/word/2010/wordprocessingInk" xmlns:wne="http://schemas.microsoft.com/office/word/2006/wordml" xmlns:wps="http://schemas.microsoft.com/office/word/2010/wordprocessingShape" mc:Ignorable="w14 w15 w16se w16cid w16 w16cex w16sdtdh w16sdtfl w16du wp14">
   <w:footnote w:type="separator" w:id="-1">
     <w:p>
       <w:pPr>
@@ -15263,7 +14011,7 @@
 </file>
 
 <file path=word/header1.xml><?xml version="1.0" encoding="utf-8"?>
-<w:hdr xmlns:wpc="http://schemas.microsoft.com/office/word/2010/wordprocessingCanvas" xmlns:cx="http://schemas.microsoft.com/office/drawing/2014/chartex" xmlns:cx1="http://schemas.microsoft.com/office/drawing/2015/9/8/chartex" xmlns:cx2="http://schemas.microsoft.com/office/drawing/2015/10/21/chartex" xmlns:cx3="http://schemas.microsoft.com/office/drawing/2016/5/9/chartex" xmlns:cx4="http://schemas.microsoft.com/office/drawing/2016/5/10/chartex" xmlns:cx5="http://schemas.microsoft.com/office/drawing/2016/5/11/chartex" xmlns:cx6="http://schemas.microsoft.com/office/drawing/2016/5/12/chartex" xmlns:cx7="http://schemas.microsoft.com/office/drawing/2016/5/13/chartex" xmlns:cx8="http://schemas.microsoft.com/office/drawing/2016/5/14/chartex" xmlns:mc="http://schemas.openxmlformats.org/markup-compatibility/2006" xmlns:aink="http://schemas.microsoft.com/office/drawing/2016/ink" xmlns:am3d="http://schemas.microsoft.com/office/drawing/2017/model3d" xmlns:o="urn:schemas-microsoft-com:office:office" xmlns:r="http://schemas.openxmlformats.org/officeDocument/2006/relationships" xmlns:m="http://schemas.openxmlformats.org/officeDocument/2006/math" xmlns:v="urn:schemas-microsoft-com:vml" xmlns:wp14="http://schemas.microsoft.com/office/word/2010/wordprocessingDrawing" xmlns:wp="http://schemas.openxmlformats.org/drawingml/2006/wordprocessingDrawing" xmlns:w10="urn:schemas-microsoft-com:office:word" xmlns:w="http://schemas.openxmlformats.org/wordprocessingml/2006/main" xmlns:w14="http://schemas.microsoft.com/office/word/2010/wordml" xmlns:w15="http://schemas.microsoft.com/office/word/2012/wordml" xmlns:w16cex="http://schemas.microsoft.com/office/word/2018/wordml/cex" xmlns:w16cid="http://schemas.microsoft.com/office/word/2016/wordml/cid" xmlns:w16="http://schemas.microsoft.com/office/word/2018/wordml" xmlns:w16sdtdh="http://schemas.microsoft.com/office/word/2020/wordml/sdtdatahash" xmlns:w16se="http://schemas.microsoft.com/office/word/2015/wordml/symex" xmlns:wpg="http://schemas.microsoft.com/office/word/2010/wordprocessingGroup" xmlns:wpi="http://schemas.microsoft.com/office/word/2010/wordprocessingInk" xmlns:wne="http://schemas.microsoft.com/office/word/2006/wordml" xmlns:wps="http://schemas.microsoft.com/office/word/2010/wordprocessingShape" mc:Ignorable="w14 w15 w16se w16cid w16 w16cex w16sdtdh wp14">
+<w:hdr xmlns:wpc="http://schemas.microsoft.com/office/word/2010/wordprocessingCanvas" xmlns:cx="http://schemas.microsoft.com/office/drawing/2014/chartex" xmlns:cx1="http://schemas.microsoft.com/office/drawing/2015/9/8/chartex" xmlns:cx2="http://schemas.microsoft.com/office/drawing/2015/10/21/chartex" xmlns:cx3="http://schemas.microsoft.com/office/drawing/2016/5/9/chartex" xmlns:cx4="http://schemas.microsoft.com/office/drawing/2016/5/10/chartex" xmlns:cx5="http://schemas.microsoft.com/office/drawing/2016/5/11/chartex" xmlns:cx6="http://schemas.microsoft.com/office/drawing/2016/5/12/chartex" xmlns:cx7="http://schemas.microsoft.com/office/drawing/2016/5/13/chartex" xmlns:cx8="http://schemas.microsoft.com/office/drawing/2016/5/14/chartex" xmlns:mc="http://schemas.openxmlformats.org/markup-compatibility/2006" xmlns:aink="http://schemas.microsoft.com/office/drawing/2016/ink" xmlns:am3d="http://schemas.microsoft.com/office/drawing/2017/model3d" xmlns:o="urn:schemas-microsoft-com:office:office" xmlns:oel="http://schemas.microsoft.com/office/2019/extlst" xmlns:r="http://schemas.openxmlformats.org/officeDocument/2006/relationships" xmlns:m="http://schemas.openxmlformats.org/officeDocument/2006/math" xmlns:v="urn:schemas-microsoft-com:vml" xmlns:wp14="http://schemas.microsoft.com/office/word/2010/wordprocessingDrawing" xmlns:wp="http://schemas.openxmlformats.org/drawingml/2006/wordprocessingDrawing" xmlns:w10="urn:schemas-microsoft-com:office:word" xmlns:w="http://schemas.openxmlformats.org/wordprocessingml/2006/main" xmlns:w14="http://schemas.microsoft.com/office/word/2010/wordml" xmlns:w15="http://schemas.microsoft.com/office/word/2012/wordml" xmlns:w16cex="http://schemas.microsoft.com/office/word/2018/wordml/cex" xmlns:w16cid="http://schemas.microsoft.com/office/word/2016/wordml/cid" xmlns:w16="http://schemas.microsoft.com/office/word/2018/wordml" xmlns:w16du="http://schemas.microsoft.com/office/word/2023/wordml/word16du" xmlns:w16sdtdh="http://schemas.microsoft.com/office/word/2020/wordml/sdtdatahash" xmlns:w16sdtfl="http://schemas.microsoft.com/office/word/2024/wordml/sdtformatlock" xmlns:w16se="http://schemas.microsoft.com/office/word/2015/wordml/symex" xmlns:wpg="http://schemas.microsoft.com/office/word/2010/wordprocessingGroup" xmlns:wpi="http://schemas.microsoft.com/office/word/2010/wordprocessingInk" xmlns:wne="http://schemas.microsoft.com/office/word/2006/wordml" xmlns:wps="http://schemas.microsoft.com/office/word/2010/wordprocessingShape" mc:Ignorable="w14 w15 w16se w16cid w16 w16cex w16sdtdh w16sdtfl w16du wp14">
   <w:p>
     <w:pPr>
       <w:pStyle w:val="ad"/>
@@ -15273,7 +14021,7 @@
 </file>
 
 <file path=word/header2.xml><?xml version="1.0" encoding="utf-8"?>
-<w:hdr xmlns:wpc="http://schemas.microsoft.com/office/word/2010/wordprocessingCanvas" xmlns:cx="http://schemas.microsoft.com/office/drawing/2014/chartex" xmlns:cx1="http://schemas.microsoft.com/office/drawing/2015/9/8/chartex" xmlns:cx2="http://schemas.microsoft.com/office/drawing/2015/10/21/chartex" xmlns:cx3="http://schemas.microsoft.com/office/drawing/2016/5/9/chartex" xmlns:cx4="http://schemas.microsoft.com/office/drawing/2016/5/10/chartex" xmlns:cx5="http://schemas.microsoft.com/office/drawing/2016/5/11/chartex" xmlns:cx6="http://schemas.microsoft.com/office/drawing/2016/5/12/chartex" xmlns:cx7="http://schemas.microsoft.com/office/drawing/2016/5/13/chartex" xmlns:cx8="http://schemas.microsoft.com/office/drawing/2016/5/14/chartex" xmlns:mc="http://schemas.openxmlformats.org/markup-compatibility/2006" xmlns:aink="http://schemas.microsoft.com/office/drawing/2016/ink" xmlns:am3d="http://schemas.microsoft.com/office/drawing/2017/model3d" xmlns:o="urn:schemas-microsoft-com:office:office" xmlns:r="http://schemas.openxmlformats.org/officeDocument/2006/relationships" xmlns:m="http://schemas.openxmlformats.org/officeDocument/2006/math" xmlns:v="urn:schemas-microsoft-com:vml" xmlns:wp14="http://schemas.microsoft.com/office/word/2010/wordprocessingDrawing" xmlns:wp="http://schemas.openxmlformats.org/drawingml/2006/wordprocessingDrawing" xmlns:w10="urn:schemas-microsoft-com:office:word" xmlns:w="http://schemas.openxmlformats.org/wordprocessingml/2006/main" xmlns:w14="http://schemas.microsoft.com/office/word/2010/wordml" xmlns:w15="http://schemas.microsoft.com/office/word/2012/wordml" xmlns:w16cex="http://schemas.microsoft.com/office/word/2018/wordml/cex" xmlns:w16cid="http://schemas.microsoft.com/office/word/2016/wordml/cid" xmlns:w16="http://schemas.microsoft.com/office/word/2018/wordml" xmlns:w16sdtdh="http://schemas.microsoft.com/office/word/2020/wordml/sdtdatahash" xmlns:w16se="http://schemas.microsoft.com/office/word/2015/wordml/symex" xmlns:wpg="http://schemas.microsoft.com/office/word/2010/wordprocessingGroup" xmlns:wpi="http://schemas.microsoft.com/office/word/2010/wordprocessingInk" xmlns:wne="http://schemas.microsoft.com/office/word/2006/wordml" xmlns:wps="http://schemas.microsoft.com/office/word/2010/wordprocessingShape" mc:Ignorable="w14 w15 w16se w16cid w16 w16cex w16sdtdh wp14">
+<w:hdr xmlns:wpc="http://schemas.microsoft.com/office/word/2010/wordprocessingCanvas" xmlns:cx="http://schemas.microsoft.com/office/drawing/2014/chartex" xmlns:cx1="http://schemas.microsoft.com/office/drawing/2015/9/8/chartex" xmlns:cx2="http://schemas.microsoft.com/office/drawing/2015/10/21/chartex" xmlns:cx3="http://schemas.microsoft.com/office/drawing/2016/5/9/chartex" xmlns:cx4="http://schemas.microsoft.com/office/drawing/2016/5/10/chartex" xmlns:cx5="http://schemas.microsoft.com/office/drawing/2016/5/11/chartex" xmlns:cx6="http://schemas.microsoft.com/office/drawing/2016/5/12/chartex" xmlns:cx7="http://schemas.microsoft.com/office/drawing/2016/5/13/chartex" xmlns:cx8="http://schemas.microsoft.com/office/drawing/2016/5/14/chartex" xmlns:mc="http://schemas.openxmlformats.org/markup-compatibility/2006" xmlns:aink="http://schemas.microsoft.com/office/drawing/2016/ink" xmlns:am3d="http://schemas.microsoft.com/office/drawing/2017/model3d" xmlns:o="urn:schemas-microsoft-com:office:office" xmlns:oel="http://schemas.microsoft.com/office/2019/extlst" xmlns:r="http://schemas.openxmlformats.org/officeDocument/2006/relationships" xmlns:m="http://schemas.openxmlformats.org/officeDocument/2006/math" xmlns:v="urn:schemas-microsoft-com:vml" xmlns:wp14="http://schemas.microsoft.com/office/word/2010/wordprocessingDrawing" xmlns:wp="http://schemas.openxmlformats.org/drawingml/2006/wordprocessingDrawing" xmlns:w10="urn:schemas-microsoft-com:office:word" xmlns:w="http://schemas.openxmlformats.org/wordprocessingml/2006/main" xmlns:w14="http://schemas.microsoft.com/office/word/2010/wordml" xmlns:w15="http://schemas.microsoft.com/office/word/2012/wordml" xmlns:w16cex="http://schemas.microsoft.com/office/word/2018/wordml/cex" xmlns:w16cid="http://schemas.microsoft.com/office/word/2016/wordml/cid" xmlns:w16="http://schemas.microsoft.com/office/word/2018/wordml" xmlns:w16du="http://schemas.microsoft.com/office/word/2023/wordml/word16du" xmlns:w16sdtdh="http://schemas.microsoft.com/office/word/2020/wordml/sdtdatahash" xmlns:w16sdtfl="http://schemas.microsoft.com/office/word/2024/wordml/sdtformatlock" xmlns:w16se="http://schemas.microsoft.com/office/word/2015/wordml/symex" xmlns:wpg="http://schemas.microsoft.com/office/word/2010/wordprocessingGroup" xmlns:wpi="http://schemas.microsoft.com/office/word/2010/wordprocessingInk" xmlns:wne="http://schemas.microsoft.com/office/word/2006/wordml" xmlns:wps="http://schemas.microsoft.com/office/word/2010/wordprocessingShape" mc:Ignorable="w14 w15 w16se w16cid w16 w16cex w16sdtdh w16sdtfl w16du wp14">
   <w:p>
     <w:pPr>
       <w:pStyle w:val="ad"/>
@@ -15283,7 +14031,7 @@
 </file>
 
 <file path=word/header3.xml><?xml version="1.0" encoding="utf-8"?>
-<w:hdr xmlns:wpc="http://schemas.microsoft.com/office/word/2010/wordprocessingCanvas" xmlns:cx="http://schemas.microsoft.com/office/drawing/2014/chartex" xmlns:cx1="http://schemas.microsoft.com/office/drawing/2015/9/8/chartex" xmlns:cx2="http://schemas.microsoft.com/office/drawing/2015/10/21/chartex" xmlns:cx3="http://schemas.microsoft.com/office/drawing/2016/5/9/chartex" xmlns:cx4="http://schemas.microsoft.com/office/drawing/2016/5/10/chartex" xmlns:cx5="http://schemas.microsoft.com/office/drawing/2016/5/11/chartex" xmlns:cx6="http://schemas.microsoft.com/office/drawing/2016/5/12/chartex" xmlns:cx7="http://schemas.microsoft.com/office/drawing/2016/5/13/chartex" xmlns:cx8="http://schemas.microsoft.com/office/drawing/2016/5/14/chartex" xmlns:mc="http://schemas.openxmlformats.org/markup-compatibility/2006" xmlns:aink="http://schemas.microsoft.com/office/drawing/2016/ink" xmlns:am3d="http://schemas.microsoft.com/office/drawing/2017/model3d" xmlns:o="urn:schemas-microsoft-com:office:office" xmlns:r="http://schemas.openxmlformats.org/officeDocument/2006/relationships" xmlns:m="http://schemas.openxmlformats.org/officeDocument/2006/math" xmlns:v="urn:schemas-microsoft-com:vml" xmlns:wp14="http://schemas.microsoft.com/office/word/2010/wordprocessingDrawing" xmlns:wp="http://schemas.openxmlformats.org/drawingml/2006/wordprocessingDrawing" xmlns:w10="urn:schemas-microsoft-com:office:word" xmlns:w="http://schemas.openxmlformats.org/wordprocessingml/2006/main" xmlns:w14="http://schemas.microsoft.com/office/word/2010/wordml" xmlns:w15="http://schemas.microsoft.com/office/word/2012/wordml" xmlns:w16cex="http://schemas.microsoft.com/office/word/2018/wordml/cex" xmlns:w16cid="http://schemas.microsoft.com/office/word/2016/wordml/cid" xmlns:w16="http://schemas.microsoft.com/office/word/2018/wordml" xmlns:w16sdtdh="http://schemas.microsoft.com/office/word/2020/wordml/sdtdatahash" xmlns:w16se="http://schemas.microsoft.com/office/word/2015/wordml/symex" xmlns:wpg="http://schemas.microsoft.com/office/word/2010/wordprocessingGroup" xmlns:wpi="http://schemas.microsoft.com/office/word/2010/wordprocessingInk" xmlns:wne="http://schemas.microsoft.com/office/word/2006/wordml" xmlns:wps="http://schemas.microsoft.com/office/word/2010/wordprocessingShape" mc:Ignorable="w14 w15 w16se w16cid w16 w16cex w16sdtdh wp14">
+<w:hdr xmlns:wpc="http://schemas.microsoft.com/office/word/2010/wordprocessingCanvas" xmlns:cx="http://schemas.microsoft.com/office/drawing/2014/chartex" xmlns:cx1="http://schemas.microsoft.com/office/drawing/2015/9/8/chartex" xmlns:cx2="http://schemas.microsoft.com/office/drawing/2015/10/21/chartex" xmlns:cx3="http://schemas.microsoft.com/office/drawing/2016/5/9/chartex" xmlns:cx4="http://schemas.microsoft.com/office/drawing/2016/5/10/chartex" xmlns:cx5="http://schemas.microsoft.com/office/drawing/2016/5/11/chartex" xmlns:cx6="http://schemas.microsoft.com/office/drawing/2016/5/12/chartex" xmlns:cx7="http://schemas.microsoft.com/office/drawing/2016/5/13/chartex" xmlns:cx8="http://schemas.microsoft.com/office/drawing/2016/5/14/chartex" xmlns:mc="http://schemas.openxmlformats.org/markup-compatibility/2006" xmlns:aink="http://schemas.microsoft.com/office/drawing/2016/ink" xmlns:am3d="http://schemas.microsoft.com/office/drawing/2017/model3d" xmlns:o="urn:schemas-microsoft-com:office:office" xmlns:oel="http://schemas.microsoft.com/office/2019/extlst" xmlns:r="http://schemas.openxmlformats.org/officeDocument/2006/relationships" xmlns:m="http://schemas.openxmlformats.org/officeDocument/2006/math" xmlns:v="urn:schemas-microsoft-com:vml" xmlns:wp14="http://schemas.microsoft.com/office/word/2010/wordprocessingDrawing" xmlns:wp="http://schemas.openxmlformats.org/drawingml/2006/wordprocessingDrawing" xmlns:w10="urn:schemas-microsoft-com:office:word" xmlns:w="http://schemas.openxmlformats.org/wordprocessingml/2006/main" xmlns:w14="http://schemas.microsoft.com/office/word/2010/wordml" xmlns:w15="http://schemas.microsoft.com/office/word/2012/wordml" xmlns:w16cex="http://schemas.microsoft.com/office/word/2018/wordml/cex" xmlns:w16cid="http://schemas.microsoft.com/office/word/2016/wordml/cid" xmlns:w16="http://schemas.microsoft.com/office/word/2018/wordml" xmlns:w16du="http://schemas.microsoft.com/office/word/2023/wordml/word16du" xmlns:w16sdtdh="http://schemas.microsoft.com/office/word/2020/wordml/sdtdatahash" xmlns:w16sdtfl="http://schemas.microsoft.com/office/word/2024/wordml/sdtformatlock" xmlns:w16se="http://schemas.microsoft.com/office/word/2015/wordml/symex" xmlns:wpg="http://schemas.microsoft.com/office/word/2010/wordprocessingGroup" xmlns:wpi="http://schemas.microsoft.com/office/word/2010/wordprocessingInk" xmlns:wne="http://schemas.microsoft.com/office/word/2006/wordml" xmlns:wps="http://schemas.microsoft.com/office/word/2010/wordprocessingShape" mc:Ignorable="w14 w15 w16se w16cid w16 w16cex w16sdtdh w16sdtfl w16du wp14">
   <w:p>
     <w:pPr>
       <w:pStyle w:val="ad"/>
@@ -15293,7 +14041,7 @@
 </file>
 
 <file path=word/numbering.xml><?xml version="1.0" encoding="utf-8"?>
-<w:numbering xmlns:wpc="http://schemas.microsoft.com/office/word/2010/wordprocessingCanvas" xmlns:cx="http://schemas.microsoft.com/office/drawing/2014/chartex" xmlns:cx1="http://schemas.microsoft.com/office/drawing/2015/9/8/chartex" xmlns:cx2="http://schemas.microsoft.com/office/drawing/2015/10/21/chartex" xmlns:cx3="http://schemas.microsoft.com/office/drawing/2016/5/9/chartex" xmlns:cx4="http://schemas.microsoft.com/office/drawing/2016/5/10/chartex" xmlns:cx5="http://schemas.microsoft.com/office/drawing/2016/5/11/chartex" xmlns:cx6="http://schemas.microsoft.com/office/drawing/2016/5/12/chartex" xmlns:cx7="http://schemas.microsoft.com/office/drawing/2016/5/13/chartex" xmlns:cx8="http://schemas.microsoft.com/office/drawing/2016/5/14/chartex" xmlns:mc="http://schemas.openxmlformats.org/markup-compatibility/2006" xmlns:aink="http://schemas.microsoft.com/office/drawing/2016/ink" xmlns:am3d="http://schemas.microsoft.com/office/drawing/2017/model3d" xmlns:o="urn:schemas-microsoft-com:office:office" xmlns:r="http://schemas.openxmlformats.org/officeDocument/2006/relationships" xmlns:m="http://schemas.openxmlformats.org/officeDocument/2006/math" xmlns:v="urn:schemas-microsoft-com:vml" xmlns:wp14="http://schemas.microsoft.com/office/word/2010/wordprocessingDrawing" xmlns:wp="http://schemas.openxmlformats.org/drawingml/2006/wordprocessingDrawing" xmlns:w10="urn:schemas-microsoft-com:office:word" xmlns:w="http://schemas.openxmlformats.org/wordprocessingml/2006/main" xmlns:w14="http://schemas.microsoft.com/office/word/2010/wordml" xmlns:w15="http://schemas.microsoft.com/office/word/2012/wordml" xmlns:w16cex="http://schemas.microsoft.com/office/word/2018/wordml/cex" xmlns:w16cid="http://schemas.microsoft.com/office/word/2016/wordml/cid" xmlns:w16="http://schemas.microsoft.com/office/word/2018/wordml" xmlns:w16sdtdh="http://schemas.microsoft.com/office/word/2020/wordml/sdtdatahash" xmlns:w16se="http://schemas.microsoft.com/office/word/2015/wordml/symex" xmlns:wpg="http://schemas.microsoft.com/office/word/2010/wordprocessingGroup" xmlns:wpi="http://schemas.microsoft.com/office/word/2010/wordprocessingInk" xmlns:wne="http://schemas.microsoft.com/office/word/2006/wordml" xmlns:wps="http://schemas.microsoft.com/office/word/2010/wordprocessingShape" mc:Ignorable="w14 w15 w16se w16cid w16 w16cex w16sdtdh wp14">
+<w:numbering xmlns:wpc="http://schemas.microsoft.com/office/word/2010/wordprocessingCanvas" xmlns:cx="http://schemas.microsoft.com/office/drawing/2014/chartex" xmlns:cx1="http://schemas.microsoft.com/office/drawing/2015/9/8/chartex" xmlns:cx2="http://schemas.microsoft.com/office/drawing/2015/10/21/chartex" xmlns:cx3="http://schemas.microsoft.com/office/drawing/2016/5/9/chartex" xmlns:cx4="http://schemas.microsoft.com/office/drawing/2016/5/10/chartex" xmlns:cx5="http://schemas.microsoft.com/office/drawing/2016/5/11/chartex" xmlns:cx6="http://schemas.microsoft.com/office/drawing/2016/5/12/chartex" xmlns:cx7="http://schemas.microsoft.com/office/drawing/2016/5/13/chartex" xmlns:cx8="http://schemas.microsoft.com/office/drawing/2016/5/14/chartex" xmlns:mc="http://schemas.openxmlformats.org/markup-compatibility/2006" xmlns:aink="http://schemas.microsoft.com/office/drawing/2016/ink" xmlns:am3d="http://schemas.microsoft.com/office/drawing/2017/model3d" xmlns:o="urn:schemas-microsoft-com:office:office" xmlns:oel="http://schemas.microsoft.com/office/2019/extlst" xmlns:r="http://schemas.openxmlformats.org/officeDocument/2006/relationships" xmlns:m="http://schemas.openxmlformats.org/officeDocument/2006/math" xmlns:v="urn:schemas-microsoft-com:vml" xmlns:wp14="http://schemas.microsoft.com/office/word/2010/wordprocessingDrawing" xmlns:wp="http://schemas.openxmlformats.org/drawingml/2006/wordprocessingDrawing" xmlns:w10="urn:schemas-microsoft-com:office:word" xmlns:w="http://schemas.openxmlformats.org/wordprocessingml/2006/main" xmlns:w14="http://schemas.microsoft.com/office/word/2010/wordml" xmlns:w15="http://schemas.microsoft.com/office/word/2012/wordml" xmlns:w16cex="http://schemas.microsoft.com/office/word/2018/wordml/cex" xmlns:w16cid="http://schemas.microsoft.com/office/word/2016/wordml/cid" xmlns:w16="http://schemas.microsoft.com/office/word/2018/wordml" xmlns:w16du="http://schemas.microsoft.com/office/word/2023/wordml/word16du" xmlns:w16sdtdh="http://schemas.microsoft.com/office/word/2020/wordml/sdtdatahash" xmlns:w16sdtfl="http://schemas.microsoft.com/office/word/2024/wordml/sdtformatlock" xmlns:w16se="http://schemas.microsoft.com/office/word/2015/wordml/symex" xmlns:wpg="http://schemas.microsoft.com/office/word/2010/wordprocessingGroup" xmlns:wpi="http://schemas.microsoft.com/office/word/2010/wordprocessingInk" xmlns:wne="http://schemas.microsoft.com/office/word/2006/wordml" xmlns:wps="http://schemas.microsoft.com/office/word/2010/wordprocessingShape" mc:Ignorable="w14 w15 w16se w16cid w16 w16cex w16sdtdh w16sdtfl w16du wp14">
   <w:abstractNum w:abstractNumId="0" w15:restartNumberingAfterBreak="0">
     <w:nsid w:val="01DF6E37"/>
     <w:multiLevelType w:val="hybridMultilevel"/>
@@ -19571,82 +18319,82 @@
       </w:pPr>
     </w:lvl>
   </w:abstractNum>
-  <w:num w:numId="1">
+  <w:num w:numId="1" w16cid:durableId="1187141222">
     <w:abstractNumId w:val="13"/>
   </w:num>
-  <w:num w:numId="2">
+  <w:num w:numId="2" w16cid:durableId="1503009495">
     <w:abstractNumId w:val="30"/>
   </w:num>
-  <w:num w:numId="3">
+  <w:num w:numId="3" w16cid:durableId="141506423">
     <w:abstractNumId w:val="2"/>
   </w:num>
-  <w:num w:numId="4">
+  <w:num w:numId="4" w16cid:durableId="725179481">
     <w:abstractNumId w:val="33"/>
   </w:num>
-  <w:num w:numId="5">
+  <w:num w:numId="5" w16cid:durableId="131334907">
     <w:abstractNumId w:val="25"/>
   </w:num>
-  <w:num w:numId="6">
+  <w:num w:numId="6" w16cid:durableId="1552813099">
     <w:abstractNumId w:val="14"/>
   </w:num>
-  <w:num w:numId="7">
+  <w:num w:numId="7" w16cid:durableId="1774982523">
     <w:abstractNumId w:val="11"/>
   </w:num>
-  <w:num w:numId="8">
+  <w:num w:numId="8" w16cid:durableId="1870416062">
     <w:abstractNumId w:val="41"/>
   </w:num>
-  <w:num w:numId="9">
+  <w:num w:numId="9" w16cid:durableId="1437209487">
     <w:abstractNumId w:val="34"/>
   </w:num>
-  <w:num w:numId="10">
+  <w:num w:numId="10" w16cid:durableId="1337462859">
     <w:abstractNumId w:val="31"/>
   </w:num>
-  <w:num w:numId="11">
+  <w:num w:numId="11" w16cid:durableId="465272223">
     <w:abstractNumId w:val="29"/>
   </w:num>
-  <w:num w:numId="12">
+  <w:num w:numId="12" w16cid:durableId="194730049">
     <w:abstractNumId w:val="21"/>
   </w:num>
-  <w:num w:numId="13">
+  <w:num w:numId="13" w16cid:durableId="1376464033">
     <w:abstractNumId w:val="17"/>
   </w:num>
-  <w:num w:numId="14">
+  <w:num w:numId="14" w16cid:durableId="1000155475">
     <w:abstractNumId w:val="20"/>
   </w:num>
-  <w:num w:numId="15">
+  <w:num w:numId="15" w16cid:durableId="1768649722">
     <w:abstractNumId w:val="12"/>
   </w:num>
-  <w:num w:numId="16">
+  <w:num w:numId="16" w16cid:durableId="51543658">
     <w:abstractNumId w:val="7"/>
   </w:num>
-  <w:num w:numId="17">
+  <w:num w:numId="17" w16cid:durableId="1101952471">
     <w:abstractNumId w:val="39"/>
   </w:num>
-  <w:num w:numId="18">
+  <w:num w:numId="18" w16cid:durableId="1933583253">
     <w:abstractNumId w:val="4"/>
   </w:num>
-  <w:num w:numId="19">
+  <w:num w:numId="19" w16cid:durableId="930311755">
     <w:abstractNumId w:val="9"/>
   </w:num>
-  <w:num w:numId="20">
+  <w:num w:numId="20" w16cid:durableId="232739894">
     <w:abstractNumId w:val="24"/>
   </w:num>
-  <w:num w:numId="21">
+  <w:num w:numId="21" w16cid:durableId="45959414">
     <w:abstractNumId w:val="5"/>
   </w:num>
-  <w:num w:numId="22">
+  <w:num w:numId="22" w16cid:durableId="1352877986">
     <w:abstractNumId w:val="32"/>
   </w:num>
-  <w:num w:numId="23">
+  <w:num w:numId="23" w16cid:durableId="1684700872">
     <w:abstractNumId w:val="3"/>
   </w:num>
-  <w:num w:numId="24">
+  <w:num w:numId="24" w16cid:durableId="183523925">
     <w:abstractNumId w:val="28"/>
   </w:num>
-  <w:num w:numId="25">
+  <w:num w:numId="25" w16cid:durableId="709767410">
     <w:abstractNumId w:val="10"/>
   </w:num>
-  <w:num w:numId="26">
+  <w:num w:numId="26" w16cid:durableId="698971827">
     <w:abstractNumId w:val="19"/>
     <w:lvlOverride w:ilvl="0">
       <w:startOverride w:val="1"/>
@@ -19676,16 +18424,16 @@
       <w:startOverride w:val="1"/>
     </w:lvlOverride>
   </w:num>
-  <w:num w:numId="27">
+  <w:num w:numId="27" w16cid:durableId="159127229">
     <w:abstractNumId w:val="37"/>
   </w:num>
-  <w:num w:numId="28">
+  <w:num w:numId="28" w16cid:durableId="661010479">
     <w:abstractNumId w:val="36"/>
   </w:num>
-  <w:num w:numId="29">
+  <w:num w:numId="29" w16cid:durableId="2120903362">
     <w:abstractNumId w:val="23"/>
   </w:num>
-  <w:num w:numId="30">
+  <w:num w:numId="30" w16cid:durableId="664817773">
     <w:abstractNumId w:val="6"/>
     <w:lvlOverride w:ilvl="0">
       <w:startOverride w:val="1"/>
@@ -19715,47 +18463,47 @@
       <w:startOverride w:val="1"/>
     </w:lvlOverride>
   </w:num>
-  <w:num w:numId="31">
+  <w:num w:numId="31" w16cid:durableId="1899319505">
     <w:abstractNumId w:val="35"/>
   </w:num>
-  <w:num w:numId="32">
+  <w:num w:numId="32" w16cid:durableId="1071776328">
     <w:abstractNumId w:val="26"/>
   </w:num>
-  <w:num w:numId="33">
+  <w:num w:numId="33" w16cid:durableId="1500654190">
     <w:abstractNumId w:val="27"/>
   </w:num>
-  <w:num w:numId="34">
+  <w:num w:numId="34" w16cid:durableId="1916426980">
     <w:abstractNumId w:val="15"/>
   </w:num>
-  <w:num w:numId="35">
+  <w:num w:numId="35" w16cid:durableId="462311626">
     <w:abstractNumId w:val="0"/>
   </w:num>
-  <w:num w:numId="36">
+  <w:num w:numId="36" w16cid:durableId="989288359">
     <w:abstractNumId w:val="1"/>
   </w:num>
-  <w:num w:numId="37">
+  <w:num w:numId="37" w16cid:durableId="335615989">
     <w:abstractNumId w:val="18"/>
   </w:num>
-  <w:num w:numId="38">
+  <w:num w:numId="38" w16cid:durableId="778140055">
     <w:abstractNumId w:val="16"/>
   </w:num>
-  <w:num w:numId="39">
+  <w:num w:numId="39" w16cid:durableId="572661512">
     <w:abstractNumId w:val="8"/>
   </w:num>
-  <w:num w:numId="40">
+  <w:num w:numId="40" w16cid:durableId="127433435">
     <w:abstractNumId w:val="38"/>
   </w:num>
-  <w:num w:numId="41">
+  <w:num w:numId="41" w16cid:durableId="1760562473">
     <w:abstractNumId w:val="40"/>
   </w:num>
-  <w:num w:numId="42">
+  <w:num w:numId="42" w16cid:durableId="973951205">
     <w:abstractNumId w:val="22"/>
   </w:num>
 </w:numbering>
 </file>
 
 <file path=word/people.xml><?xml version="1.0" encoding="utf-8"?>
-<w15:people xmlns:wpc="http://schemas.microsoft.com/office/word/2010/wordprocessingCanvas" xmlns:cx="http://schemas.microsoft.com/office/drawing/2014/chartex" xmlns:cx1="http://schemas.microsoft.com/office/drawing/2015/9/8/chartex" xmlns:cx2="http://schemas.microsoft.com/office/drawing/2015/10/21/chartex" xmlns:cx3="http://schemas.microsoft.com/office/drawing/2016/5/9/chartex" xmlns:cx4="http://schemas.microsoft.com/office/drawing/2016/5/10/chartex" xmlns:cx5="http://schemas.microsoft.com/office/drawing/2016/5/11/chartex" xmlns:cx6="http://schemas.microsoft.com/office/drawing/2016/5/12/chartex" xmlns:cx7="http://schemas.microsoft.com/office/drawing/2016/5/13/chartex" xmlns:cx8="http://schemas.microsoft.com/office/drawing/2016/5/14/chartex" xmlns:mc="http://schemas.openxmlformats.org/markup-compatibility/2006" xmlns:aink="http://schemas.microsoft.com/office/drawing/2016/ink" xmlns:am3d="http://schemas.microsoft.com/office/drawing/2017/model3d" xmlns:o="urn:schemas-microsoft-com:office:office" xmlns:r="http://schemas.openxmlformats.org/officeDocument/2006/relationships" xmlns:m="http://schemas.openxmlformats.org/officeDocument/2006/math" xmlns:v="urn:schemas-microsoft-com:vml" xmlns:wp14="http://schemas.microsoft.com/office/word/2010/wordprocessingDrawing" xmlns:wp="http://schemas.openxmlformats.org/drawingml/2006/wordprocessingDrawing" xmlns:w10="urn:schemas-microsoft-com:office:word" xmlns:w="http://schemas.openxmlformats.org/wordprocessingml/2006/main" xmlns:w14="http://schemas.microsoft.com/office/word/2010/wordml" xmlns:w15="http://schemas.microsoft.com/office/word/2012/wordml" xmlns:w16cex="http://schemas.microsoft.com/office/word/2018/wordml/cex" xmlns:w16cid="http://schemas.microsoft.com/office/word/2016/wordml/cid" xmlns:w16="http://schemas.microsoft.com/office/word/2018/wordml" xmlns:w16sdtdh="http://schemas.microsoft.com/office/word/2020/wordml/sdtdatahash" xmlns:w16se="http://schemas.microsoft.com/office/word/2015/wordml/symex" xmlns:wpg="http://schemas.microsoft.com/office/word/2010/wordprocessingGroup" xmlns:wpi="http://schemas.microsoft.com/office/word/2010/wordprocessingInk" xmlns:wne="http://schemas.microsoft.com/office/word/2006/wordml" xmlns:wps="http://schemas.microsoft.com/office/word/2010/wordprocessingShape" mc:Ignorable="w14 w15 w16se w16cid w16 w16cex w16sdtdh wp14">
+<w15:people xmlns:wpc="http://schemas.microsoft.com/office/word/2010/wordprocessingCanvas" xmlns:cx="http://schemas.microsoft.com/office/drawing/2014/chartex" xmlns:cx1="http://schemas.microsoft.com/office/drawing/2015/9/8/chartex" xmlns:cx2="http://schemas.microsoft.com/office/drawing/2015/10/21/chartex" xmlns:cx3="http://schemas.microsoft.com/office/drawing/2016/5/9/chartex" xmlns:cx4="http://schemas.microsoft.com/office/drawing/2016/5/10/chartex" xmlns:cx5="http://schemas.microsoft.com/office/drawing/2016/5/11/chartex" xmlns:cx6="http://schemas.microsoft.com/office/drawing/2016/5/12/chartex" xmlns:cx7="http://schemas.microsoft.com/office/drawing/2016/5/13/chartex" xmlns:cx8="http://schemas.microsoft.com/office/drawing/2016/5/14/chartex" xmlns:mc="http://schemas.openxmlformats.org/markup-compatibility/2006" xmlns:aink="http://schemas.microsoft.com/office/drawing/2016/ink" xmlns:am3d="http://schemas.microsoft.com/office/drawing/2017/model3d" xmlns:o="urn:schemas-microsoft-com:office:office" xmlns:oel="http://schemas.microsoft.com/office/2019/extlst" xmlns:r="http://schemas.openxmlformats.org/officeDocument/2006/relationships" xmlns:m="http://schemas.openxmlformats.org/officeDocument/2006/math" xmlns:v="urn:schemas-microsoft-com:vml" xmlns:wp14="http://schemas.microsoft.com/office/word/2010/wordprocessingDrawing" xmlns:wp="http://schemas.openxmlformats.org/drawingml/2006/wordprocessingDrawing" xmlns:w10="urn:schemas-microsoft-com:office:word" xmlns:w="http://schemas.openxmlformats.org/wordprocessingml/2006/main" xmlns:w14="http://schemas.microsoft.com/office/word/2010/wordml" xmlns:w15="http://schemas.microsoft.com/office/word/2012/wordml" xmlns:w16cex="http://schemas.microsoft.com/office/word/2018/wordml/cex" xmlns:w16cid="http://schemas.microsoft.com/office/word/2016/wordml/cid" xmlns:w16="http://schemas.microsoft.com/office/word/2018/wordml" xmlns:w16du="http://schemas.microsoft.com/office/word/2023/wordml/word16du" xmlns:w16sdtdh="http://schemas.microsoft.com/office/word/2020/wordml/sdtdatahash" xmlns:w16sdtfl="http://schemas.microsoft.com/office/word/2024/wordml/sdtformatlock" xmlns:w16se="http://schemas.microsoft.com/office/word/2015/wordml/symex" xmlns:wpg="http://schemas.microsoft.com/office/word/2010/wordprocessingGroup" xmlns:wpi="http://schemas.microsoft.com/office/word/2010/wordprocessingInk" xmlns:wne="http://schemas.microsoft.com/office/word/2006/wordml" xmlns:wps="http://schemas.microsoft.com/office/word/2010/wordprocessingShape" mc:Ignorable="w14 w15 w16se w16cid w16 w16cex w16sdtdh w16sdtfl w16du wp14">
   <w15:person w15:author="Aleksey A. Kalentev">
     <w15:presenceInfo w15:providerId="AD" w15:userId="S-1-5-21-507921405-1993962763-1957994488-151096"/>
   </w15:person>
@@ -19763,7 +18511,7 @@
 </file>
 
 <file path=word/styles.xml><?xml version="1.0" encoding="utf-8"?>
-<w:styles xmlns:mc="http://schemas.openxmlformats.org/markup-compatibility/2006" xmlns:r="http://schemas.openxmlformats.org/officeDocument/2006/relationships" xmlns:w="http://schemas.openxmlformats.org/wordprocessingml/2006/main" xmlns:w14="http://schemas.microsoft.com/office/word/2010/wordml" xmlns:w15="http://schemas.microsoft.com/office/word/2012/wordml" xmlns:w16cex="http://schemas.microsoft.com/office/word/2018/wordml/cex" xmlns:w16cid="http://schemas.microsoft.com/office/word/2016/wordml/cid" xmlns:w16="http://schemas.microsoft.com/office/word/2018/wordml" xmlns:w16sdtdh="http://schemas.microsoft.com/office/word/2020/wordml/sdtdatahash" xmlns:w16se="http://schemas.microsoft.com/office/word/2015/wordml/symex" mc:Ignorable="w14 w15 w16se w16cid w16 w16cex w16sdtdh">
+<w:styles xmlns:mc="http://schemas.openxmlformats.org/markup-compatibility/2006" xmlns:r="http://schemas.openxmlformats.org/officeDocument/2006/relationships" xmlns:w="http://schemas.openxmlformats.org/wordprocessingml/2006/main" xmlns:w14="http://schemas.microsoft.com/office/word/2010/wordml" xmlns:w15="http://schemas.microsoft.com/office/word/2012/wordml" xmlns:w16cex="http://schemas.microsoft.com/office/word/2018/wordml/cex" xmlns:w16cid="http://schemas.microsoft.com/office/word/2016/wordml/cid" xmlns:w16="http://schemas.microsoft.com/office/word/2018/wordml" xmlns:w16du="http://schemas.microsoft.com/office/word/2023/wordml/word16du" xmlns:w16sdtdh="http://schemas.microsoft.com/office/word/2020/wordml/sdtdatahash" xmlns:w16sdtfl="http://schemas.microsoft.com/office/word/2024/wordml/sdtformatlock" xmlns:w16se="http://schemas.microsoft.com/office/word/2015/wordml/symex" mc:Ignorable="w14 w15 w16se w16cid w16 w16cex w16sdtdh w16sdtfl w16du">
   <w:docDefaults>
     <w:rPrDefault>
       <w:rPr>

</xml_diff>

<commit_message>
replaced images for add form
</commit_message>
<xml_diff>
--- a/LR_5_Rustamov.docx
+++ b/LR_5_Rustamov.docx
@@ -2961,7 +2961,7 @@
       </w:pPr>
       <w:r>
         <w:drawing>
-          <wp:inline distT="0" distB="0" distL="0" distR="0" wp14:anchorId="7AD332B9" wp14:editId="1B2355D3">
+          <wp:inline distT="0" distB="0" distL="0" distR="0" wp14:anchorId="7AD332B9" wp14:editId="092E480C">
             <wp:extent cx="3543300" cy="5212248"/>
             <wp:effectExtent l="0" t="0" r="0" b="0"/>
             <wp:docPr id="1595171144" name="Рисунок 3"/>
@@ -7849,99 +7849,10 @@
       </w:pPr>
       <w:r>
         <w:drawing>
-          <wp:inline distT="0" distB="0" distL="0" distR="0" wp14:anchorId="0F162BFB" wp14:editId="6F3BEA7F">
-            <wp:extent cx="2766022" cy="1871133"/>
-            <wp:effectExtent l="0" t="0" r="0" b="0"/>
-            <wp:docPr id="2099945330" name="Рисунок 1"/>
-            <wp:cNvGraphicFramePr>
-              <a:graphicFrameLocks xmlns:a="http://schemas.openxmlformats.org/drawingml/2006/main" noChangeAspect="1"/>
-            </wp:cNvGraphicFramePr>
-            <a:graphic xmlns:a="http://schemas.openxmlformats.org/drawingml/2006/main">
-              <a:graphicData uri="http://schemas.openxmlformats.org/drawingml/2006/picture">
-                <pic:pic xmlns:pic="http://schemas.openxmlformats.org/drawingml/2006/picture">
-                  <pic:nvPicPr>
-                    <pic:cNvPr id="2099945330" name=""/>
-                    <pic:cNvPicPr/>
-                  </pic:nvPicPr>
-                  <pic:blipFill>
-                    <a:blip r:embed="rId13"/>
-                    <a:stretch>
-                      <a:fillRect/>
-                    </a:stretch>
-                  </pic:blipFill>
-                  <pic:spPr>
-                    <a:xfrm>
-                      <a:off x="0" y="0"/>
-                      <a:ext cx="2788582" cy="1886394"/>
-                    </a:xfrm>
-                    <a:prstGeom prst="rect">
-                      <a:avLst/>
-                    </a:prstGeom>
-                  </pic:spPr>
-                </pic:pic>
-              </a:graphicData>
-            </a:graphic>
-          </wp:inline>
-        </w:drawing>
-      </w:r>
-    </w:p>
-    <w:p>
-      <w:pPr>
-        <w:pStyle w:val="aff"/>
-        <w:spacing w:after="0"/>
-      </w:pPr>
-      <w:r>
-        <w:t>1 – Выбор типа фигуры; 2 – поле ввода исходных данных для выбранной фигуры</w:t>
-      </w:r>
-    </w:p>
-    <w:p>
-      <w:pPr>
-        <w:pStyle w:val="aff"/>
-      </w:pPr>
-      <w:r>
-        <w:t xml:space="preserve">Рисунок </w:t>
-      </w:r>
-      <w:bookmarkStart w:id="11" w:name="Рис_5_добавление_сферы"/>
-      <w:r>
-        <w:fldChar w:fldCharType="begin"/>
-      </w:r>
-      <w:r>
-        <w:instrText xml:space="preserve"> SEQ Рисунок \* ARABIC </w:instrText>
-      </w:r>
-      <w:r>
-        <w:fldChar w:fldCharType="separate"/>
-      </w:r>
-      <w:r>
-        <w:rPr>
-          <w:noProof/>
-        </w:rPr>
-        <w:t>5</w:t>
-      </w:r>
-      <w:r>
-        <w:rPr>
-          <w:noProof/>
-        </w:rPr>
-        <w:fldChar w:fldCharType="end"/>
-      </w:r>
-      <w:bookmarkEnd w:id="11"/>
-      <w:r>
-        <w:t xml:space="preserve"> – Добавление фигуры</w:t>
-      </w:r>
-      <w:r>
-        <w:t xml:space="preserve"> «Сфера»</w:t>
-      </w:r>
-    </w:p>
-    <w:p>
-      <w:pPr>
-        <w:pStyle w:val="af9"/>
-      </w:pPr>
-      <w:r>
-        <w:lastRenderedPageBreak/>
-        <w:drawing>
-          <wp:inline distT="0" distB="0" distL="0" distR="0" wp14:anchorId="19188639" wp14:editId="78E614A1">
-            <wp:extent cx="2813708" cy="1888066"/>
-            <wp:effectExtent l="0" t="0" r="5715" b="0"/>
-            <wp:docPr id="2131735048" name="Рисунок 2"/>
+          <wp:inline distT="0" distB="0" distL="0" distR="0" wp14:anchorId="612DB873" wp14:editId="6CFEE1EE">
+            <wp:extent cx="2453781" cy="1905000"/>
+            <wp:effectExtent l="0" t="0" r="3810" b="0"/>
+            <wp:docPr id="1267549960" name="Рисунок 1"/>
             <wp:cNvGraphicFramePr>
               <a:graphicFrameLocks xmlns:a="http://schemas.openxmlformats.org/drawingml/2006/main" noChangeAspect="1"/>
             </wp:cNvGraphicFramePr>
@@ -7955,7 +7866,7 @@
                     </pic:cNvPicPr>
                   </pic:nvPicPr>
                   <pic:blipFill>
-                    <a:blip r:embed="rId14">
+                    <a:blip r:embed="rId13" cstate="print">
                       <a:extLst>
                         <a:ext uri="{28A0092B-C50C-407E-A947-70E740481C1C}">
                           <a14:useLocalDpi xmlns:a14="http://schemas.microsoft.com/office/drawing/2010/main" val="0"/>
@@ -7970,7 +7881,7 @@
                   <pic:spPr bwMode="auto">
                     <a:xfrm>
                       <a:off x="0" y="0"/>
-                      <a:ext cx="2821315" cy="1893171"/>
+                      <a:ext cx="2469974" cy="1917571"/>
                     </a:xfrm>
                     <a:prstGeom prst="rect">
                       <a:avLst/>
@@ -7987,23 +7898,47 @@
     <w:p>
       <w:pPr>
         <w:pStyle w:val="aff"/>
+        <w:spacing w:after="0"/>
+      </w:pPr>
+      <w:r>
+        <w:t>1 – Выбор типа фигуры; 2 – поле ввода исходных данных для выбранной фигуры</w:t>
+      </w:r>
+    </w:p>
+    <w:p>
+      <w:pPr>
+        <w:pStyle w:val="aff"/>
       </w:pPr>
       <w:r>
         <w:t xml:space="preserve">Рисунок </w:t>
       </w:r>
-      <w:fldSimple w:instr=" SEQ Рисунок \* ARABIC ">
-        <w:r>
-          <w:rPr>
-            <w:noProof/>
-          </w:rPr>
-          <w:t>6</w:t>
-        </w:r>
-      </w:fldSimple>
+      <w:bookmarkStart w:id="11" w:name="Рис_5_добавление_сферы"/>
+      <w:r>
+        <w:fldChar w:fldCharType="begin"/>
+      </w:r>
+      <w:r>
+        <w:instrText xml:space="preserve"> SEQ Рисунок \* ARABIC </w:instrText>
+      </w:r>
+      <w:r>
+        <w:fldChar w:fldCharType="separate"/>
+      </w:r>
+      <w:r>
+        <w:rPr>
+          <w:noProof/>
+        </w:rPr>
+        <w:t>5</w:t>
+      </w:r>
+      <w:r>
+        <w:rPr>
+          <w:noProof/>
+        </w:rPr>
+        <w:fldChar w:fldCharType="end"/>
+      </w:r>
+      <w:bookmarkEnd w:id="11"/>
       <w:r>
         <w:t xml:space="preserve"> – Добавление фигуры</w:t>
       </w:r>
       <w:r>
-        <w:t xml:space="preserve"> «Пирамида»</w:t>
+        <w:t xml:space="preserve"> «Сфера»</w:t>
       </w:r>
     </w:p>
     <w:p>
@@ -8011,11 +7946,12 @@
         <w:pStyle w:val="af9"/>
       </w:pPr>
       <w:r>
+        <w:lastRenderedPageBreak/>
         <w:drawing>
-          <wp:inline distT="0" distB="0" distL="0" distR="0" wp14:anchorId="23377CAB" wp14:editId="173293FC">
-            <wp:extent cx="2810933" cy="1878047"/>
-            <wp:effectExtent l="0" t="0" r="8890" b="8255"/>
-            <wp:docPr id="1235610959" name="Рисунок 4"/>
+          <wp:inline distT="0" distB="0" distL="0" distR="0" wp14:anchorId="0A3C0585" wp14:editId="446EE2C8">
+            <wp:extent cx="2676751" cy="2082800"/>
+            <wp:effectExtent l="0" t="0" r="9525" b="0"/>
+            <wp:docPr id="1615817701" name="Рисунок 2"/>
             <wp:cNvGraphicFramePr>
               <a:graphicFrameLocks xmlns:a="http://schemas.openxmlformats.org/drawingml/2006/main" noChangeAspect="1"/>
             </wp:cNvGraphicFramePr>
@@ -8029,7 +7965,7 @@
                     </pic:cNvPicPr>
                   </pic:nvPicPr>
                   <pic:blipFill>
-                    <a:blip r:embed="rId15">
+                    <a:blip r:embed="rId14" cstate="print">
                       <a:extLst>
                         <a:ext uri="{28A0092B-C50C-407E-A947-70E740481C1C}">
                           <a14:useLocalDpi xmlns:a14="http://schemas.microsoft.com/office/drawing/2010/main" val="0"/>
@@ -8044,7 +7980,7 @@
                   <pic:spPr bwMode="auto">
                     <a:xfrm>
                       <a:off x="0" y="0"/>
-                      <a:ext cx="2823174" cy="1886226"/>
+                      <a:ext cx="2687238" cy="2090960"/>
                     </a:xfrm>
                     <a:prstGeom prst="rect">
                       <a:avLst/>
@@ -8057,6 +7993,33 @@
           </wp:inline>
         </w:drawing>
       </w:r>
+    </w:p>
+    <w:p>
+      <w:pPr>
+        <w:pStyle w:val="aff"/>
+      </w:pPr>
+      <w:r>
+        <w:t xml:space="preserve">Рисунок </w:t>
+      </w:r>
+      <w:fldSimple w:instr=" SEQ Рисунок \* ARABIC ">
+        <w:r>
+          <w:rPr>
+            <w:noProof/>
+          </w:rPr>
+          <w:t>6</w:t>
+        </w:r>
+      </w:fldSimple>
+      <w:r>
+        <w:t xml:space="preserve"> – Добавление фигуры</w:t>
+      </w:r>
+      <w:r>
+        <w:t xml:space="preserve"> «Пирамида»</w:t>
+      </w:r>
+    </w:p>
+    <w:p>
+      <w:pPr>
+        <w:pStyle w:val="af9"/>
+      </w:pPr>
     </w:p>
     <w:p>
       <w:pPr>
@@ -8198,7 +8161,7 @@
                     <pic:cNvPicPr/>
                   </pic:nvPicPr>
                   <pic:blipFill>
-                    <a:blip r:embed="rId16"/>
+                    <a:blip r:embed="rId15"/>
                     <a:stretch>
                       <a:fillRect/>
                     </a:stretch>
@@ -8274,15 +8237,7 @@
           <w:sz w:val="28"/>
           <w:szCs w:val="20"/>
         </w:rPr>
-        <w:t xml:space="preserve">Также была проверена обработка некорректного ввода при добавлении пирамиды. В отдельные поля были введены значения, не являющиеся </w:t>
-      </w:r>
-      <w:r>
-        <w:rPr>
-          <w:sz w:val="28"/>
-          <w:szCs w:val="20"/>
-        </w:rPr>
-        <w:lastRenderedPageBreak/>
-        <w:t xml:space="preserve">положительными конечными числами. В результате программа заблокировала создание фигуры, выделила ошибочно заполненные поля и вывела сообщение о необходимости ввести корректные значения длины, ширины и высоты. Данный результат представлен на рисунке </w:t>
+        <w:t xml:space="preserve">Также была проверена обработка некорректного ввода при добавлении пирамиды. В отдельные поля были введены значения, не являющиеся положительными конечными числами. В результате программа заблокировала создание фигуры, выделила ошибочно заполненные поля и вывела сообщение о необходимости ввести корректные значения длины, ширины и высоты. Данный результат представлен на рисунке </w:t>
       </w:r>
       <w:r>
         <w:rPr>
@@ -8346,6 +8301,7 @@
         <w:pStyle w:val="af9"/>
       </w:pPr>
       <w:r>
+        <w:lastRenderedPageBreak/>
         <w:drawing>
           <wp:inline distT="0" distB="0" distL="0" distR="0" wp14:anchorId="6C3E2AAB" wp14:editId="3DC2A096">
             <wp:extent cx="3609756" cy="3053751"/>
@@ -8362,7 +8318,7 @@
                     <pic:cNvPicPr/>
                   </pic:nvPicPr>
                   <pic:blipFill>
-                    <a:blip r:embed="rId17"/>
+                    <a:blip r:embed="rId16"/>
                     <a:stretch>
                       <a:fillRect/>
                     </a:stretch>
@@ -8515,7 +8471,7 @@
                     <pic:cNvPicPr/>
                   </pic:nvPicPr>
                   <pic:blipFill>
-                    <a:blip r:embed="rId18"/>
+                    <a:blip r:embed="rId17"/>
                     <a:stretch>
                       <a:fillRect/>
                     </a:stretch>
@@ -8588,15 +8544,7 @@
           <w:sz w:val="28"/>
           <w:szCs w:val="20"/>
         </w:rPr>
-        <w:t xml:space="preserve">После проверки ошибочных ситуаций было выполнено добавление фигур с корректными параметрами. В результате объекты были успешно </w:t>
-      </w:r>
-      <w:r>
-        <w:rPr>
-          <w:sz w:val="28"/>
-          <w:szCs w:val="20"/>
-        </w:rPr>
-        <w:lastRenderedPageBreak/>
-        <w:t xml:space="preserve">созданы и добавлены в таблицу главного окна программы. Для каждой фигуры в списке отображаются её тип, рассчитанный объём и текстовое описание с введёнными параметрами. Результат добавления фигур представлен на рисунке </w:t>
+        <w:t xml:space="preserve">После проверки ошибочных ситуаций было выполнено добавление фигур с корректными параметрами. В результате объекты были успешно созданы и добавлены в таблицу главного окна программы. Для каждой фигуры в списке отображаются её тип, рассчитанный объём и текстовое описание с введёнными параметрами. Результат добавления фигур представлен на рисунке </w:t>
       </w:r>
       <w:r>
         <w:rPr>
@@ -8660,6 +8608,7 @@
         <w:pStyle w:val="af9"/>
       </w:pPr>
       <w:r>
+        <w:lastRenderedPageBreak/>
         <w:drawing>
           <wp:inline distT="0" distB="0" distL="0" distR="0" wp14:anchorId="17A02602" wp14:editId="3826E2C1">
             <wp:extent cx="5940425" cy="1156970"/>
@@ -8676,7 +8625,7 @@
                     <pic:cNvPicPr/>
                   </pic:nvPicPr>
                   <pic:blipFill>
-                    <a:blip r:embed="rId19"/>
+                    <a:blip r:embed="rId18"/>
                     <a:stretch>
                       <a:fillRect/>
                     </a:stretch>
@@ -8815,7 +8764,7 @@
                     </pic:cNvPicPr>
                   </pic:nvPicPr>
                   <pic:blipFill>
-                    <a:blip r:embed="rId20">
+                    <a:blip r:embed="rId19">
                       <a:extLst>
                         <a:ext uri="{28A0092B-C50C-407E-A947-70E740481C1C}">
                           <a14:useLocalDpi xmlns:a14="http://schemas.microsoft.com/office/drawing/2010/main" val="0"/>
@@ -8924,7 +8873,7 @@
                     <pic:cNvPicPr/>
                   </pic:nvPicPr>
                   <pic:blipFill>
-                    <a:blip r:embed="rId21"/>
+                    <a:blip r:embed="rId20"/>
                     <a:stretch>
                       <a:fillRect/>
                     </a:stretch>
@@ -9064,7 +9013,7 @@
                     <pic:cNvPicPr/>
                   </pic:nvPicPr>
                   <pic:blipFill>
-                    <a:blip r:embed="rId22"/>
+                    <a:blip r:embed="rId21"/>
                     <a:stretch>
                       <a:fillRect/>
                     </a:stretch>
@@ -9179,7 +9128,7 @@
                     </pic:cNvPicPr>
                   </pic:nvPicPr>
                   <pic:blipFill>
-                    <a:blip r:embed="rId23">
+                    <a:blip r:embed="rId22">
                       <a:extLst>
                         <a:ext uri="{28A0092B-C50C-407E-A947-70E740481C1C}">
                           <a14:useLocalDpi xmlns:a14="http://schemas.microsoft.com/office/drawing/2010/main" val="0"/>
@@ -9335,7 +9284,7 @@
                     <pic:cNvPicPr/>
                   </pic:nvPicPr>
                   <pic:blipFill>
-                    <a:blip r:embed="rId24"/>
+                    <a:blip r:embed="rId23"/>
                     <a:stretch>
                       <a:fillRect/>
                     </a:stretch>
@@ -9474,7 +9423,7 @@
                     <pic:cNvPicPr/>
                   </pic:nvPicPr>
                   <pic:blipFill>
-                    <a:blip r:embed="rId25"/>
+                    <a:blip r:embed="rId24"/>
                     <a:stretch>
                       <a:fillRect/>
                     </a:stretch>
@@ -9583,7 +9532,7 @@
                     <pic:cNvPicPr/>
                   </pic:nvPicPr>
                   <pic:blipFill>
-                    <a:blip r:embed="rId26"/>
+                    <a:blip r:embed="rId25"/>
                     <a:stretch>
                       <a:fillRect/>
                     </a:stretch>
@@ -9710,7 +9659,7 @@
                     <pic:cNvPicPr/>
                   </pic:nvPicPr>
                   <pic:blipFill>
-                    <a:blip r:embed="rId27"/>
+                    <a:blip r:embed="rId26"/>
                     <a:stretch>
                       <a:fillRect/>
                     </a:stretch>
@@ -9907,7 +9856,7 @@
                     <pic:cNvPicPr/>
                   </pic:nvPicPr>
                   <pic:blipFill>
-                    <a:blip r:embed="rId28"/>
+                    <a:blip r:embed="rId27"/>
                     <a:stretch>
                       <a:fillRect/>
                     </a:stretch>
@@ -10015,7 +9964,7 @@
                     <pic:cNvPicPr/>
                   </pic:nvPicPr>
                   <pic:blipFill>
-                    <a:blip r:embed="rId29"/>
+                    <a:blip r:embed="rId28"/>
                     <a:stretch>
                       <a:fillRect/>
                     </a:stretch>
@@ -10039,9 +9988,6 @@
     <w:p>
       <w:pPr>
         <w:pStyle w:val="aff"/>
-        <w:rPr>
-          <w:lang w:val="en-US"/>
-        </w:rPr>
       </w:pPr>
       <w:r>
         <w:t xml:space="preserve">Рисунок </w:t>
@@ -10129,7 +10075,7 @@
                     <pic:cNvPicPr/>
                   </pic:nvPicPr>
                   <pic:blipFill>
-                    <a:blip r:embed="rId30"/>
+                    <a:blip r:embed="rId29"/>
                     <a:stretch>
                       <a:fillRect/>
                     </a:stretch>
@@ -10240,7 +10186,7 @@
                     <pic:cNvPicPr/>
                   </pic:nvPicPr>
                   <pic:blipFill>
-                    <a:blip r:embed="rId31"/>
+                    <a:blip r:embed="rId30"/>
                     <a:stretch>
                       <a:fillRect/>
                     </a:stretch>
@@ -13708,12 +13654,12 @@
           <w14:ligatures w14:val="none"/>
         </w:rPr>
         <w:sectPr>
-          <w:headerReference w:type="even" r:id="rId36"/>
-          <w:headerReference w:type="default" r:id="rId37"/>
-          <w:footerReference w:type="even" r:id="rId38"/>
-          <w:footerReference w:type="default" r:id="rId39"/>
-          <w:headerReference w:type="first" r:id="rId40"/>
-          <w:footerReference w:type="first" r:id="rId41"/>
+          <w:headerReference w:type="even" r:id="rId35"/>
+          <w:headerReference w:type="default" r:id="rId36"/>
+          <w:footerReference w:type="even" r:id="rId37"/>
+          <w:footerReference w:type="default" r:id="rId38"/>
+          <w:headerReference w:type="first" r:id="rId39"/>
+          <w:footerReference w:type="first" r:id="rId40"/>
           <w:pgSz w:w="11906" w:h="16838"/>
           <w:pgMar w:top="1134" w:right="850" w:bottom="1134" w:left="1701" w:header="708" w:footer="708" w:gutter="0"/>
           <w:cols w:space="708"/>
@@ -13794,7 +13740,7 @@
                     </pic:cNvPicPr>
                   </pic:nvPicPr>
                   <pic:blipFill>
-                    <a:blip r:embed="rId42">
+                    <a:blip r:embed="rId41">
                       <a:extLst>
                         <a:ext uri="{28A0092B-C50C-407E-A947-70E740481C1C}">
                           <a14:useLocalDpi xmlns:a14="http://schemas.microsoft.com/office/drawing/2010/main" val="0"/>

</xml_diff>

<commit_message>
fixed umd diagramms and added chapter of loadidn resorciuses programms
</commit_message>
<xml_diff>
--- a/LR_5_Rustamov.docx
+++ b/LR_5_Rustamov.docx
@@ -2961,7 +2961,7 @@
       </w:pPr>
       <w:r>
         <w:drawing>
-          <wp:inline distT="0" distB="0" distL="0" distR="0" wp14:anchorId="7AD332B9" wp14:editId="092E480C">
+          <wp:inline distT="0" distB="0" distL="0" distR="0" wp14:anchorId="7AD332B9" wp14:editId="387E31BA">
             <wp:extent cx="3543300" cy="5212248"/>
             <wp:effectExtent l="0" t="0" r="0" b="0"/>
             <wp:docPr id="1595171144" name="Рисунок 3"/>
@@ -3082,11 +3082,12 @@
         <w:pStyle w:val="af9"/>
       </w:pPr>
       <w:r>
+        <w:lastRenderedPageBreak/>
         <w:drawing>
-          <wp:inline distT="0" distB="0" distL="0" distR="0" wp14:anchorId="5AEDA3E1" wp14:editId="4844B60A">
-            <wp:extent cx="5401958" cy="5949950"/>
-            <wp:effectExtent l="0" t="0" r="8255" b="0"/>
-            <wp:docPr id="2003382831" name="Рисунок 1"/>
+          <wp:inline distT="0" distB="0" distL="0" distR="0" wp14:anchorId="3C1BBAE5" wp14:editId="2E87E7F1">
+            <wp:extent cx="5940425" cy="6541770"/>
+            <wp:effectExtent l="0" t="0" r="3175" b="0"/>
+            <wp:docPr id="1940938792" name="Рисунок 1"/>
             <wp:cNvGraphicFramePr>
               <a:graphicFrameLocks xmlns:a="http://schemas.openxmlformats.org/drawingml/2006/main" noChangeAspect="1"/>
             </wp:cNvGraphicFramePr>
@@ -3094,7 +3095,7 @@
               <a:graphicData uri="http://schemas.openxmlformats.org/drawingml/2006/picture">
                 <pic:pic xmlns:pic="http://schemas.openxmlformats.org/drawingml/2006/picture">
                   <pic:nvPicPr>
-                    <pic:cNvPr id="2003382831" name=""/>
+                    <pic:cNvPr id="1940938792" name=""/>
                     <pic:cNvPicPr/>
                   </pic:nvPicPr>
                   <pic:blipFill>
@@ -3106,7 +3107,7 @@
                   <pic:spPr>
                     <a:xfrm>
                       <a:off x="0" y="0"/>
-                      <a:ext cx="5413576" cy="5962747"/>
+                      <a:ext cx="5940425" cy="6541770"/>
                     </a:xfrm>
                     <a:prstGeom prst="rect">
                       <a:avLst/>
@@ -3159,7 +3160,6 @@
         <w:rPr>
           <w:lang w:val="en-US"/>
         </w:rPr>
-        <w:lastRenderedPageBreak/>
         <w:t xml:space="preserve">Описание </w:t>
       </w:r>
       <w:r>
@@ -3222,7 +3222,11 @@
     </w:p>
     <w:p>
       <w:r>
-        <w:t>В данном разделе приведено описание отношений типа «общее-частное», представленных на диаграмме классов. Такие отношения используются для отображения иерархии классов, при которой один класс задаёт общую структуру или общий контракт, а другие классы уточняют его поведение. В разработанной программе данная связь используется для описания иерархии объёмных фигур, а также для отображения наследования пользовательских форм от стандартного класса Form.</w:t>
+        <w:t xml:space="preserve">В данном разделе приведено описание отношений типа «общее-частное», представленных на диаграмме классов. Такие отношения используются для отображения иерархии классов, при которой один класс задаёт общую структуру или общий контракт, а другие классы уточняют его поведение. В разработанной программе данная связь используется для </w:t>
+      </w:r>
+      <w:r>
+        <w:lastRenderedPageBreak/>
+        <w:t>описания иерархии объёмных фигур, а также для отображения наследования пользовательских форм от стандартного класса Form.</w:t>
       </w:r>
     </w:p>
     <w:p>
@@ -4269,7 +4273,6 @@
                 <w:szCs w:val="22"/>
                 <w:lang w:val="en-US"/>
               </w:rPr>
-              <w:lastRenderedPageBreak/>
               <w:t xml:space="preserve">#ValidatePositive(double value, string parameterName) </w:t>
             </w:r>
           </w:p>
@@ -4418,6 +4421,7 @@
           <w:sz w:val="28"/>
           <w:szCs w:val="22"/>
         </w:rPr>
+        <w:lastRenderedPageBreak/>
         <w:t xml:space="preserve">Таблица </w:t>
       </w:r>
       <w:r>
@@ -5566,7 +5570,6 @@
                 <w:szCs w:val="22"/>
                 <w:lang w:val="en-US"/>
               </w:rPr>
-              <w:lastRenderedPageBreak/>
               <w:t>-</w:t>
             </w:r>
             <w:r>
@@ -6024,6 +6027,7 @@
                 <w:szCs w:val="22"/>
                 <w:lang w:val="en-US"/>
               </w:rPr>
+              <w:lastRenderedPageBreak/>
               <w:t>+Volume</w:t>
             </w:r>
           </w:p>
@@ -7167,7 +7171,6 @@
                 <w:szCs w:val="22"/>
                 <w:lang w:val="en-US"/>
               </w:rPr>
-              <w:lastRenderedPageBreak/>
               <w:t>+Parallelepiped(double length, double width, double height)</w:t>
             </w:r>
           </w:p>
@@ -7303,6 +7306,7 @@
         <w:rPr>
           <w:lang w:val="en-US"/>
         </w:rPr>
+        <w:lastRenderedPageBreak/>
         <w:t xml:space="preserve">Дерево ветвлений </w:t>
       </w:r>
       <w:r>
@@ -7475,18 +7479,18 @@
         <w:rPr>
           <w:lang w:val="en-US"/>
         </w:rPr>
+        <w:t>Функциональное тестирование разработанной программы</w:t>
+      </w:r>
+      <w:bookmarkEnd w:id="7"/>
+    </w:p>
+    <w:p>
+      <w:r>
+        <w:t>Разработанная программа предназначена для работы с объёмными геометрическими фигурами. Пользователь может добавлять фигуры различных типов, просматривать их в общем списке, удалять выбранные элементы, выполнять поиск по заданным критериям, а также сохранять и загружать данные из файла.</w:t>
+      </w:r>
+    </w:p>
+    <w:p>
+      <w:r>
         <w:lastRenderedPageBreak/>
-        <w:t>Функциональное тестирование разработанной программы</w:t>
-      </w:r>
-      <w:bookmarkEnd w:id="7"/>
-    </w:p>
-    <w:p>
-      <w:r>
-        <w:t>Разработанная программа предназначена для работы с объёмными геометрическими фигурами. Пользователь может добавлять фигуры различных типов, просматривать их в общем списке, удалять выбранные элементы, выполнять поиск по заданным критериям, а также сохранять и загружать данные из файла.</w:t>
-      </w:r>
-    </w:p>
-    <w:p>
-      <w:r>
         <w:t xml:space="preserve">Особенностью программы является автоматический расчёт объёма фигуры на основе введённых пользователем параметров. Для каждой фигуры отображается её тип, рассчитанный объём и текстовое описание. В программе предусмотрена проверка корректности вводимых данных: параметры фигуры должны быть положительными конечными числами. При ошибочном вводе пользователю выводится соответствующее сообщение. </w:t>
       </w:r>
       <w:r>
@@ -7692,7 +7696,6 @@
     </w:p>
     <w:p>
       <w:r>
-        <w:lastRenderedPageBreak/>
         <w:t>У программы есть несколько основных функциональных способностей:</w:t>
       </w:r>
     </w:p>
@@ -7717,7 +7720,11 @@
         </w:numPr>
       </w:pPr>
       <w:r>
-        <w:t>Область «Список фигур» является основной рабочей областью окна. В таблице отображаются добавленные фигуры. Для каждой фигуры выводятся её тип, рассчитанный объём и текстовое описание с параметрами.</w:t>
+        <w:t xml:space="preserve">Область «Список фигур» является основной рабочей областью окна. В таблице отображаются добавленные фигуры. Для каждой фигуры </w:t>
+      </w:r>
+      <w:r>
+        <w:lastRenderedPageBreak/>
+        <w:t>выводятся её тип, рассчитанный объём и текстовое описание с параметрами.</w:t>
       </w:r>
     </w:p>
     <w:p>
@@ -7935,7 +7942,20 @@
       </w:r>
       <w:bookmarkEnd w:id="11"/>
       <w:r>
-        <w:t xml:space="preserve"> – Добавление фигуры</w:t>
+        <w:t xml:space="preserve"> – Добавление </w:t>
+      </w:r>
+      <w:commentRangeStart w:id="12"/>
+      <w:r>
+        <w:t>фигуры</w:t>
+      </w:r>
+      <w:commentRangeEnd w:id="12"/>
+      <w:r>
+        <w:rPr>
+          <w:rStyle w:val="af2"/>
+          <w:sz w:val="24"/>
+          <w:szCs w:val="18"/>
+        </w:rPr>
+        <w:commentReference w:id="12"/>
       </w:r>
       <w:r>
         <w:t xml:space="preserve"> «Сфера»</w:t>
@@ -7948,7 +7968,7 @@
       <w:r>
         <w:lastRenderedPageBreak/>
         <w:drawing>
-          <wp:inline distT="0" distB="0" distL="0" distR="0" wp14:anchorId="0A3C0585" wp14:editId="446EE2C8">
+          <wp:inline distT="0" distB="0" distL="0" distR="0" wp14:anchorId="0A3C0585" wp14:editId="75B8400D">
             <wp:extent cx="2676751" cy="2082800"/>
             <wp:effectExtent l="0" t="0" r="9525" b="0"/>
             <wp:docPr id="1615817701" name="Рисунок 2"/>
@@ -7965,7 +7985,7 @@
                     </pic:cNvPicPr>
                   </pic:nvPicPr>
                   <pic:blipFill>
-                    <a:blip r:embed="rId14" cstate="print">
+                    <a:blip r:embed="rId18" cstate="print">
                       <a:extLst>
                         <a:ext uri="{28A0092B-C50C-407E-A947-70E740481C1C}">
                           <a14:useLocalDpi xmlns:a14="http://schemas.microsoft.com/office/drawing/2010/main" val="0"/>
@@ -8013,13 +8033,66 @@
         <w:t xml:space="preserve"> – Добавление фигуры</w:t>
       </w:r>
       <w:r>
-        <w:t xml:space="preserve"> «Пирамида»</w:t>
+        <w:t xml:space="preserve"> «</w:t>
+      </w:r>
+      <w:commentRangeStart w:id="13"/>
+      <w:r>
+        <w:t>Пирамида</w:t>
+      </w:r>
+      <w:commentRangeEnd w:id="13"/>
+      <w:r>
+        <w:rPr>
+          <w:rStyle w:val="af2"/>
+          <w:sz w:val="24"/>
+          <w:szCs w:val="18"/>
+        </w:rPr>
+        <w:commentReference w:id="13"/>
+      </w:r>
+      <w:r>
+        <w:t>»</w:t>
       </w:r>
     </w:p>
     <w:p>
       <w:pPr>
         <w:pStyle w:val="af9"/>
       </w:pPr>
+      <w:r>
+        <w:drawing>
+          <wp:inline distT="0" distB="0" distL="0" distR="0" wp14:anchorId="1C63A262" wp14:editId="117AA785">
+            <wp:extent cx="2658533" cy="2051222"/>
+            <wp:effectExtent l="0" t="0" r="8890" b="6350"/>
+            <wp:docPr id="1261348934" name="Рисунок 1"/>
+            <wp:cNvGraphicFramePr>
+              <a:graphicFrameLocks xmlns:a="http://schemas.openxmlformats.org/drawingml/2006/main" noChangeAspect="1"/>
+            </wp:cNvGraphicFramePr>
+            <a:graphic xmlns:a="http://schemas.openxmlformats.org/drawingml/2006/main">
+              <a:graphicData uri="http://schemas.openxmlformats.org/drawingml/2006/picture">
+                <pic:pic xmlns:pic="http://schemas.openxmlformats.org/drawingml/2006/picture">
+                  <pic:nvPicPr>
+                    <pic:cNvPr id="1261348934" name=""/>
+                    <pic:cNvPicPr/>
+                  </pic:nvPicPr>
+                  <pic:blipFill>
+                    <a:blip r:embed="rId19"/>
+                    <a:stretch>
+                      <a:fillRect/>
+                    </a:stretch>
+                  </pic:blipFill>
+                  <pic:spPr>
+                    <a:xfrm>
+                      <a:off x="0" y="0"/>
+                      <a:ext cx="2670654" cy="2060574"/>
+                    </a:xfrm>
+                    <a:prstGeom prst="rect">
+                      <a:avLst/>
+                    </a:prstGeom>
+                  </pic:spPr>
+                </pic:pic>
+              </a:graphicData>
+            </a:graphic>
+          </wp:inline>
+        </w:drawing>
+      </w:r>
     </w:p>
     <w:p>
       <w:pPr>
@@ -8032,7 +8105,7 @@
       <w:r>
         <w:t xml:space="preserve">Рисунок </w:t>
       </w:r>
-      <w:bookmarkStart w:id="12" w:name="Рис_7_добавление_параллелепипеда"/>
+      <w:bookmarkStart w:id="14" w:name="Рис_7_добавление_параллелепипеда"/>
       <w:r>
         <w:fldChar w:fldCharType="begin"/>
       </w:r>
@@ -8054,9 +8127,22 @@
         </w:rPr>
         <w:fldChar w:fldCharType="end"/>
       </w:r>
-      <w:bookmarkEnd w:id="12"/>
-      <w:r>
-        <w:t xml:space="preserve"> – Добавление фигуры</w:t>
+      <w:bookmarkEnd w:id="14"/>
+      <w:r>
+        <w:t xml:space="preserve"> – Добавление </w:t>
+      </w:r>
+      <w:commentRangeStart w:id="15"/>
+      <w:r>
+        <w:t>фигуры</w:t>
+      </w:r>
+      <w:commentRangeEnd w:id="15"/>
+      <w:r>
+        <w:rPr>
+          <w:rStyle w:val="af2"/>
+          <w:sz w:val="24"/>
+          <w:szCs w:val="18"/>
+        </w:rPr>
+        <w:commentReference w:id="15"/>
       </w:r>
       <w:r>
         <w:t xml:space="preserve"> «Параллелепипед»</w:t>
@@ -8161,7 +8247,7 @@
                     <pic:cNvPicPr/>
                   </pic:nvPicPr>
                   <pic:blipFill>
-                    <a:blip r:embed="rId15"/>
+                    <a:blip r:embed="rId20"/>
                     <a:stretch>
                       <a:fillRect/>
                     </a:stretch>
@@ -8189,7 +8275,7 @@
       <w:r>
         <w:t xml:space="preserve">Рисунок </w:t>
       </w:r>
-      <w:bookmarkStart w:id="13" w:name="Рис_8_ошибка_сфера"/>
+      <w:bookmarkStart w:id="16" w:name="Рис_8_ошибка_сфера"/>
       <w:r>
         <w:fldChar w:fldCharType="begin"/>
       </w:r>
@@ -8214,7 +8300,7 @@
       <w:r>
         <w:t xml:space="preserve"> </w:t>
       </w:r>
-      <w:bookmarkEnd w:id="13"/>
+      <w:bookmarkEnd w:id="16"/>
       <w:r>
         <w:t>– Ошибка при добавлении</w:t>
       </w:r>
@@ -8237,6 +8323,7 @@
           <w:sz w:val="28"/>
           <w:szCs w:val="20"/>
         </w:rPr>
+        <w:lastRenderedPageBreak/>
         <w:t xml:space="preserve">Также была проверена обработка некорректного ввода при добавлении пирамиды. В отдельные поля были введены значения, не являющиеся положительными конечными числами. В результате программа заблокировала создание фигуры, выделила ошибочно заполненные поля и вывела сообщение о необходимости ввести корректные значения длины, ширины и высоты. Данный результат представлен на рисунке </w:t>
       </w:r>
       <w:r>
@@ -8301,7 +8388,6 @@
         <w:pStyle w:val="af9"/>
       </w:pPr>
       <w:r>
-        <w:lastRenderedPageBreak/>
         <w:drawing>
           <wp:inline distT="0" distB="0" distL="0" distR="0" wp14:anchorId="6C3E2AAB" wp14:editId="3DC2A096">
             <wp:extent cx="3609756" cy="3053751"/>
@@ -8318,7 +8404,7 @@
                     <pic:cNvPicPr/>
                   </pic:nvPicPr>
                   <pic:blipFill>
-                    <a:blip r:embed="rId16"/>
+                    <a:blip r:embed="rId21"/>
                     <a:stretch>
                       <a:fillRect/>
                     </a:stretch>
@@ -8346,7 +8432,7 @@
       <w:r>
         <w:t xml:space="preserve">Рисунок </w:t>
       </w:r>
-      <w:bookmarkStart w:id="14" w:name="Рис_9_ошибка_пирамида"/>
+      <w:bookmarkStart w:id="17" w:name="Рис_9_ошибка_пирамида"/>
       <w:r>
         <w:fldChar w:fldCharType="begin"/>
       </w:r>
@@ -8368,7 +8454,7 @@
         </w:rPr>
         <w:fldChar w:fldCharType="end"/>
       </w:r>
-      <w:bookmarkEnd w:id="14"/>
+      <w:bookmarkEnd w:id="17"/>
       <w:r>
         <w:t xml:space="preserve"> – Ошибка при добавлении</w:t>
       </w:r>
@@ -8471,7 +8557,7 @@
                     <pic:cNvPicPr/>
                   </pic:nvPicPr>
                   <pic:blipFill>
-                    <a:blip r:embed="rId17"/>
+                    <a:blip r:embed="rId22"/>
                     <a:stretch>
                       <a:fillRect/>
                     </a:stretch>
@@ -8499,7 +8585,7 @@
       <w:r>
         <w:t xml:space="preserve">Рисунок </w:t>
       </w:r>
-      <w:bookmarkStart w:id="15" w:name="Рис_10_ошибка_параллелепипеда"/>
+      <w:bookmarkStart w:id="18" w:name="Рис_10_ошибка_параллелепипеда"/>
       <w:r>
         <w:fldChar w:fldCharType="begin"/>
       </w:r>
@@ -8521,7 +8607,7 @@
         </w:rPr>
         <w:fldChar w:fldCharType="end"/>
       </w:r>
-      <w:bookmarkEnd w:id="15"/>
+      <w:bookmarkEnd w:id="18"/>
       <w:r>
         <w:t xml:space="preserve"> – Ошибка при добавлении</w:t>
       </w:r>
@@ -8544,6 +8630,7 @@
           <w:sz w:val="28"/>
           <w:szCs w:val="20"/>
         </w:rPr>
+        <w:lastRenderedPageBreak/>
         <w:t xml:space="preserve">После проверки ошибочных ситуаций было выполнено добавление фигур с корректными параметрами. В результате объекты были успешно созданы и добавлены в таблицу главного окна программы. Для каждой фигуры в списке отображаются её тип, рассчитанный объём и текстовое описание с введёнными параметрами. Результат добавления фигур представлен на рисунке </w:t>
       </w:r>
       <w:r>
@@ -8608,7 +8695,6 @@
         <w:pStyle w:val="af9"/>
       </w:pPr>
       <w:r>
-        <w:lastRenderedPageBreak/>
         <w:drawing>
           <wp:inline distT="0" distB="0" distL="0" distR="0" wp14:anchorId="17A02602" wp14:editId="3826E2C1">
             <wp:extent cx="5940425" cy="1156970"/>
@@ -8625,7 +8711,7 @@
                     <pic:cNvPicPr/>
                   </pic:nvPicPr>
                   <pic:blipFill>
-                    <a:blip r:embed="rId18"/>
+                    <a:blip r:embed="rId23"/>
                     <a:stretch>
                       <a:fillRect/>
                     </a:stretch>
@@ -8653,7 +8739,7 @@
       <w:r>
         <w:t xml:space="preserve">Рисунок </w:t>
       </w:r>
-      <w:bookmarkStart w:id="16" w:name="Рис_11_результат_добавления_фигур"/>
+      <w:bookmarkStart w:id="19" w:name="Рис_11_результат_добавления_фигур"/>
       <w:r>
         <w:fldChar w:fldCharType="begin"/>
       </w:r>
@@ -8675,7 +8761,7 @@
         </w:rPr>
         <w:fldChar w:fldCharType="end"/>
       </w:r>
-      <w:bookmarkEnd w:id="16"/>
+      <w:bookmarkEnd w:id="19"/>
       <w:r>
         <w:t xml:space="preserve"> – Результат добавления фигур</w:t>
       </w:r>
@@ -8706,11 +8792,11 @@
           <w:numId w:val="27"/>
         </w:numPr>
       </w:pPr>
-      <w:bookmarkStart w:id="17" w:name="_Toc232211100"/>
+      <w:bookmarkStart w:id="20" w:name="_Toc232211100"/>
       <w:r>
         <w:t>Тестовый случай сохранения фигур</w:t>
       </w:r>
-      <w:bookmarkEnd w:id="17"/>
+      <w:bookmarkEnd w:id="20"/>
     </w:p>
     <w:p>
       <w:r>
@@ -8764,7 +8850,7 @@
                     </pic:cNvPicPr>
                   </pic:nvPicPr>
                   <pic:blipFill>
-                    <a:blip r:embed="rId19">
+                    <a:blip r:embed="rId24">
                       <a:extLst>
                         <a:ext uri="{28A0092B-C50C-407E-A947-70E740481C1C}">
                           <a14:useLocalDpi xmlns:a14="http://schemas.microsoft.com/office/drawing/2010/main" val="0"/>
@@ -8800,7 +8886,7 @@
       <w:r>
         <w:t xml:space="preserve">Рисунок </w:t>
       </w:r>
-      <w:bookmarkStart w:id="18" w:name="Рис_12_выпадающий_список_действий"/>
+      <w:bookmarkStart w:id="21" w:name="Рис_12_выпадающий_список_действий"/>
       <w:r>
         <w:fldChar w:fldCharType="begin"/>
       </w:r>
@@ -8825,7 +8911,7 @@
       <w:r>
         <w:t xml:space="preserve"> </w:t>
       </w:r>
-      <w:bookmarkEnd w:id="18"/>
+      <w:bookmarkEnd w:id="21"/>
       <w:r>
         <w:t xml:space="preserve">– </w:t>
       </w:r>
@@ -8873,7 +8959,7 @@
                     <pic:cNvPicPr/>
                   </pic:nvPicPr>
                   <pic:blipFill>
-                    <a:blip r:embed="rId20"/>
+                    <a:blip r:embed="rId25"/>
                     <a:stretch>
                       <a:fillRect/>
                     </a:stretch>
@@ -8901,7 +8987,7 @@
       <w:r>
         <w:t xml:space="preserve">Рисунок </w:t>
       </w:r>
-      <w:bookmarkStart w:id="19" w:name="Рис_13_окно_сохранения_фигур"/>
+      <w:bookmarkStart w:id="22" w:name="Рис_13_окно_сохранения_фигур"/>
       <w:r>
         <w:fldChar w:fldCharType="begin"/>
       </w:r>
@@ -8923,7 +9009,7 @@
         </w:rPr>
         <w:fldChar w:fldCharType="end"/>
       </w:r>
-      <w:bookmarkEnd w:id="19"/>
+      <w:bookmarkEnd w:id="22"/>
       <w:r>
         <w:t xml:space="preserve"> – </w:t>
       </w:r>
@@ -9013,7 +9099,7 @@
                     <pic:cNvPicPr/>
                   </pic:nvPicPr>
                   <pic:blipFill>
-                    <a:blip r:embed="rId21"/>
+                    <a:blip r:embed="rId26"/>
                     <a:stretch>
                       <a:fillRect/>
                     </a:stretch>
@@ -9041,7 +9127,7 @@
       <w:r>
         <w:t xml:space="preserve">Рисунок </w:t>
       </w:r>
-      <w:bookmarkStart w:id="20" w:name="Рис_14_результат_сохранения_фигур"/>
+      <w:bookmarkStart w:id="23" w:name="Рис_14_результат_сохранения_фигур"/>
       <w:r>
         <w:fldChar w:fldCharType="begin"/>
       </w:r>
@@ -9063,7 +9149,7 @@
         </w:rPr>
         <w:fldChar w:fldCharType="end"/>
       </w:r>
-      <w:bookmarkEnd w:id="20"/>
+      <w:bookmarkEnd w:id="23"/>
       <w:r>
         <w:t xml:space="preserve"> – </w:t>
       </w:r>
@@ -9128,7 +9214,7 @@
                     </pic:cNvPicPr>
                   </pic:nvPicPr>
                   <pic:blipFill>
-                    <a:blip r:embed="rId22">
+                    <a:blip r:embed="rId27">
                       <a:extLst>
                         <a:ext uri="{28A0092B-C50C-407E-A947-70E740481C1C}">
                           <a14:useLocalDpi xmlns:a14="http://schemas.microsoft.com/office/drawing/2010/main" val="0"/>
@@ -9164,7 +9250,7 @@
       <w:r>
         <w:t xml:space="preserve">Рисунок </w:t>
       </w:r>
-      <w:bookmarkStart w:id="21" w:name="Рис_15_результат_сохранения_файла"/>
+      <w:bookmarkStart w:id="24" w:name="Рис_15_результат_сохранения_файла"/>
       <w:r>
         <w:fldChar w:fldCharType="begin"/>
       </w:r>
@@ -9186,7 +9272,7 @@
       <w:r>
         <w:t xml:space="preserve"> </w:t>
       </w:r>
-      <w:bookmarkEnd w:id="21"/>
+      <w:bookmarkEnd w:id="24"/>
       <w:r>
         <w:t>–</w:t>
       </w:r>
@@ -9214,11 +9300,11 @@
           <w:numId w:val="27"/>
         </w:numPr>
       </w:pPr>
-      <w:bookmarkStart w:id="22" w:name="_Toc232211101"/>
+      <w:bookmarkStart w:id="25" w:name="_Toc232211101"/>
       <w:r>
         <w:t>Тестовый случай загрузки фигур</w:t>
       </w:r>
-      <w:bookmarkEnd w:id="22"/>
+      <w:bookmarkEnd w:id="25"/>
     </w:p>
     <w:p>
       <w:r>
@@ -9284,7 +9370,7 @@
                     <pic:cNvPicPr/>
                   </pic:nvPicPr>
                   <pic:blipFill>
-                    <a:blip r:embed="rId23"/>
+                    <a:blip r:embed="rId28"/>
                     <a:stretch>
                       <a:fillRect/>
                     </a:stretch>
@@ -9312,7 +9398,7 @@
       <w:r>
         <w:t xml:space="preserve">Рисунок </w:t>
       </w:r>
-      <w:bookmarkStart w:id="23" w:name="Рис_18_результат_загрузки_фигур"/>
+      <w:bookmarkStart w:id="26" w:name="Рис_18_результат_загрузки_фигур"/>
       <w:r>
         <w:fldChar w:fldCharType="begin"/>
       </w:r>
@@ -9326,7 +9412,7 @@
         <w:rPr>
           <w:noProof/>
         </w:rPr>
-        <w:t>18</w:t>
+        <w:t>16</w:t>
       </w:r>
       <w:r>
         <w:rPr>
@@ -9334,7 +9420,7 @@
         </w:rPr>
         <w:fldChar w:fldCharType="end"/>
       </w:r>
-      <w:bookmarkEnd w:id="23"/>
+      <w:bookmarkEnd w:id="26"/>
       <w:r>
         <w:t xml:space="preserve"> – Результат загрузки </w:t>
       </w:r>
@@ -9355,7 +9441,7 @@
           <w:numId w:val="27"/>
         </w:numPr>
       </w:pPr>
-      <w:bookmarkStart w:id="24" w:name="_Toc232211102"/>
+      <w:bookmarkStart w:id="27" w:name="_Toc232211102"/>
       <w:r>
         <w:t xml:space="preserve">Тестовый случай </w:t>
       </w:r>
@@ -9365,7 +9451,7 @@
       <w:r>
         <w:t xml:space="preserve"> фигур</w:t>
       </w:r>
-      <w:bookmarkEnd w:id="24"/>
+      <w:bookmarkEnd w:id="27"/>
     </w:p>
     <w:p>
       <w:r>
@@ -9423,7 +9509,7 @@
                     <pic:cNvPicPr/>
                   </pic:nvPicPr>
                   <pic:blipFill>
-                    <a:blip r:embed="rId24"/>
+                    <a:blip r:embed="rId29"/>
                     <a:stretch>
                       <a:fillRect/>
                     </a:stretch>
@@ -9451,7 +9537,7 @@
       <w:r>
         <w:t xml:space="preserve">Рисунок </w:t>
       </w:r>
-      <w:bookmarkStart w:id="25" w:name="Рис_16_выбор_фигур_для_удаленя"/>
+      <w:bookmarkStart w:id="28" w:name="Рис_16_выбор_фигур_для_удаленя"/>
       <w:r>
         <w:fldChar w:fldCharType="begin"/>
       </w:r>
@@ -9465,7 +9551,7 @@
         <w:rPr>
           <w:noProof/>
         </w:rPr>
-        <w:t>16</w:t>
+        <w:t>17</w:t>
       </w:r>
       <w:r>
         <w:rPr>
@@ -9473,7 +9559,7 @@
         </w:rPr>
         <w:fldChar w:fldCharType="end"/>
       </w:r>
-      <w:bookmarkEnd w:id="25"/>
+      <w:bookmarkEnd w:id="28"/>
       <w:r>
         <w:t xml:space="preserve"> – </w:t>
       </w:r>
@@ -9532,7 +9618,7 @@
                     <pic:cNvPicPr/>
                   </pic:nvPicPr>
                   <pic:blipFill>
-                    <a:blip r:embed="rId25"/>
+                    <a:blip r:embed="rId30"/>
                     <a:stretch>
                       <a:fillRect/>
                     </a:stretch>
@@ -9560,7 +9646,7 @@
       <w:r>
         <w:t xml:space="preserve">Рисунок </w:t>
       </w:r>
-      <w:bookmarkStart w:id="26" w:name="Рис_17_результат_удаления_фигур"/>
+      <w:bookmarkStart w:id="29" w:name="Рис_17_результат_удаления_фигур"/>
       <w:r>
         <w:fldChar w:fldCharType="begin"/>
       </w:r>
@@ -9574,7 +9660,7 @@
         <w:rPr>
           <w:noProof/>
         </w:rPr>
-        <w:t>17</w:t>
+        <w:t>18</w:t>
       </w:r>
       <w:r>
         <w:rPr>
@@ -9585,7 +9671,7 @@
       <w:r>
         <w:t xml:space="preserve"> </w:t>
       </w:r>
-      <w:bookmarkEnd w:id="26"/>
+      <w:bookmarkEnd w:id="29"/>
       <w:r>
         <w:t>– Результат удаления фигур</w:t>
       </w:r>
@@ -9603,11 +9689,11 @@
           <w:numId w:val="27"/>
         </w:numPr>
       </w:pPr>
-      <w:bookmarkStart w:id="27" w:name="_Toc232211103"/>
+      <w:bookmarkStart w:id="30" w:name="_Toc232211103"/>
       <w:r>
         <w:t>Тестовый случай поиска фигур</w:t>
       </w:r>
-      <w:bookmarkEnd w:id="27"/>
+      <w:bookmarkEnd w:id="30"/>
     </w:p>
     <w:p>
       <w:r>
@@ -9659,7 +9745,7 @@
                     <pic:cNvPicPr/>
                   </pic:nvPicPr>
                   <pic:blipFill>
-                    <a:blip r:embed="rId26"/>
+                    <a:blip r:embed="rId31"/>
                     <a:stretch>
                       <a:fillRect/>
                     </a:stretch>
@@ -9687,7 +9773,7 @@
       <w:r>
         <w:t xml:space="preserve">Рисунок </w:t>
       </w:r>
-      <w:bookmarkStart w:id="28" w:name="Рис_19_главное_окно_поиска_фигур"/>
+      <w:bookmarkStart w:id="31" w:name="Рис_19_главное_окно_поиска_фигур"/>
       <w:r>
         <w:fldChar w:fldCharType="begin"/>
       </w:r>
@@ -9709,7 +9795,7 @@
         </w:rPr>
         <w:fldChar w:fldCharType="end"/>
       </w:r>
-      <w:bookmarkEnd w:id="28"/>
+      <w:bookmarkEnd w:id="31"/>
       <w:r>
         <w:t xml:space="preserve"> – Главное окно поиска фигур</w:t>
       </w:r>
@@ -9856,7 +9942,7 @@
                     <pic:cNvPicPr/>
                   </pic:nvPicPr>
                   <pic:blipFill>
-                    <a:blip r:embed="rId27"/>
+                    <a:blip r:embed="rId32"/>
                     <a:stretch>
                       <a:fillRect/>
                     </a:stretch>
@@ -9884,7 +9970,7 @@
       <w:r>
         <w:t xml:space="preserve">Рисунок </w:t>
       </w:r>
-      <w:bookmarkStart w:id="29" w:name="Рис_20_Результат_поиска_всех_фигур"/>
+      <w:bookmarkStart w:id="32" w:name="Рис_20_Результат_поиска_всех_фигур"/>
       <w:r>
         <w:fldChar w:fldCharType="begin"/>
       </w:r>
@@ -9906,7 +9992,7 @@
         </w:rPr>
         <w:fldChar w:fldCharType="end"/>
       </w:r>
-      <w:bookmarkEnd w:id="29"/>
+      <w:bookmarkEnd w:id="32"/>
       <w:r>
         <w:t xml:space="preserve"> – Результат поиска всех фигур</w:t>
       </w:r>
@@ -9964,7 +10050,7 @@
                     <pic:cNvPicPr/>
                   </pic:nvPicPr>
                   <pic:blipFill>
-                    <a:blip r:embed="rId28"/>
+                    <a:blip r:embed="rId33"/>
                     <a:stretch>
                       <a:fillRect/>
                     </a:stretch>
@@ -9992,7 +10078,7 @@
       <w:r>
         <w:t xml:space="preserve">Рисунок </w:t>
       </w:r>
-      <w:bookmarkStart w:id="30" w:name="Рис_21_Резутат_поиска_фигуры"/>
+      <w:bookmarkStart w:id="33" w:name="Рис_21_Резутат_поиска_фигуры"/>
       <w:r>
         <w:fldChar w:fldCharType="begin"/>
       </w:r>
@@ -10014,7 +10100,7 @@
         </w:rPr>
         <w:fldChar w:fldCharType="end"/>
       </w:r>
-      <w:bookmarkEnd w:id="30"/>
+      <w:bookmarkEnd w:id="33"/>
       <w:r>
         <w:t xml:space="preserve"> –</w:t>
       </w:r>
@@ -10075,7 +10161,7 @@
                     <pic:cNvPicPr/>
                   </pic:nvPicPr>
                   <pic:blipFill>
-                    <a:blip r:embed="rId29"/>
+                    <a:blip r:embed="rId34"/>
                     <a:stretch>
                       <a:fillRect/>
                     </a:stretch>
@@ -10103,7 +10189,7 @@
       <w:r>
         <w:t xml:space="preserve">Рисунок </w:t>
       </w:r>
-      <w:bookmarkStart w:id="31" w:name="Рис_22_Пустой_результат_поиска"/>
+      <w:bookmarkStart w:id="34" w:name="Рис_22_Пустой_результат_поиска"/>
       <w:r>
         <w:fldChar w:fldCharType="begin"/>
       </w:r>
@@ -10125,7 +10211,7 @@
         </w:rPr>
         <w:fldChar w:fldCharType="end"/>
       </w:r>
-      <w:bookmarkEnd w:id="31"/>
+      <w:bookmarkEnd w:id="34"/>
       <w:r>
         <w:t xml:space="preserve"> – </w:t>
       </w:r>
@@ -10186,7 +10272,7 @@
                     <pic:cNvPicPr/>
                   </pic:nvPicPr>
                   <pic:blipFill>
-                    <a:blip r:embed="rId30"/>
+                    <a:blip r:embed="rId35"/>
                     <a:stretch>
                       <a:fillRect/>
                     </a:stretch>
@@ -10214,7 +10300,7 @@
       <w:r>
         <w:t xml:space="preserve">Рисунок </w:t>
       </w:r>
-      <w:bookmarkStart w:id="32" w:name="Рис_23_Ошибка_задания_исх_данных_поиска"/>
+      <w:bookmarkStart w:id="35" w:name="Рис_23_Ошибка_задания_исх_данных_поиска"/>
       <w:r>
         <w:fldChar w:fldCharType="begin"/>
       </w:r>
@@ -10236,7 +10322,7 @@
         </w:rPr>
         <w:fldChar w:fldCharType="end"/>
       </w:r>
-      <w:bookmarkEnd w:id="32"/>
+      <w:bookmarkEnd w:id="35"/>
       <w:r>
         <w:t xml:space="preserve"> – </w:t>
       </w:r>
@@ -10247,6 +10333,17 @@
     <w:p>
       <w:r>
         <w:t>Таким образом, тестирование показало, что функция поиска работает корректно. Программа позволяет выполнять поиск по всем фигурам, по конкретному типу фигуры и по заданному диапазону объёма. При некорректных условиях поиска программа сообщает пользователю об ошибке и не выводит неправильный результат.</w:t>
+      </w:r>
+    </w:p>
+    <w:p>
+      <w:pPr>
+        <w:spacing w:after="160" w:line="278" w:lineRule="auto"/>
+        <w:ind w:firstLine="0"/>
+        <w:contextualSpacing w:val="0"/>
+        <w:jc w:val="left"/>
+      </w:pPr>
+      <w:r>
+        <w:br w:type="page"/>
       </w:r>
     </w:p>
     <w:p>
@@ -10260,13 +10357,104 @@
         <w:jc w:val="center"/>
       </w:pPr>
       <w:r>
+        <w:lastRenderedPageBreak/>
+        <w:t>Тестирование памяти и загруженности процессора</w:t>
+      </w:r>
+    </w:p>
+    <w:p>
+      <w:pPr>
+        <w:rPr>
+          <w:sz w:val="24"/>
+        </w:rPr>
+      </w:pPr>
+      <w:r>
+        <w:t>В ходе тестирования выполнялась проверка работы основных функций приложения: добавление объёмных фигур, удаление выбранных записей, поиск фигур по заданным критериям, сохранение данных в файл и последующая загрузка данных из файла. Также проверялась обработка ошибочных ситуаций: ввод некорректных значений, попытка удаления без выбора фигуры, сохранение пустого списка и загрузка некорректных данных.</w:t>
+      </w:r>
+    </w:p>
+    <w:p>
+      <w:r>
+        <w:t>Для оценки нагрузки на систему использовались средства диагностики Visual Studio. Во время тестирования последовательно выполнялись основные пользовательские сценарии, при этом в список добавлялось до 12 фигур разных типов. Анализировались показатели использования оперативной памяти и процессора при работе с формами, таблицей данных, сохранением и загрузкой файла.</w:t>
+      </w:r>
+    </w:p>
+    <w:p>
+      <w:r>
+        <w:t>По результатам тестирования установлено, что приложение работает стабильно. Значительных скачков загрузки процессора не наблюдалось, основная нагрузка возникала только кратковременно во время выполнения пользовательских действий. Использование оперативной памяти оставалось на низком уровне и не приводило к заметному росту потребления ресурсов. Это подтверждает, что приложение не предъявляет высоких требований к аппаратным ресурсам и может корректно работать на компьютерах с минимальными характеристиками, указанными в требованиях.</w:t>
+      </w:r>
+    </w:p>
+    <w:p>
+      <w:pPr>
+        <w:pStyle w:val="af9"/>
+      </w:pPr>
+      <w:r>
         <w:rPr>
           <w:lang w:val="en-US"/>
         </w:rPr>
-        <w:t>Тестирование памяти и загруженности процессора</w:t>
-      </w:r>
-    </w:p>
-    <w:p/>
+        <w:drawing>
+          <wp:inline distT="0" distB="0" distL="0" distR="0" wp14:anchorId="5E223F2C" wp14:editId="2ED9D474">
+            <wp:extent cx="5940425" cy="2514433"/>
+            <wp:effectExtent l="0" t="0" r="3175" b="635"/>
+            <wp:docPr id="1681852438" name="Рисунок 1"/>
+            <wp:cNvGraphicFramePr>
+              <a:graphicFrameLocks xmlns:a="http://schemas.openxmlformats.org/drawingml/2006/main" noChangeAspect="1"/>
+            </wp:cNvGraphicFramePr>
+            <a:graphic xmlns:a="http://schemas.openxmlformats.org/drawingml/2006/main">
+              <a:graphicData uri="http://schemas.openxmlformats.org/drawingml/2006/picture">
+                <pic:pic xmlns:pic="http://schemas.openxmlformats.org/drawingml/2006/picture">
+                  <pic:nvPicPr>
+                    <pic:cNvPr id="0" name="Picture 1"/>
+                    <pic:cNvPicPr>
+                      <a:picLocks noChangeAspect="1" noChangeArrowheads="1"/>
+                    </pic:cNvPicPr>
+                  </pic:nvPicPr>
+                  <pic:blipFill>
+                    <a:blip r:embed="rId36" cstate="print">
+                      <a:extLst>
+                        <a:ext uri="{28A0092B-C50C-407E-A947-70E740481C1C}">
+                          <a14:useLocalDpi xmlns:a14="http://schemas.microsoft.com/office/drawing/2010/main" val="0"/>
+                        </a:ext>
+                      </a:extLst>
+                    </a:blip>
+                    <a:srcRect/>
+                    <a:stretch>
+                      <a:fillRect/>
+                    </a:stretch>
+                  </pic:blipFill>
+                  <pic:spPr bwMode="auto">
+                    <a:xfrm>
+                      <a:off x="0" y="0"/>
+                      <a:ext cx="5940425" cy="2514433"/>
+                    </a:xfrm>
+                    <a:prstGeom prst="rect">
+                      <a:avLst/>
+                    </a:prstGeom>
+                    <a:noFill/>
+                    <a:ln>
+                      <a:noFill/>
+                    </a:ln>
+                  </pic:spPr>
+                </pic:pic>
+              </a:graphicData>
+            </a:graphic>
+          </wp:inline>
+        </w:drawing>
+      </w:r>
+    </w:p>
+    <w:p>
+      <w:pPr>
+        <w:pStyle w:val="aff"/>
+      </w:pPr>
+      <w:r>
+        <w:t xml:space="preserve">Рисунок </w:t>
+      </w:r>
+      <w:fldSimple w:instr=" SEQ Рисунок \* ARABIC ">
+        <w:r>
+          <w:t>24</w:t>
+        </w:r>
+      </w:fldSimple>
+      <w:r>
+        <w:t xml:space="preserve"> - Тест ресурсоэффективности</w:t>
+      </w:r>
+    </w:p>
     <w:p>
       <w:pPr>
         <w:spacing w:after="160" w:line="278" w:lineRule="auto"/>
@@ -10304,8 +10492,8 @@
           <w:szCs w:val="32"/>
         </w:rPr>
       </w:pPr>
-      <w:bookmarkStart w:id="33" w:name="_Toc225423988"/>
-      <w:bookmarkStart w:id="34" w:name="_Toc232211104"/>
+      <w:bookmarkStart w:id="36" w:name="_Toc225423988"/>
+      <w:bookmarkStart w:id="37" w:name="_Toc232211104"/>
       <w:r>
         <w:rPr>
           <w:rFonts w:eastAsiaTheme="majorEastAsia" w:cstheme="majorBidi"/>
@@ -10314,8 +10502,8 @@
         </w:rPr>
         <w:t>Приложение А</w:t>
       </w:r>
-      <w:bookmarkEnd w:id="33"/>
-      <w:bookmarkEnd w:id="34"/>
+      <w:bookmarkEnd w:id="36"/>
+      <w:bookmarkEnd w:id="37"/>
     </w:p>
     <w:p>
       <w:pPr>
@@ -10366,6 +10554,7 @@
         </w:rPr>
         <w:t xml:space="preserve">Программа для </w:t>
       </w:r>
+      <w:commentRangeStart w:id="38"/>
       <w:r>
         <w:rPr>
           <w:rFonts w:eastAsia="Calibri" w:cs="Times New Roman"/>
@@ -10385,6 +10574,19 @@
           <w14:ligatures w14:val="none"/>
         </w:rPr>
         <w:t>фигур сфера, пирамида, параллелепипеда</w:t>
+      </w:r>
+      <w:commentRangeEnd w:id="38"/>
+      <w:r>
+        <w:rPr>
+          <w:rStyle w:val="af2"/>
+          <w:rFonts w:eastAsia="Calibri" w:cs="Times New Roman"/>
+          <w:iCs/>
+          <w:kern w:val="0"/>
+          <w:sz w:val="28"/>
+          <w:szCs w:val="28"/>
+          <w14:ligatures w14:val="none"/>
+        </w:rPr>
+        <w:commentReference w:id="38"/>
       </w:r>
     </w:p>
     <w:p>
@@ -12124,7 +12326,7 @@
       <w:r>
         <w:t xml:space="preserve">Система должна функционировать под управлением операционной </w:t>
       </w:r>
-      <w:commentRangeStart w:id="35"/>
+      <w:commentRangeStart w:id="39"/>
       <w:r>
         <w:t>системы Windows 10 версии 22</w:t>
       </w:r>
@@ -12137,14 +12339,14 @@
       <w:r>
         <w:t>2 или Windows 11</w:t>
       </w:r>
-      <w:commentRangeEnd w:id="35"/>
+      <w:commentRangeEnd w:id="39"/>
       <w:r>
         <w:rPr>
           <w:rStyle w:val="af2"/>
           <w:sz w:val="28"/>
           <w:szCs w:val="24"/>
         </w:rPr>
-        <w:commentReference w:id="35"/>
+        <w:commentReference w:id="39"/>
       </w:r>
       <w:r>
         <w:t>. Поддержка macOS и Linux не предусмотрена, так как приложение разработано как настольное Windows Forms-приложение.</w:t>
@@ -13639,35 +13841,6 @@
         <w:t>При возникновении ошибки сохранения или загрузки система должна выводить диалоговое окно с описанием ошибки.</w:t>
       </w:r>
     </w:p>
-    <w:p/>
-    <w:p>
-      <w:pPr>
-        <w:spacing w:after="160" w:line="278" w:lineRule="auto"/>
-        <w:ind w:firstLine="0"/>
-        <w:contextualSpacing w:val="0"/>
-        <w:jc w:val="left"/>
-        <w:rPr>
-          <w:rFonts w:eastAsia="Calibri" w:cs="Times New Roman"/>
-          <w:iCs/>
-          <w:kern w:val="0"/>
-          <w:szCs w:val="28"/>
-          <w14:ligatures w14:val="none"/>
-        </w:rPr>
-        <w:sectPr>
-          <w:headerReference w:type="even" r:id="rId35"/>
-          <w:headerReference w:type="default" r:id="rId36"/>
-          <w:footerReference w:type="even" r:id="rId37"/>
-          <w:footerReference w:type="default" r:id="rId38"/>
-          <w:headerReference w:type="first" r:id="rId39"/>
-          <w:footerReference w:type="first" r:id="rId40"/>
-          <w:pgSz w:w="11906" w:h="16838"/>
-          <w:pgMar w:top="1134" w:right="850" w:bottom="1134" w:left="1701" w:header="708" w:footer="708" w:gutter="0"/>
-          <w:cols w:space="708"/>
-          <w:titlePg/>
-          <w:docGrid w:linePitch="381"/>
-        </w:sectPr>
-      </w:pPr>
-    </w:p>
     <w:p>
       <w:pPr>
         <w:keepNext/>
@@ -13676,131 +13849,17 @@
         <w:ind w:left="709" w:firstLine="0"/>
         <w:jc w:val="center"/>
         <w:outlineLvl w:val="0"/>
-        <w:rPr>
-          <w:rFonts w:eastAsiaTheme="majorEastAsia" w:cstheme="majorBidi"/>
-          <w:b/>
-          <w:szCs w:val="32"/>
-          <w:lang w:val="en-US"/>
-        </w:rPr>
-      </w:pPr>
-      <w:bookmarkStart w:id="36" w:name="_Toc232211105"/>
-      <w:r>
-        <w:rPr>
-          <w:rFonts w:eastAsiaTheme="majorEastAsia" w:cstheme="majorBidi"/>
-          <w:b/>
-          <w:szCs w:val="32"/>
-        </w:rPr>
-        <w:lastRenderedPageBreak/>
-        <w:t xml:space="preserve">Приложение </w:t>
-      </w:r>
-      <w:r>
-        <w:rPr>
-          <w:rFonts w:eastAsiaTheme="majorEastAsia" w:cstheme="majorBidi"/>
-          <w:b/>
-          <w:szCs w:val="32"/>
-          <w:lang w:val="en-US"/>
-        </w:rPr>
-        <w:t>B</w:t>
-      </w:r>
-      <w:bookmarkEnd w:id="36"/>
-    </w:p>
-    <w:p>
-      <w:pPr>
-        <w:ind w:firstLine="0"/>
-        <w:jc w:val="center"/>
-        <w:rPr>
-          <w:rFonts w:eastAsia="Calibri" w:cs="Times New Roman"/>
-          <w:iCs/>
-          <w:kern w:val="0"/>
-          <w:szCs w:val="28"/>
-          <w:lang w:val="en-US"/>
-          <w14:ligatures w14:val="none"/>
-        </w:rPr>
-      </w:pPr>
-      <w:r>
-        <w:rPr>
-          <w:noProof/>
-          <w:lang w:val="en-US"/>
-        </w:rPr>
-        <w:drawing>
-          <wp:inline distT="0" distB="0" distL="0" distR="0" wp14:anchorId="2A941819" wp14:editId="1D0B396F">
-            <wp:extent cx="9248775" cy="3914775"/>
-            <wp:effectExtent l="0" t="0" r="9525" b="9525"/>
-            <wp:docPr id="1681852438" name="Рисунок 1"/>
-            <wp:cNvGraphicFramePr>
-              <a:graphicFrameLocks xmlns:a="http://schemas.openxmlformats.org/drawingml/2006/main" noChangeAspect="1"/>
-            </wp:cNvGraphicFramePr>
-            <a:graphic xmlns:a="http://schemas.openxmlformats.org/drawingml/2006/main">
-              <a:graphicData uri="http://schemas.openxmlformats.org/drawingml/2006/picture">
-                <pic:pic xmlns:pic="http://schemas.openxmlformats.org/drawingml/2006/picture">
-                  <pic:nvPicPr>
-                    <pic:cNvPr id="0" name="Picture 1"/>
-                    <pic:cNvPicPr>
-                      <a:picLocks noChangeAspect="1" noChangeArrowheads="1"/>
-                    </pic:cNvPicPr>
-                  </pic:nvPicPr>
-                  <pic:blipFill>
-                    <a:blip r:embed="rId41">
-                      <a:extLst>
-                        <a:ext uri="{28A0092B-C50C-407E-A947-70E740481C1C}">
-                          <a14:useLocalDpi xmlns:a14="http://schemas.microsoft.com/office/drawing/2010/main" val="0"/>
-                        </a:ext>
-                      </a:extLst>
-                    </a:blip>
-                    <a:srcRect/>
-                    <a:stretch>
-                      <a:fillRect/>
-                    </a:stretch>
-                  </pic:blipFill>
-                  <pic:spPr bwMode="auto">
-                    <a:xfrm>
-                      <a:off x="0" y="0"/>
-                      <a:ext cx="9248775" cy="3914775"/>
-                    </a:xfrm>
-                    <a:prstGeom prst="rect">
-                      <a:avLst/>
-                    </a:prstGeom>
-                    <a:noFill/>
-                    <a:ln>
-                      <a:noFill/>
-                    </a:ln>
-                  </pic:spPr>
-                </pic:pic>
-              </a:graphicData>
-            </a:graphic>
-          </wp:inline>
-        </w:drawing>
-      </w:r>
-    </w:p>
-    <w:p>
-      <w:pPr>
-        <w:pStyle w:val="aff"/>
-      </w:pPr>
-      <w:r>
-        <w:t xml:space="preserve">Рисунок В – Результаты профилирования в </w:t>
-      </w:r>
-      <w:r>
-        <w:rPr>
-          <w:lang w:val="en-US"/>
-        </w:rPr>
-        <w:t>Visual</w:t>
-      </w:r>
-      <w:r>
-        <w:t xml:space="preserve"> </w:t>
-      </w:r>
-      <w:r>
-        <w:rPr>
-          <w:lang w:val="en-US"/>
-        </w:rPr>
-        <w:t>Studio</w:t>
-      </w:r>
-      <w:r>
-        <w:t xml:space="preserve"> 2026</w:t>
-      </w:r>
+      </w:pPr>
     </w:p>
     <w:sectPr>
-      <w:pgSz w:w="16838" w:h="11906" w:orient="landscape"/>
-      <w:pgMar w:top="1701" w:right="1134" w:bottom="850" w:left="1134" w:header="708" w:footer="708" w:gutter="0"/>
+      <w:headerReference w:type="even" r:id="rId37"/>
+      <w:headerReference w:type="default" r:id="rId38"/>
+      <w:footerReference w:type="even" r:id="rId39"/>
+      <w:footerReference w:type="default" r:id="rId40"/>
+      <w:headerReference w:type="first" r:id="rId41"/>
+      <w:footerReference w:type="first" r:id="rId42"/>
+      <w:pgSz w:w="11906" w:h="16838"/>
+      <w:pgMar w:top="1134" w:right="850" w:bottom="1134" w:left="1701" w:header="708" w:footer="708" w:gutter="0"/>
       <w:cols w:space="708"/>
       <w:titlePg/>
       <w:docGrid w:linePitch="381"/>
@@ -13811,7 +13870,86 @@
 
 <file path=word/comments.xml><?xml version="1.0" encoding="utf-8"?>
 <w:comments xmlns:wpc="http://schemas.microsoft.com/office/word/2010/wordprocessingCanvas" xmlns:cx="http://schemas.microsoft.com/office/drawing/2014/chartex" xmlns:cx1="http://schemas.microsoft.com/office/drawing/2015/9/8/chartex" xmlns:cx2="http://schemas.microsoft.com/office/drawing/2015/10/21/chartex" xmlns:cx3="http://schemas.microsoft.com/office/drawing/2016/5/9/chartex" xmlns:cx4="http://schemas.microsoft.com/office/drawing/2016/5/10/chartex" xmlns:cx5="http://schemas.microsoft.com/office/drawing/2016/5/11/chartex" xmlns:cx6="http://schemas.microsoft.com/office/drawing/2016/5/12/chartex" xmlns:cx7="http://schemas.microsoft.com/office/drawing/2016/5/13/chartex" xmlns:cx8="http://schemas.microsoft.com/office/drawing/2016/5/14/chartex" xmlns:mc="http://schemas.openxmlformats.org/markup-compatibility/2006" xmlns:aink="http://schemas.microsoft.com/office/drawing/2016/ink" xmlns:am3d="http://schemas.microsoft.com/office/drawing/2017/model3d" xmlns:o="urn:schemas-microsoft-com:office:office" xmlns:oel="http://schemas.microsoft.com/office/2019/extlst" xmlns:r="http://schemas.openxmlformats.org/officeDocument/2006/relationships" xmlns:m="http://schemas.openxmlformats.org/officeDocument/2006/math" xmlns:v="urn:schemas-microsoft-com:vml" xmlns:wp14="http://schemas.microsoft.com/office/word/2010/wordprocessingDrawing" xmlns:wp="http://schemas.openxmlformats.org/drawingml/2006/wordprocessingDrawing" xmlns:w10="urn:schemas-microsoft-com:office:word" xmlns:w="http://schemas.openxmlformats.org/wordprocessingml/2006/main" xmlns:w14="http://schemas.microsoft.com/office/word/2010/wordml" xmlns:w15="http://schemas.microsoft.com/office/word/2012/wordml" xmlns:w16cex="http://schemas.microsoft.com/office/word/2018/wordml/cex" xmlns:w16cid="http://schemas.microsoft.com/office/word/2016/wordml/cid" xmlns:w16="http://schemas.microsoft.com/office/word/2018/wordml" xmlns:w16du="http://schemas.microsoft.com/office/word/2023/wordml/word16du" xmlns:w16sdtdh="http://schemas.microsoft.com/office/word/2020/wordml/sdtdatahash" xmlns:w16sdtfl="http://schemas.microsoft.com/office/word/2024/wordml/sdtformatlock" xmlns:w16se="http://schemas.microsoft.com/office/word/2015/wordml/symex" xmlns:wpg="http://schemas.microsoft.com/office/word/2010/wordprocessingGroup" xmlns:wpi="http://schemas.microsoft.com/office/word/2010/wordprocessingInk" xmlns:wne="http://schemas.microsoft.com/office/word/2006/wordml" xmlns:wps="http://schemas.microsoft.com/office/word/2010/wordprocessingShape" mc:Ignorable="w14 w15 w16se w16cid w16 w16cex w16sdtdh w16sdtfl w16du wp14">
-  <w:comment w:id="35" w:author="Aleksey A. Kalentev" w:date="2026-06-13T13:33:00Z" w:initials="AAK">
+  <w:comment w:id="12" w:author="Руслан Рустамов" w:date="2026-06-13T14:19:00Z" w:initials="РР">
+    <w:p>
+      <w:pPr>
+        <w:pStyle w:val="af3"/>
+      </w:pPr>
+      <w:r>
+        <w:rPr>
+          <w:rStyle w:val="af2"/>
+        </w:rPr>
+        <w:annotationRef/>
+      </w:r>
+      <w:r>
+        <w:t>Заменил кнопку ОК</w:t>
+      </w:r>
+    </w:p>
+    <w:p>
+      <w:pPr>
+        <w:pStyle w:val="af3"/>
+      </w:pPr>
+    </w:p>
+  </w:comment>
+  <w:comment w:id="13" w:author="Руслан Рустамов" w:date="2026-06-13T14:18:00Z" w:initials="РР">
+    <w:p>
+      <w:pPr>
+        <w:pStyle w:val="af3"/>
+      </w:pPr>
+      <w:r>
+        <w:rPr>
+          <w:rStyle w:val="af2"/>
+        </w:rPr>
+        <w:annotationRef/>
+      </w:r>
+      <w:r>
+        <w:t>Заменил кнопку ОК</w:t>
+      </w:r>
+    </w:p>
+    <w:p>
+      <w:pPr>
+        <w:pStyle w:val="af3"/>
+      </w:pPr>
+    </w:p>
+  </w:comment>
+  <w:comment w:id="15" w:author="Руслан Рустамов" w:date="2026-06-13T14:18:00Z" w:initials="РР">
+    <w:p>
+      <w:pPr>
+        <w:pStyle w:val="af3"/>
+      </w:pPr>
+      <w:r>
+        <w:rPr>
+          <w:rStyle w:val="af2"/>
+        </w:rPr>
+        <w:annotationRef/>
+      </w:r>
+      <w:r>
+        <w:t>Заменил кнопку ОК</w:t>
+      </w:r>
+    </w:p>
+  </w:comment>
+  <w:comment w:id="38" w:author="Руслан Рустамов" w:date="2026-06-13T14:39:00Z" w:initials="РР">
+    <w:p>
+      <w:pPr>
+        <w:pStyle w:val="af3"/>
+      </w:pPr>
+      <w:r>
+        <w:rPr>
+          <w:rStyle w:val="af2"/>
+        </w:rPr>
+        <w:annotationRef/>
+      </w:r>
+      <w:r>
+        <w:t>Поправил, было про библиотеку</w:t>
+      </w:r>
+    </w:p>
+    <w:p>
+      <w:pPr>
+        <w:pStyle w:val="af3"/>
+      </w:pPr>
+    </w:p>
+  </w:comment>
+  <w:comment w:id="39" w:author="Aleksey A. Kalentev" w:date="2026-06-13T13:33:00Z" w:initials="AAK">
     <w:p>
       <w:pPr>
         <w:pStyle w:val="af3"/>
@@ -13829,18 +13967,30 @@
 
 <file path=word/commentsExtended.xml><?xml version="1.0" encoding="utf-8"?>
 <w15:commentsEx xmlns:wpc="http://schemas.microsoft.com/office/word/2010/wordprocessingCanvas" xmlns:cx="http://schemas.microsoft.com/office/drawing/2014/chartex" xmlns:cx1="http://schemas.microsoft.com/office/drawing/2015/9/8/chartex" xmlns:cx2="http://schemas.microsoft.com/office/drawing/2015/10/21/chartex" xmlns:cx3="http://schemas.microsoft.com/office/drawing/2016/5/9/chartex" xmlns:cx4="http://schemas.microsoft.com/office/drawing/2016/5/10/chartex" xmlns:cx5="http://schemas.microsoft.com/office/drawing/2016/5/11/chartex" xmlns:cx6="http://schemas.microsoft.com/office/drawing/2016/5/12/chartex" xmlns:cx7="http://schemas.microsoft.com/office/drawing/2016/5/13/chartex" xmlns:cx8="http://schemas.microsoft.com/office/drawing/2016/5/14/chartex" xmlns:mc="http://schemas.openxmlformats.org/markup-compatibility/2006" xmlns:aink="http://schemas.microsoft.com/office/drawing/2016/ink" xmlns:am3d="http://schemas.microsoft.com/office/drawing/2017/model3d" xmlns:o="urn:schemas-microsoft-com:office:office" xmlns:oel="http://schemas.microsoft.com/office/2019/extlst" xmlns:r="http://schemas.openxmlformats.org/officeDocument/2006/relationships" xmlns:m="http://schemas.openxmlformats.org/officeDocument/2006/math" xmlns:v="urn:schemas-microsoft-com:vml" xmlns:wp14="http://schemas.microsoft.com/office/word/2010/wordprocessingDrawing" xmlns:wp="http://schemas.openxmlformats.org/drawingml/2006/wordprocessingDrawing" xmlns:w10="urn:schemas-microsoft-com:office:word" xmlns:w="http://schemas.openxmlformats.org/wordprocessingml/2006/main" xmlns:w14="http://schemas.microsoft.com/office/word/2010/wordml" xmlns:w15="http://schemas.microsoft.com/office/word/2012/wordml" xmlns:w16cex="http://schemas.microsoft.com/office/word/2018/wordml/cex" xmlns:w16cid="http://schemas.microsoft.com/office/word/2016/wordml/cid" xmlns:w16="http://schemas.microsoft.com/office/word/2018/wordml" xmlns:w16du="http://schemas.microsoft.com/office/word/2023/wordml/word16du" xmlns:w16sdtdh="http://schemas.microsoft.com/office/word/2020/wordml/sdtdatahash" xmlns:w16sdtfl="http://schemas.microsoft.com/office/word/2024/wordml/sdtformatlock" xmlns:w16se="http://schemas.microsoft.com/office/word/2015/wordml/symex" xmlns:wpg="http://schemas.microsoft.com/office/word/2010/wordprocessingGroup" xmlns:wpi="http://schemas.microsoft.com/office/word/2010/wordprocessingInk" xmlns:wne="http://schemas.microsoft.com/office/word/2006/wordml" xmlns:wps="http://schemas.microsoft.com/office/word/2010/wordprocessingShape" mc:Ignorable="w14 w15 w16se w16cid w16 w16cex w16sdtdh w16sdtfl w16du wp14">
+  <w15:commentEx w15:paraId="15BED037" w15:done="0"/>
+  <w15:commentEx w15:paraId="3C427E00" w15:done="0"/>
+  <w15:commentEx w15:paraId="7258B610" w15:done="0"/>
+  <w15:commentEx w15:paraId="334E3334" w15:done="0"/>
   <w15:commentEx w15:paraId="24BB3D33" w15:done="0"/>
 </w15:commentsEx>
 </file>
 
 <file path=word/commentsExtensible.xml><?xml version="1.0" encoding="utf-8"?>
 <w16cex:commentsExtensible xmlns:wpc="http://schemas.microsoft.com/office/word/2010/wordprocessingCanvas" xmlns:cx="http://schemas.microsoft.com/office/drawing/2014/chartex" xmlns:cx1="http://schemas.microsoft.com/office/drawing/2015/9/8/chartex" xmlns:cx2="http://schemas.microsoft.com/office/drawing/2015/10/21/chartex" xmlns:cx3="http://schemas.microsoft.com/office/drawing/2016/5/9/chartex" xmlns:cx4="http://schemas.microsoft.com/office/drawing/2016/5/10/chartex" xmlns:cx5="http://schemas.microsoft.com/office/drawing/2016/5/11/chartex" xmlns:cx6="http://schemas.microsoft.com/office/drawing/2016/5/12/chartex" xmlns:cx7="http://schemas.microsoft.com/office/drawing/2016/5/13/chartex" xmlns:cx8="http://schemas.microsoft.com/office/drawing/2016/5/14/chartex" xmlns:cr="http://schemas.microsoft.com/office/comments/2020/reactions" xmlns:mc="http://schemas.openxmlformats.org/markup-compatibility/2006" xmlns:aink="http://schemas.microsoft.com/office/drawing/2016/ink" xmlns:am3d="http://schemas.microsoft.com/office/drawing/2017/model3d" xmlns:o="urn:schemas-microsoft-com:office:office" xmlns:oel="http://schemas.microsoft.com/office/2019/extlst" xmlns:r="http://schemas.openxmlformats.org/officeDocument/2006/relationships" xmlns:m="http://schemas.openxmlformats.org/officeDocument/2006/math" xmlns:v="urn:schemas-microsoft-com:vml" xmlns:wp14="http://schemas.microsoft.com/office/word/2010/wordprocessingDrawing" xmlns:wp="http://schemas.openxmlformats.org/drawingml/2006/wordprocessingDrawing" xmlns:w10="urn:schemas-microsoft-com:office:word" xmlns:w="http://schemas.openxmlformats.org/wordprocessingml/2006/main" xmlns:w14="http://schemas.microsoft.com/office/word/2010/wordml" xmlns:w15="http://schemas.microsoft.com/office/word/2012/wordml" xmlns:w16cex="http://schemas.microsoft.com/office/word/2018/wordml/cex" xmlns:w16cid="http://schemas.microsoft.com/office/word/2016/wordml/cid" xmlns:w16="http://schemas.microsoft.com/office/word/2018/wordml" xmlns:w16du="http://schemas.microsoft.com/office/word/2023/wordml/word16du" xmlns:w16sdtdh="http://schemas.microsoft.com/office/word/2020/wordml/sdtdatahash" xmlns:w16sdtfl="http://schemas.microsoft.com/office/word/2024/wordml/sdtformatlock" xmlns:w16se="http://schemas.microsoft.com/office/word/2015/wordml/symex" xmlns:wpg="http://schemas.microsoft.com/office/word/2010/wordprocessingGroup" xmlns:wpi="http://schemas.microsoft.com/office/word/2010/wordprocessingInk" xmlns:wne="http://schemas.microsoft.com/office/word/2006/wordml" xmlns:wps="http://schemas.microsoft.com/office/word/2010/wordprocessingShape" mc:Ignorable="w14 w15 w16se w16cid w16 w16cex w16sdtdh w16sdtfl cr w16du wp14">
+  <w16cex:commentExtensible w16cex:durableId="108F5499" w16cex:dateUtc="2026-06-13T07:19:00Z"/>
+  <w16cex:commentExtensible w16cex:durableId="195C1D18" w16cex:dateUtc="2026-06-13T07:18:00Z"/>
+  <w16cex:commentExtensible w16cex:durableId="74504A8B" w16cex:dateUtc="2026-06-13T07:18:00Z"/>
+  <w16cex:commentExtensible w16cex:durableId="1F8D408F" w16cex:dateUtc="2026-06-13T07:39:00Z"/>
   <w16cex:commentExtensible w16cex:durableId="2DD7DAA8" w16cex:dateUtc="2026-06-13T06:33:00Z"/>
 </w16cex:commentsExtensible>
 </file>
 
 <file path=word/commentsIds.xml><?xml version="1.0" encoding="utf-8"?>
 <w16cid:commentsIds xmlns:wpc="http://schemas.microsoft.com/office/word/2010/wordprocessingCanvas" xmlns:cx="http://schemas.microsoft.com/office/drawing/2014/chartex" xmlns:cx1="http://schemas.microsoft.com/office/drawing/2015/9/8/chartex" xmlns:cx2="http://schemas.microsoft.com/office/drawing/2015/10/21/chartex" xmlns:cx3="http://schemas.microsoft.com/office/drawing/2016/5/9/chartex" xmlns:cx4="http://schemas.microsoft.com/office/drawing/2016/5/10/chartex" xmlns:cx5="http://schemas.microsoft.com/office/drawing/2016/5/11/chartex" xmlns:cx6="http://schemas.microsoft.com/office/drawing/2016/5/12/chartex" xmlns:cx7="http://schemas.microsoft.com/office/drawing/2016/5/13/chartex" xmlns:cx8="http://schemas.microsoft.com/office/drawing/2016/5/14/chartex" xmlns:mc="http://schemas.openxmlformats.org/markup-compatibility/2006" xmlns:aink="http://schemas.microsoft.com/office/drawing/2016/ink" xmlns:am3d="http://schemas.microsoft.com/office/drawing/2017/model3d" xmlns:o="urn:schemas-microsoft-com:office:office" xmlns:oel="http://schemas.microsoft.com/office/2019/extlst" xmlns:r="http://schemas.openxmlformats.org/officeDocument/2006/relationships" xmlns:m="http://schemas.openxmlformats.org/officeDocument/2006/math" xmlns:v="urn:schemas-microsoft-com:vml" xmlns:wp14="http://schemas.microsoft.com/office/word/2010/wordprocessingDrawing" xmlns:wp="http://schemas.openxmlformats.org/drawingml/2006/wordprocessingDrawing" xmlns:w10="urn:schemas-microsoft-com:office:word" xmlns:w="http://schemas.openxmlformats.org/wordprocessingml/2006/main" xmlns:w14="http://schemas.microsoft.com/office/word/2010/wordml" xmlns:w15="http://schemas.microsoft.com/office/word/2012/wordml" xmlns:w16cex="http://schemas.microsoft.com/office/word/2018/wordml/cex" xmlns:w16cid="http://schemas.microsoft.com/office/word/2016/wordml/cid" xmlns:w16="http://schemas.microsoft.com/office/word/2018/wordml" xmlns:w16du="http://schemas.microsoft.com/office/word/2023/wordml/word16du" xmlns:w16sdtdh="http://schemas.microsoft.com/office/word/2020/wordml/sdtdatahash" xmlns:w16sdtfl="http://schemas.microsoft.com/office/word/2024/wordml/sdtformatlock" xmlns:w16se="http://schemas.microsoft.com/office/word/2015/wordml/symex" xmlns:wpg="http://schemas.microsoft.com/office/word/2010/wordprocessingGroup" xmlns:wpi="http://schemas.microsoft.com/office/word/2010/wordprocessingInk" xmlns:wne="http://schemas.microsoft.com/office/word/2006/wordml" xmlns:wps="http://schemas.microsoft.com/office/word/2010/wordprocessingShape" mc:Ignorable="w14 w15 w16se w16cid w16 w16cex w16sdtdh w16sdtfl w16du wp14">
+  <w16cid:commentId w16cid:paraId="15BED037" w16cid:durableId="108F5499"/>
+  <w16cid:commentId w16cid:paraId="3C427E00" w16cid:durableId="195C1D18"/>
+  <w16cid:commentId w16cid:paraId="7258B610" w16cid:durableId="74504A8B"/>
+  <w16cid:commentId w16cid:paraId="334E3334" w16cid:durableId="1F8D408F"/>
   <w16cid:commentId w16cid:paraId="24BB3D33" w16cid:durableId="2DD7DAA8"/>
 </w16cid:commentsIds>
 </file>
@@ -18450,6 +18600,9 @@
 
 <file path=word/people.xml><?xml version="1.0" encoding="utf-8"?>
 <w15:people xmlns:wpc="http://schemas.microsoft.com/office/word/2010/wordprocessingCanvas" xmlns:cx="http://schemas.microsoft.com/office/drawing/2014/chartex" xmlns:cx1="http://schemas.microsoft.com/office/drawing/2015/9/8/chartex" xmlns:cx2="http://schemas.microsoft.com/office/drawing/2015/10/21/chartex" xmlns:cx3="http://schemas.microsoft.com/office/drawing/2016/5/9/chartex" xmlns:cx4="http://schemas.microsoft.com/office/drawing/2016/5/10/chartex" xmlns:cx5="http://schemas.microsoft.com/office/drawing/2016/5/11/chartex" xmlns:cx6="http://schemas.microsoft.com/office/drawing/2016/5/12/chartex" xmlns:cx7="http://schemas.microsoft.com/office/drawing/2016/5/13/chartex" xmlns:cx8="http://schemas.microsoft.com/office/drawing/2016/5/14/chartex" xmlns:mc="http://schemas.openxmlformats.org/markup-compatibility/2006" xmlns:aink="http://schemas.microsoft.com/office/drawing/2016/ink" xmlns:am3d="http://schemas.microsoft.com/office/drawing/2017/model3d" xmlns:o="urn:schemas-microsoft-com:office:office" xmlns:oel="http://schemas.microsoft.com/office/2019/extlst" xmlns:r="http://schemas.openxmlformats.org/officeDocument/2006/relationships" xmlns:m="http://schemas.openxmlformats.org/officeDocument/2006/math" xmlns:v="urn:schemas-microsoft-com:vml" xmlns:wp14="http://schemas.microsoft.com/office/word/2010/wordprocessingDrawing" xmlns:wp="http://schemas.openxmlformats.org/drawingml/2006/wordprocessingDrawing" xmlns:w10="urn:schemas-microsoft-com:office:word" xmlns:w="http://schemas.openxmlformats.org/wordprocessingml/2006/main" xmlns:w14="http://schemas.microsoft.com/office/word/2010/wordml" xmlns:w15="http://schemas.microsoft.com/office/word/2012/wordml" xmlns:w16cex="http://schemas.microsoft.com/office/word/2018/wordml/cex" xmlns:w16cid="http://schemas.microsoft.com/office/word/2016/wordml/cid" xmlns:w16="http://schemas.microsoft.com/office/word/2018/wordml" xmlns:w16du="http://schemas.microsoft.com/office/word/2023/wordml/word16du" xmlns:w16sdtdh="http://schemas.microsoft.com/office/word/2020/wordml/sdtdatahash" xmlns:w16sdtfl="http://schemas.microsoft.com/office/word/2024/wordml/sdtformatlock" xmlns:w16se="http://schemas.microsoft.com/office/word/2015/wordml/symex" xmlns:wpg="http://schemas.microsoft.com/office/word/2010/wordprocessingGroup" xmlns:wpi="http://schemas.microsoft.com/office/word/2010/wordprocessingInk" xmlns:wne="http://schemas.microsoft.com/office/word/2006/wordml" xmlns:wps="http://schemas.microsoft.com/office/word/2010/wordprocessingShape" mc:Ignorable="w14 w15 w16se w16cid w16 w16cex w16sdtdh w16sdtfl w16du wp14">
+  <w15:person w15:author="Руслан Рустамов">
+    <w15:presenceInfo w15:providerId="Windows Live" w15:userId="7ad4751dad8caff6"/>
+  </w15:person>
   <w15:person w15:author="Aleksey A. Kalentev">
     <w15:presenceInfo w15:providerId="AD" w15:userId="S-1-5-21-507921405-1993962763-1957994488-151096"/>
   </w15:person>
@@ -19755,6 +19908,24 @@
       </w:tblBorders>
     </w:tblPr>
   </w:style>
+  <w:style w:type="paragraph" w:customStyle="1" w:styleId="isselectedend">
+    <w:name w:val="isselectedend"/>
+    <w:basedOn w:val="a"/>
+    <w:rsid w:val="0085725F"/>
+    <w:pPr>
+      <w:spacing w:before="100" w:beforeAutospacing="1" w:after="100" w:afterAutospacing="1" w:line="240" w:lineRule="auto"/>
+      <w:ind w:firstLine="0"/>
+      <w:contextualSpacing w:val="0"/>
+      <w:jc w:val="left"/>
+    </w:pPr>
+    <w:rPr>
+      <w:rFonts w:ascii="Times New Roman" w:eastAsia="Times New Roman" w:hAnsi="Times New Roman" w:cs="Times New Roman"/>
+      <w:kern w:val="0"/>
+      <w:sz w:val="24"/>
+      <w:lang w:eastAsia="ru-RU"/>
+      <w14:ligatures w14:val="none"/>
+    </w:rPr>
+  </w:style>
 </w:styles>
 </file>
 

</xml_diff>

<commit_message>
deleted notice in text, added versions Windows 11
</commit_message>
<xml_diff>
--- a/LR_5_Rustamov.docx
+++ b/LR_5_Rustamov.docx
@@ -1557,7 +1557,7 @@
           <w:r>
             <w:fldChar w:fldCharType="separate"/>
           </w:r>
-          <w:hyperlink w:anchor="_Toc232211092" w:history="1">
+          <w:hyperlink w:anchor="_Toc232254739" w:history="1">
             <w:r>
               <w:rPr>
                 <w:rStyle w:val="af7"/>
@@ -1623,7 +1623,7 @@
                 <w:noProof/>
                 <w:webHidden/>
               </w:rPr>
-              <w:instrText xml:space="preserve"> PAGEREF _Toc232211092 \h </w:instrText>
+              <w:instrText xml:space="preserve"> PAGEREF _Toc232254739 \h </w:instrText>
             </w:r>
             <w:r>
               <w:rPr>
@@ -1668,7 +1668,7 @@
               <w:lang w:eastAsia="ru-RU"/>
             </w:rPr>
           </w:pPr>
-          <w:hyperlink w:anchor="_Toc232211093" w:history="1">
+          <w:hyperlink w:anchor="_Toc232254740" w:history="1">
             <w:r>
               <w:rPr>
                 <w:rStyle w:val="af7"/>
@@ -1713,7 +1713,7 @@
                 <w:noProof/>
                 <w:webHidden/>
               </w:rPr>
-              <w:instrText xml:space="preserve"> PAGEREF _Toc232211093 \h </w:instrText>
+              <w:instrText xml:space="preserve"> PAGEREF _Toc232254740 \h </w:instrText>
             </w:r>
             <w:r>
               <w:rPr>
@@ -1758,7 +1758,7 @@
               <w:lang w:eastAsia="ru-RU"/>
             </w:rPr>
           </w:pPr>
-          <w:hyperlink w:anchor="_Toc232211094" w:history="1">
+          <w:hyperlink w:anchor="_Toc232254741" w:history="1">
             <w:r>
               <w:rPr>
                 <w:rStyle w:val="af7"/>
@@ -1809,7 +1809,7 @@
                 <w:noProof/>
                 <w:webHidden/>
               </w:rPr>
-              <w:instrText xml:space="preserve"> PAGEREF _Toc232211094 \h </w:instrText>
+              <w:instrText xml:space="preserve"> PAGEREF _Toc232254741 \h </w:instrText>
             </w:r>
             <w:r>
               <w:rPr>
@@ -1854,7 +1854,7 @@
               <w:lang w:eastAsia="ru-RU"/>
             </w:rPr>
           </w:pPr>
-          <w:hyperlink w:anchor="_Toc232211095" w:history="1">
+          <w:hyperlink w:anchor="_Toc232254742" w:history="1">
             <w:r>
               <w:rPr>
                 <w:rStyle w:val="af7"/>
@@ -1936,7 +1936,7 @@
                 <w:noProof/>
                 <w:webHidden/>
               </w:rPr>
-              <w:instrText xml:space="preserve"> PAGEREF _Toc232211095 \h </w:instrText>
+              <w:instrText xml:space="preserve"> PAGEREF _Toc232254742 \h </w:instrText>
             </w:r>
             <w:r>
               <w:rPr>
@@ -1981,7 +1981,7 @@
               <w:lang w:eastAsia="ru-RU"/>
             </w:rPr>
           </w:pPr>
-          <w:hyperlink w:anchor="_Toc232211096" w:history="1">
+          <w:hyperlink w:anchor="_Toc232254743" w:history="1">
             <w:r>
               <w:rPr>
                 <w:rStyle w:val="af7"/>
@@ -2026,7 +2026,7 @@
                 <w:noProof/>
                 <w:webHidden/>
               </w:rPr>
-              <w:instrText xml:space="preserve"> PAGEREF _Toc232211096 \h </w:instrText>
+              <w:instrText xml:space="preserve"> PAGEREF _Toc232254743 \h </w:instrText>
             </w:r>
             <w:r>
               <w:rPr>
@@ -2071,7 +2071,7 @@
               <w:lang w:eastAsia="ru-RU"/>
             </w:rPr>
           </w:pPr>
-          <w:hyperlink w:anchor="_Toc232211097" w:history="1">
+          <w:hyperlink w:anchor="_Toc232254744" w:history="1">
             <w:r>
               <w:rPr>
                 <w:rStyle w:val="af7"/>
@@ -2116,7 +2116,7 @@
                 <w:noProof/>
                 <w:webHidden/>
               </w:rPr>
-              <w:instrText xml:space="preserve"> PAGEREF _Toc232211097 \h </w:instrText>
+              <w:instrText xml:space="preserve"> PAGEREF _Toc232254744 \h </w:instrText>
             </w:r>
             <w:r>
               <w:rPr>
@@ -2161,7 +2161,7 @@
               <w:lang w:eastAsia="ru-RU"/>
             </w:rPr>
           </w:pPr>
-          <w:hyperlink w:anchor="_Toc232211098" w:history="1">
+          <w:hyperlink w:anchor="_Toc232254745" w:history="1">
             <w:r>
               <w:rPr>
                 <w:rStyle w:val="af7"/>
@@ -2204,7 +2204,7 @@
                 <w:noProof/>
                 <w:webHidden/>
               </w:rPr>
-              <w:instrText xml:space="preserve"> PAGEREF _Toc232211098 \h </w:instrText>
+              <w:instrText xml:space="preserve"> PAGEREF _Toc232254745 \h </w:instrText>
             </w:r>
             <w:r>
               <w:rPr>
@@ -2249,7 +2249,7 @@
               <w:lang w:eastAsia="ru-RU"/>
             </w:rPr>
           </w:pPr>
-          <w:hyperlink w:anchor="_Toc232211099" w:history="1">
+          <w:hyperlink w:anchor="_Toc232254746" w:history="1">
             <w:r>
               <w:rPr>
                 <w:rStyle w:val="af7"/>
@@ -2292,7 +2292,7 @@
                 <w:noProof/>
                 <w:webHidden/>
               </w:rPr>
-              <w:instrText xml:space="preserve"> PAGEREF _Toc232211099 \h </w:instrText>
+              <w:instrText xml:space="preserve"> PAGEREF _Toc232254746 \h </w:instrText>
             </w:r>
             <w:r>
               <w:rPr>
@@ -2312,7 +2312,7 @@
                 <w:noProof/>
                 <w:webHidden/>
               </w:rPr>
-              <w:t>10</w:t>
+              <w:t>11</w:t>
             </w:r>
             <w:r>
               <w:rPr>
@@ -2337,7 +2337,7 @@
               <w:lang w:eastAsia="ru-RU"/>
             </w:rPr>
           </w:pPr>
-          <w:hyperlink w:anchor="_Toc232211100" w:history="1">
+          <w:hyperlink w:anchor="_Toc232254747" w:history="1">
             <w:r>
               <w:rPr>
                 <w:rStyle w:val="af7"/>
@@ -2380,7 +2380,7 @@
                 <w:noProof/>
                 <w:webHidden/>
               </w:rPr>
-              <w:instrText xml:space="preserve"> PAGEREF _Toc232211100 \h </w:instrText>
+              <w:instrText xml:space="preserve"> PAGEREF _Toc232254747 \h </w:instrText>
             </w:r>
             <w:r>
               <w:rPr>
@@ -2400,7 +2400,7 @@
                 <w:noProof/>
                 <w:webHidden/>
               </w:rPr>
-              <w:t>13</w:t>
+              <w:t>14</w:t>
             </w:r>
             <w:r>
               <w:rPr>
@@ -2425,7 +2425,7 @@
               <w:lang w:eastAsia="ru-RU"/>
             </w:rPr>
           </w:pPr>
-          <w:hyperlink w:anchor="_Toc232211101" w:history="1">
+          <w:hyperlink w:anchor="_Toc232254748" w:history="1">
             <w:r>
               <w:rPr>
                 <w:rStyle w:val="af7"/>
@@ -2468,7 +2468,7 @@
                 <w:noProof/>
                 <w:webHidden/>
               </w:rPr>
-              <w:instrText xml:space="preserve"> PAGEREF _Toc232211101 \h </w:instrText>
+              <w:instrText xml:space="preserve"> PAGEREF _Toc232254748 \h </w:instrText>
             </w:r>
             <w:r>
               <w:rPr>
@@ -2488,7 +2488,7 @@
                 <w:noProof/>
                 <w:webHidden/>
               </w:rPr>
-              <w:t>15</w:t>
+              <w:t>16</w:t>
             </w:r>
             <w:r>
               <w:rPr>
@@ -2513,7 +2513,7 @@
               <w:lang w:eastAsia="ru-RU"/>
             </w:rPr>
           </w:pPr>
-          <w:hyperlink w:anchor="_Toc232211102" w:history="1">
+          <w:hyperlink w:anchor="_Toc232254749" w:history="1">
             <w:r>
               <w:rPr>
                 <w:rStyle w:val="af7"/>
@@ -2556,7 +2556,7 @@
                 <w:noProof/>
                 <w:webHidden/>
               </w:rPr>
-              <w:instrText xml:space="preserve"> PAGEREF _Toc232211102 \h </w:instrText>
+              <w:instrText xml:space="preserve"> PAGEREF _Toc232254749 \h </w:instrText>
             </w:r>
             <w:r>
               <w:rPr>
@@ -2576,7 +2576,7 @@
                 <w:noProof/>
                 <w:webHidden/>
               </w:rPr>
-              <w:t>16</w:t>
+              <w:t>17</w:t>
             </w:r>
             <w:r>
               <w:rPr>
@@ -2601,7 +2601,7 @@
               <w:lang w:eastAsia="ru-RU"/>
             </w:rPr>
           </w:pPr>
-          <w:hyperlink w:anchor="_Toc232211103" w:history="1">
+          <w:hyperlink w:anchor="_Toc232254750" w:history="1">
             <w:r>
               <w:rPr>
                 <w:rStyle w:val="af7"/>
@@ -2644,7 +2644,7 @@
                 <w:noProof/>
                 <w:webHidden/>
               </w:rPr>
-              <w:instrText xml:space="preserve"> PAGEREF _Toc232211103 \h </w:instrText>
+              <w:instrText xml:space="preserve"> PAGEREF _Toc232254750 \h </w:instrText>
             </w:r>
             <w:r>
               <w:rPr>
@@ -2664,7 +2664,95 @@
                 <w:noProof/>
                 <w:webHidden/>
               </w:rPr>
-              <w:t>17</w:t>
+              <w:t>18</w:t>
+            </w:r>
+            <w:r>
+              <w:rPr>
+                <w:noProof/>
+                <w:webHidden/>
+              </w:rPr>
+              <w:fldChar w:fldCharType="end"/>
+            </w:r>
+          </w:hyperlink>
+        </w:p>
+        <w:p>
+          <w:pPr>
+            <w:pStyle w:val="11"/>
+            <w:tabs>
+              <w:tab w:val="left" w:pos="1200"/>
+              <w:tab w:val="right" w:leader="dot" w:pos="9345"/>
+            </w:tabs>
+            <w:rPr>
+              <w:rFonts w:eastAsiaTheme="minorEastAsia"/>
+              <w:noProof/>
+              <w:sz w:val="24"/>
+              <w:lang w:eastAsia="ru-RU"/>
+            </w:rPr>
+          </w:pPr>
+          <w:hyperlink w:anchor="_Toc232254751" w:history="1">
+            <w:r>
+              <w:rPr>
+                <w:rStyle w:val="af7"/>
+                <w:noProof/>
+              </w:rPr>
+              <w:t>6.</w:t>
+            </w:r>
+            <w:r>
+              <w:rPr>
+                <w:rFonts w:eastAsiaTheme="minorEastAsia"/>
+                <w:noProof/>
+                <w:sz w:val="24"/>
+                <w:lang w:eastAsia="ru-RU"/>
+              </w:rPr>
+              <w:tab/>
+            </w:r>
+            <w:r>
+              <w:rPr>
+                <w:rStyle w:val="af7"/>
+                <w:noProof/>
+              </w:rPr>
+              <w:t>Тестирование памяти и загруженности процессора</w:t>
+            </w:r>
+            <w:r>
+              <w:rPr>
+                <w:noProof/>
+                <w:webHidden/>
+              </w:rPr>
+              <w:tab/>
+            </w:r>
+            <w:r>
+              <w:rPr>
+                <w:noProof/>
+                <w:webHidden/>
+              </w:rPr>
+              <w:fldChar w:fldCharType="begin"/>
+            </w:r>
+            <w:r>
+              <w:rPr>
+                <w:noProof/>
+                <w:webHidden/>
+              </w:rPr>
+              <w:instrText xml:space="preserve"> PAGEREF _Toc232254751 \h </w:instrText>
+            </w:r>
+            <w:r>
+              <w:rPr>
+                <w:noProof/>
+                <w:webHidden/>
+              </w:rPr>
+            </w:r>
+            <w:r>
+              <w:rPr>
+                <w:noProof/>
+                <w:webHidden/>
+              </w:rPr>
+              <w:fldChar w:fldCharType="separate"/>
+            </w:r>
+            <w:r>
+              <w:rPr>
+                <w:noProof/>
+                <w:webHidden/>
+              </w:rPr>
+              <w:t>21</w:t>
             </w:r>
             <w:r>
               <w:rPr>
@@ -2688,7 +2776,7 @@
               <w:lang w:eastAsia="ru-RU"/>
             </w:rPr>
           </w:pPr>
-          <w:hyperlink w:anchor="_Toc232211104" w:history="1">
+          <w:hyperlink w:anchor="_Toc232254752" w:history="1">
             <w:r>
               <w:rPr>
                 <w:rStyle w:val="af7"/>
@@ -2717,7 +2805,7 @@
                 <w:noProof/>
                 <w:webHidden/>
               </w:rPr>
-              <w:instrText xml:space="preserve"> PAGEREF _Toc232211104 \h </w:instrText>
+              <w:instrText xml:space="preserve"> PAGEREF _Toc232254752 \h </w:instrText>
             </w:r>
             <w:r>
               <w:rPr>
@@ -2737,90 +2825,7 @@
                 <w:noProof/>
                 <w:webHidden/>
               </w:rPr>
-              <w:t>20</w:t>
-            </w:r>
-            <w:r>
-              <w:rPr>
-                <w:noProof/>
-                <w:webHidden/>
-              </w:rPr>
-              <w:fldChar w:fldCharType="end"/>
-            </w:r>
-          </w:hyperlink>
-        </w:p>
-        <w:p>
-          <w:pPr>
-            <w:pStyle w:val="11"/>
-            <w:tabs>
-              <w:tab w:val="right" w:leader="dot" w:pos="9345"/>
-            </w:tabs>
-            <w:rPr>
-              <w:rFonts w:eastAsiaTheme="minorEastAsia"/>
-              <w:noProof/>
-              <w:sz w:val="24"/>
-              <w:lang w:eastAsia="ru-RU"/>
-            </w:rPr>
-          </w:pPr>
-          <w:hyperlink w:anchor="_Toc232211105" w:history="1">
-            <w:r>
-              <w:rPr>
-                <w:rStyle w:val="af7"/>
-                <w:rFonts w:eastAsiaTheme="majorEastAsia" w:cstheme="majorBidi"/>
-                <w:b/>
-                <w:noProof/>
-              </w:rPr>
-              <w:t xml:space="preserve">Приложение </w:t>
-            </w:r>
-            <w:r>
-              <w:rPr>
-                <w:rStyle w:val="af7"/>
-                <w:rFonts w:eastAsiaTheme="majorEastAsia" w:cstheme="majorBidi"/>
-                <w:b/>
-                <w:noProof/>
-                <w:lang w:val="en-US"/>
-              </w:rPr>
-              <w:t>B</w:t>
-            </w:r>
-            <w:r>
-              <w:rPr>
-                <w:noProof/>
-                <w:webHidden/>
-              </w:rPr>
-              <w:tab/>
-            </w:r>
-            <w:r>
-              <w:rPr>
-                <w:noProof/>
-                <w:webHidden/>
-              </w:rPr>
-              <w:fldChar w:fldCharType="begin"/>
-            </w:r>
-            <w:r>
-              <w:rPr>
-                <w:noProof/>
-                <w:webHidden/>
-              </w:rPr>
-              <w:instrText xml:space="preserve"> PAGEREF _Toc232211105 \h </w:instrText>
-            </w:r>
-            <w:r>
-              <w:rPr>
-                <w:noProof/>
-                <w:webHidden/>
-              </w:rPr>
-            </w:r>
-            <w:r>
-              <w:rPr>
-                <w:noProof/>
-                <w:webHidden/>
-              </w:rPr>
-              <w:fldChar w:fldCharType="separate"/>
-            </w:r>
-            <w:r>
-              <w:rPr>
-                <w:noProof/>
-                <w:webHidden/>
-              </w:rPr>
-              <w:t>29</w:t>
+              <w:t>22</w:t>
             </w:r>
             <w:r>
               <w:rPr>
@@ -2877,7 +2882,7 @@
         <w:spacing w:after="120"/>
         <w:jc w:val="center"/>
       </w:pPr>
-      <w:bookmarkStart w:id="0" w:name="_Toc232211092"/>
+      <w:bookmarkStart w:id="0" w:name="_Toc232254739"/>
       <w:r>
         <w:rPr>
           <w:lang w:val="en-US"/>
@@ -2961,7 +2966,7 @@
       </w:pPr>
       <w:r>
         <w:drawing>
-          <wp:inline distT="0" distB="0" distL="0" distR="0" wp14:anchorId="7AD332B9" wp14:editId="387E31BA">
+          <wp:inline distT="0" distB="0" distL="0" distR="0" wp14:anchorId="7AD332B9" wp14:editId="29D141D5">
             <wp:extent cx="3543300" cy="5212248"/>
             <wp:effectExtent l="0" t="0" r="0" b="0"/>
             <wp:docPr id="1595171144" name="Рисунок 3"/>
@@ -3049,7 +3054,7 @@
         </w:rPr>
       </w:pPr>
       <w:bookmarkStart w:id="1" w:name="_Toc227844699"/>
-      <w:bookmarkStart w:id="2" w:name="_Toc232211093"/>
+      <w:bookmarkStart w:id="2" w:name="_Toc232254740"/>
       <w:r>
         <w:rPr>
           <w:lang w:val="en-US"/>
@@ -3082,11 +3087,10 @@
         <w:pStyle w:val="af9"/>
       </w:pPr>
       <w:r>
-        <w:lastRenderedPageBreak/>
         <w:drawing>
-          <wp:inline distT="0" distB="0" distL="0" distR="0" wp14:anchorId="3C1BBAE5" wp14:editId="2E87E7F1">
-            <wp:extent cx="5940425" cy="6541770"/>
-            <wp:effectExtent l="0" t="0" r="3175" b="0"/>
+          <wp:inline distT="0" distB="0" distL="0" distR="0" wp14:anchorId="3C1BBAE5" wp14:editId="5A7F1187">
+            <wp:extent cx="5146409" cy="5667375"/>
+            <wp:effectExtent l="0" t="0" r="0" b="0"/>
             <wp:docPr id="1940938792" name="Рисунок 1"/>
             <wp:cNvGraphicFramePr>
               <a:graphicFrameLocks xmlns:a="http://schemas.openxmlformats.org/drawingml/2006/main" noChangeAspect="1"/>
@@ -3107,7 +3111,7 @@
                   <pic:spPr>
                     <a:xfrm>
                       <a:off x="0" y="0"/>
-                      <a:ext cx="5940425" cy="6541770"/>
+                      <a:ext cx="5151539" cy="5673025"/>
                     </a:xfrm>
                     <a:prstGeom prst="rect">
                       <a:avLst/>
@@ -3123,9 +3127,6 @@
     <w:p>
       <w:pPr>
         <w:pStyle w:val="aff"/>
-        <w:rPr>
-          <w:lang w:val="en-US"/>
-        </w:rPr>
       </w:pPr>
       <w:r>
         <w:t xml:space="preserve">Рисунок </w:t>
@@ -3145,6 +3146,7 @@
         <w:t xml:space="preserve"> Диаграмма классов</w:t>
       </w:r>
     </w:p>
+    <w:p/>
     <w:p>
       <w:pPr>
         <w:pStyle w:val="1"/>
@@ -3155,7 +3157,7 @@
         <w:spacing w:after="120"/>
         <w:jc w:val="center"/>
       </w:pPr>
-      <w:bookmarkStart w:id="3" w:name="_Toc232211094"/>
+      <w:bookmarkStart w:id="3" w:name="_Toc232254741"/>
       <w:r>
         <w:rPr>
           <w:lang w:val="en-US"/>
@@ -3184,7 +3186,7 @@
           <w:lang w:val="en-US"/>
         </w:rPr>
       </w:pPr>
-      <w:bookmarkStart w:id="4" w:name="_Toc232211095"/>
+      <w:bookmarkStart w:id="4" w:name="_Toc232254742"/>
       <w:r>
         <w:t>Связь</w:t>
       </w:r>
@@ -3222,11 +3224,7 @@
     </w:p>
     <w:p>
       <w:r>
-        <w:t xml:space="preserve">В данном разделе приведено описание отношений типа «общее-частное», представленных на диаграмме классов. Такие отношения используются для отображения иерархии классов, при которой один класс задаёт общую структуру или общий контракт, а другие классы уточняют его поведение. В разработанной программе данная связь используется для </w:t>
-      </w:r>
-      <w:r>
-        <w:lastRenderedPageBreak/>
-        <w:t>описания иерархии объёмных фигур, а также для отображения наследования пользовательских форм от стандартного класса Form.</w:t>
+        <w:t>В данном разделе приведено описание отношений типа «общее-частное», представленных на диаграмме классов. Такие отношения используются для отображения иерархии классов, при которой один класс задаёт общую структуру или общий контракт, а другие классы уточняют его поведение. В разработанной программе данная связь используется для описания иерархии объёмных фигур, а также для отображения наследования пользовательских форм от стандартного класса Form.</w:t>
       </w:r>
     </w:p>
     <w:p>
@@ -4197,6 +4195,7 @@
                 <w:iCs/>
                 <w:szCs w:val="22"/>
               </w:rPr>
+              <w:lastRenderedPageBreak/>
               <w:t>+GetDescription()</w:t>
             </w:r>
             <w:r>
@@ -4421,7 +4420,6 @@
           <w:sz w:val="28"/>
           <w:szCs w:val="22"/>
         </w:rPr>
-        <w:lastRenderedPageBreak/>
         <w:t xml:space="preserve">Таблица </w:t>
       </w:r>
       <w:r>
@@ -5418,6 +5416,7 @@
                 <w:iCs/>
                 <w:szCs w:val="22"/>
               </w:rPr>
+              <w:lastRenderedPageBreak/>
               <w:t>-_</w:t>
             </w:r>
             <w:r>
@@ -6027,7 +6026,6 @@
                 <w:szCs w:val="22"/>
                 <w:lang w:val="en-US"/>
               </w:rPr>
-              <w:lastRenderedPageBreak/>
               <w:t>+Volume</w:t>
             </w:r>
           </w:p>
@@ -7068,6 +7066,7 @@
                 <w:sz w:val="26"/>
                 <w:szCs w:val="26"/>
               </w:rPr>
+              <w:lastRenderedPageBreak/>
               <w:t>+Volume</w:t>
             </w:r>
           </w:p>
@@ -7301,12 +7300,11 @@
           <w:lang w:val="en-US"/>
         </w:rPr>
       </w:pPr>
-      <w:bookmarkStart w:id="5" w:name="_Toc232211096"/>
+      <w:bookmarkStart w:id="5" w:name="_Toc232254743"/>
       <w:r>
         <w:rPr>
           <w:lang w:val="en-US"/>
         </w:rPr>
-        <w:lastRenderedPageBreak/>
         <w:t xml:space="preserve">Дерево ветвлений </w:t>
       </w:r>
       <w:r>
@@ -7458,7 +7456,11 @@
     </w:p>
     <w:p>
       <w:r>
-        <w:t>На рисунке видно, что текущая ветка feature/lab04 содержит последовательность коммитов, отражающих этапы разработки и исправления программы. В ходе работы были выполнены исправления, связанные с добавлением фигур, устранением ошибок компиляции, удалением TODO-комментариев, а также изменением уровня абстракции и работы с интерфейсом.</w:t>
+        <w:t>На рисунке видно, что текущая ветка feature/lab04 содержит последовательность коммитов, отражающих этапы разработки и исправления программы. В ходе работы были выполнены исправления, связанные с добавлением фигур, устранением ошибок компиляции, удалением TODO-</w:t>
+      </w:r>
+      <w:r>
+        <w:lastRenderedPageBreak/>
+        <w:t>комментариев, а также изменением уровня абстракции и работы с интерфейсом.</w:t>
       </w:r>
     </w:p>
     <w:p>
@@ -7474,7 +7476,7 @@
           <w:lang w:val="en-US"/>
         </w:rPr>
       </w:pPr>
-      <w:bookmarkStart w:id="7" w:name="_Toc232211097"/>
+      <w:bookmarkStart w:id="7" w:name="_Toc232254744"/>
       <w:r>
         <w:rPr>
           <w:lang w:val="en-US"/>
@@ -7490,7 +7492,6 @@
     </w:p>
     <w:p>
       <w:r>
-        <w:lastRenderedPageBreak/>
         <w:t xml:space="preserve">Особенностью программы является автоматический расчёт объёма фигуры на основе введённых пользователем параметров. Для каждой фигуры отображается её тип, рассчитанный объём и текстовое описание. В программе предусмотрена проверка корректности вводимых данных: параметры фигуры должны быть положительными конечными числами. При ошибочном вводе пользователю выводится соответствующее сообщение. </w:t>
       </w:r>
       <w:r>
@@ -7508,7 +7509,7 @@
           <w:numId w:val="27"/>
         </w:numPr>
       </w:pPr>
-      <w:bookmarkStart w:id="8" w:name="_Toc232211098"/>
+      <w:bookmarkStart w:id="8" w:name="_Toc232254745"/>
       <w:r>
         <w:t>Главное окно программы</w:t>
       </w:r>
@@ -7548,6 +7549,7 @@
         <w:pStyle w:val="af9"/>
       </w:pPr>
       <w:r>
+        <w:lastRenderedPageBreak/>
         <w:drawing>
           <wp:inline distT="0" distB="0" distL="0" distR="0" wp14:anchorId="0B432510" wp14:editId="30C9B57A">
             <wp:extent cx="5940425" cy="3576320"/>
@@ -7720,11 +7722,7 @@
         </w:numPr>
       </w:pPr>
       <w:r>
-        <w:t xml:space="preserve">Область «Список фигур» является основной рабочей областью окна. В таблице отображаются добавленные фигуры. Для каждой фигуры </w:t>
-      </w:r>
-      <w:r>
-        <w:lastRenderedPageBreak/>
-        <w:t>выводятся её тип, рассчитанный объём и текстовое описание с параметрами.</w:t>
+        <w:t>Область «Список фигур» является основной рабочей областью окна. В таблице отображаются добавленные фигуры. Для каждой фигуры выводятся её тип, рассчитанный объём и текстовое описание с параметрами.</w:t>
       </w:r>
     </w:p>
     <w:p>
@@ -7771,8 +7769,9 @@
           <w:numId w:val="27"/>
         </w:numPr>
       </w:pPr>
-      <w:bookmarkStart w:id="10" w:name="_Toc232211099"/>
-      <w:r>
+      <w:bookmarkStart w:id="10" w:name="_Toc232254746"/>
+      <w:r>
+        <w:lastRenderedPageBreak/>
         <w:t>Тестовые случаи добавления новых фигур</w:t>
       </w:r>
       <w:bookmarkEnd w:id="10"/>
@@ -7942,20 +7941,7 @@
       </w:r>
       <w:bookmarkEnd w:id="11"/>
       <w:r>
-        <w:t xml:space="preserve"> – Добавление </w:t>
-      </w:r>
-      <w:commentRangeStart w:id="12"/>
-      <w:r>
-        <w:t>фигуры</w:t>
-      </w:r>
-      <w:commentRangeEnd w:id="12"/>
-      <w:r>
-        <w:rPr>
-          <w:rStyle w:val="af2"/>
-          <w:sz w:val="24"/>
-          <w:szCs w:val="18"/>
-        </w:rPr>
-        <w:commentReference w:id="12"/>
+        <w:t xml:space="preserve"> – Добавление фигуры</w:t>
       </w:r>
       <w:r>
         <w:t xml:space="preserve"> «Сфера»</w:t>
@@ -7966,9 +7952,8 @@
         <w:pStyle w:val="af9"/>
       </w:pPr>
       <w:r>
-        <w:lastRenderedPageBreak/>
         <w:drawing>
-          <wp:inline distT="0" distB="0" distL="0" distR="0" wp14:anchorId="0A3C0585" wp14:editId="75B8400D">
+          <wp:inline distT="0" distB="0" distL="0" distR="0" wp14:anchorId="0A3C0585" wp14:editId="6EB82786">
             <wp:extent cx="2676751" cy="2082800"/>
             <wp:effectExtent l="0" t="0" r="9525" b="0"/>
             <wp:docPr id="1615817701" name="Рисунок 2"/>
@@ -7985,7 +7970,7 @@
                     </pic:cNvPicPr>
                   </pic:nvPicPr>
                   <pic:blipFill>
-                    <a:blip r:embed="rId18" cstate="print">
+                    <a:blip r:embed="rId14" cstate="print">
                       <a:extLst>
                         <a:ext uri="{28A0092B-C50C-407E-A947-70E740481C1C}">
                           <a14:useLocalDpi xmlns:a14="http://schemas.microsoft.com/office/drawing/2010/main" val="0"/>
@@ -8033,23 +8018,7 @@
         <w:t xml:space="preserve"> – Добавление фигуры</w:t>
       </w:r>
       <w:r>
-        <w:t xml:space="preserve"> «</w:t>
-      </w:r>
-      <w:commentRangeStart w:id="13"/>
-      <w:r>
-        <w:t>Пирамида</w:t>
-      </w:r>
-      <w:commentRangeEnd w:id="13"/>
-      <w:r>
-        <w:rPr>
-          <w:rStyle w:val="af2"/>
-          <w:sz w:val="24"/>
-          <w:szCs w:val="18"/>
-        </w:rPr>
-        <w:commentReference w:id="13"/>
-      </w:r>
-      <w:r>
-        <w:t>»</w:t>
+        <w:t xml:space="preserve"> «Пирамида»</w:t>
       </w:r>
     </w:p>
     <w:p>
@@ -8057,6 +8026,7 @@
         <w:pStyle w:val="af9"/>
       </w:pPr>
       <w:r>
+        <w:lastRenderedPageBreak/>
         <w:drawing>
           <wp:inline distT="0" distB="0" distL="0" distR="0" wp14:anchorId="1C63A262" wp14:editId="117AA785">
             <wp:extent cx="2658533" cy="2051222"/>
@@ -8073,7 +8043,7 @@
                     <pic:cNvPicPr/>
                   </pic:nvPicPr>
                   <pic:blipFill>
-                    <a:blip r:embed="rId19"/>
+                    <a:blip r:embed="rId15"/>
                     <a:stretch>
                       <a:fillRect/>
                     </a:stretch>
@@ -8105,7 +8075,7 @@
       <w:r>
         <w:t xml:space="preserve">Рисунок </w:t>
       </w:r>
-      <w:bookmarkStart w:id="14" w:name="Рис_7_добавление_параллелепипеда"/>
+      <w:bookmarkStart w:id="12" w:name="Рис_7_добавление_параллелепипеда"/>
       <w:r>
         <w:fldChar w:fldCharType="begin"/>
       </w:r>
@@ -8127,22 +8097,9 @@
         </w:rPr>
         <w:fldChar w:fldCharType="end"/>
       </w:r>
-      <w:bookmarkEnd w:id="14"/>
-      <w:r>
-        <w:t xml:space="preserve"> – Добавление </w:t>
-      </w:r>
-      <w:commentRangeStart w:id="15"/>
-      <w:r>
-        <w:t>фигуры</w:t>
-      </w:r>
-      <w:commentRangeEnd w:id="15"/>
-      <w:r>
-        <w:rPr>
-          <w:rStyle w:val="af2"/>
-          <w:sz w:val="24"/>
-          <w:szCs w:val="18"/>
-        </w:rPr>
-        <w:commentReference w:id="15"/>
+      <w:bookmarkEnd w:id="12"/>
+      <w:r>
+        <w:t xml:space="preserve"> – Добавление фигуры</w:t>
       </w:r>
       <w:r>
         <w:t xml:space="preserve"> «Параллелепипед»</w:t>
@@ -8247,7 +8204,7 @@
                     <pic:cNvPicPr/>
                   </pic:nvPicPr>
                   <pic:blipFill>
-                    <a:blip r:embed="rId20"/>
+                    <a:blip r:embed="rId16"/>
                     <a:stretch>
                       <a:fillRect/>
                     </a:stretch>
@@ -8275,7 +8232,7 @@
       <w:r>
         <w:t xml:space="preserve">Рисунок </w:t>
       </w:r>
-      <w:bookmarkStart w:id="16" w:name="Рис_8_ошибка_сфера"/>
+      <w:bookmarkStart w:id="13" w:name="Рис_8_ошибка_сфера"/>
       <w:r>
         <w:fldChar w:fldCharType="begin"/>
       </w:r>
@@ -8300,7 +8257,7 @@
       <w:r>
         <w:t xml:space="preserve"> </w:t>
       </w:r>
-      <w:bookmarkEnd w:id="16"/>
+      <w:bookmarkEnd w:id="13"/>
       <w:r>
         <w:t>– Ошибка при добавлении</w:t>
       </w:r>
@@ -8323,7 +8280,6 @@
           <w:sz w:val="28"/>
           <w:szCs w:val="20"/>
         </w:rPr>
-        <w:lastRenderedPageBreak/>
         <w:t xml:space="preserve">Также была проверена обработка некорректного ввода при добавлении пирамиды. В отдельные поля были введены значения, не являющиеся положительными конечными числами. В результате программа заблокировала создание фигуры, выделила ошибочно заполненные поля и вывела сообщение о необходимости ввести корректные значения длины, ширины и высоты. Данный результат представлен на рисунке </w:t>
       </w:r>
       <w:r>
@@ -8388,6 +8344,7 @@
         <w:pStyle w:val="af9"/>
       </w:pPr>
       <w:r>
+        <w:lastRenderedPageBreak/>
         <w:drawing>
           <wp:inline distT="0" distB="0" distL="0" distR="0" wp14:anchorId="6C3E2AAB" wp14:editId="3DC2A096">
             <wp:extent cx="3609756" cy="3053751"/>
@@ -8404,7 +8361,7 @@
                     <pic:cNvPicPr/>
                   </pic:nvPicPr>
                   <pic:blipFill>
-                    <a:blip r:embed="rId21"/>
+                    <a:blip r:embed="rId17"/>
                     <a:stretch>
                       <a:fillRect/>
                     </a:stretch>
@@ -8432,7 +8389,7 @@
       <w:r>
         <w:t xml:space="preserve">Рисунок </w:t>
       </w:r>
-      <w:bookmarkStart w:id="17" w:name="Рис_9_ошибка_пирамида"/>
+      <w:bookmarkStart w:id="14" w:name="Рис_9_ошибка_пирамида"/>
       <w:r>
         <w:fldChar w:fldCharType="begin"/>
       </w:r>
@@ -8454,7 +8411,7 @@
         </w:rPr>
         <w:fldChar w:fldCharType="end"/>
       </w:r>
-      <w:bookmarkEnd w:id="17"/>
+      <w:bookmarkEnd w:id="14"/>
       <w:r>
         <w:t xml:space="preserve"> – Ошибка при добавлении</w:t>
       </w:r>
@@ -8557,7 +8514,7 @@
                     <pic:cNvPicPr/>
                   </pic:nvPicPr>
                   <pic:blipFill>
-                    <a:blip r:embed="rId22"/>
+                    <a:blip r:embed="rId18"/>
                     <a:stretch>
                       <a:fillRect/>
                     </a:stretch>
@@ -8585,7 +8542,7 @@
       <w:r>
         <w:t xml:space="preserve">Рисунок </w:t>
       </w:r>
-      <w:bookmarkStart w:id="18" w:name="Рис_10_ошибка_параллелепипеда"/>
+      <w:bookmarkStart w:id="15" w:name="Рис_10_ошибка_параллелепипеда"/>
       <w:r>
         <w:fldChar w:fldCharType="begin"/>
       </w:r>
@@ -8607,7 +8564,7 @@
         </w:rPr>
         <w:fldChar w:fldCharType="end"/>
       </w:r>
-      <w:bookmarkEnd w:id="18"/>
+      <w:bookmarkEnd w:id="15"/>
       <w:r>
         <w:t xml:space="preserve"> – Ошибка при добавлении</w:t>
       </w:r>
@@ -8630,7 +8587,6 @@
           <w:sz w:val="28"/>
           <w:szCs w:val="20"/>
         </w:rPr>
-        <w:lastRenderedPageBreak/>
         <w:t xml:space="preserve">После проверки ошибочных ситуаций было выполнено добавление фигур с корректными параметрами. В результате объекты были успешно созданы и добавлены в таблицу главного окна программы. Для каждой фигуры в списке отображаются её тип, рассчитанный объём и текстовое описание с введёнными параметрами. Результат добавления фигур представлен на рисунке </w:t>
       </w:r>
       <w:r>
@@ -8695,6 +8651,7 @@
         <w:pStyle w:val="af9"/>
       </w:pPr>
       <w:r>
+        <w:lastRenderedPageBreak/>
         <w:drawing>
           <wp:inline distT="0" distB="0" distL="0" distR="0" wp14:anchorId="17A02602" wp14:editId="3826E2C1">
             <wp:extent cx="5940425" cy="1156970"/>
@@ -8711,7 +8668,7 @@
                     <pic:cNvPicPr/>
                   </pic:nvPicPr>
                   <pic:blipFill>
-                    <a:blip r:embed="rId23"/>
+                    <a:blip r:embed="rId19"/>
                     <a:stretch>
                       <a:fillRect/>
                     </a:stretch>
@@ -8739,7 +8696,7 @@
       <w:r>
         <w:t xml:space="preserve">Рисунок </w:t>
       </w:r>
-      <w:bookmarkStart w:id="19" w:name="Рис_11_результат_добавления_фигур"/>
+      <w:bookmarkStart w:id="16" w:name="Рис_11_результат_добавления_фигур"/>
       <w:r>
         <w:fldChar w:fldCharType="begin"/>
       </w:r>
@@ -8761,7 +8718,7 @@
         </w:rPr>
         <w:fldChar w:fldCharType="end"/>
       </w:r>
-      <w:bookmarkEnd w:id="19"/>
+      <w:bookmarkEnd w:id="16"/>
       <w:r>
         <w:t xml:space="preserve"> – Результат добавления фигур</w:t>
       </w:r>
@@ -8792,11 +8749,11 @@
           <w:numId w:val="27"/>
         </w:numPr>
       </w:pPr>
-      <w:bookmarkStart w:id="20" w:name="_Toc232211100"/>
+      <w:bookmarkStart w:id="17" w:name="_Toc232254747"/>
       <w:r>
         <w:t>Тестовый случай сохранения фигур</w:t>
       </w:r>
-      <w:bookmarkEnd w:id="20"/>
+      <w:bookmarkEnd w:id="17"/>
     </w:p>
     <w:p>
       <w:r>
@@ -8850,7 +8807,7 @@
                     </pic:cNvPicPr>
                   </pic:nvPicPr>
                   <pic:blipFill>
-                    <a:blip r:embed="rId24">
+                    <a:blip r:embed="rId20">
                       <a:extLst>
                         <a:ext uri="{28A0092B-C50C-407E-A947-70E740481C1C}">
                           <a14:useLocalDpi xmlns:a14="http://schemas.microsoft.com/office/drawing/2010/main" val="0"/>
@@ -8886,7 +8843,7 @@
       <w:r>
         <w:t xml:space="preserve">Рисунок </w:t>
       </w:r>
-      <w:bookmarkStart w:id="21" w:name="Рис_12_выпадающий_список_действий"/>
+      <w:bookmarkStart w:id="18" w:name="Рис_12_выпадающий_список_действий"/>
       <w:r>
         <w:fldChar w:fldCharType="begin"/>
       </w:r>
@@ -8911,7 +8868,7 @@
       <w:r>
         <w:t xml:space="preserve"> </w:t>
       </w:r>
-      <w:bookmarkEnd w:id="21"/>
+      <w:bookmarkEnd w:id="18"/>
       <w:r>
         <w:t xml:space="preserve">– </w:t>
       </w:r>
@@ -8959,7 +8916,7 @@
                     <pic:cNvPicPr/>
                   </pic:nvPicPr>
                   <pic:blipFill>
-                    <a:blip r:embed="rId25"/>
+                    <a:blip r:embed="rId21"/>
                     <a:stretch>
                       <a:fillRect/>
                     </a:stretch>
@@ -8987,7 +8944,7 @@
       <w:r>
         <w:t xml:space="preserve">Рисунок </w:t>
       </w:r>
-      <w:bookmarkStart w:id="22" w:name="Рис_13_окно_сохранения_фигур"/>
+      <w:bookmarkStart w:id="19" w:name="Рис_13_окно_сохранения_фигур"/>
       <w:r>
         <w:fldChar w:fldCharType="begin"/>
       </w:r>
@@ -9009,7 +8966,7 @@
         </w:rPr>
         <w:fldChar w:fldCharType="end"/>
       </w:r>
-      <w:bookmarkEnd w:id="22"/>
+      <w:bookmarkEnd w:id="19"/>
       <w:r>
         <w:t xml:space="preserve"> – </w:t>
       </w:r>
@@ -9099,7 +9056,7 @@
                     <pic:cNvPicPr/>
                   </pic:nvPicPr>
                   <pic:blipFill>
-                    <a:blip r:embed="rId26"/>
+                    <a:blip r:embed="rId22"/>
                     <a:stretch>
                       <a:fillRect/>
                     </a:stretch>
@@ -9127,7 +9084,7 @@
       <w:r>
         <w:t xml:space="preserve">Рисунок </w:t>
       </w:r>
-      <w:bookmarkStart w:id="23" w:name="Рис_14_результат_сохранения_фигур"/>
+      <w:bookmarkStart w:id="20" w:name="Рис_14_результат_сохранения_фигур"/>
       <w:r>
         <w:fldChar w:fldCharType="begin"/>
       </w:r>
@@ -9149,7 +9106,7 @@
         </w:rPr>
         <w:fldChar w:fldCharType="end"/>
       </w:r>
-      <w:bookmarkEnd w:id="23"/>
+      <w:bookmarkEnd w:id="20"/>
       <w:r>
         <w:t xml:space="preserve"> – </w:t>
       </w:r>
@@ -9214,7 +9171,7 @@
                     </pic:cNvPicPr>
                   </pic:nvPicPr>
                   <pic:blipFill>
-                    <a:blip r:embed="rId27">
+                    <a:blip r:embed="rId23">
                       <a:extLst>
                         <a:ext uri="{28A0092B-C50C-407E-A947-70E740481C1C}">
                           <a14:useLocalDpi xmlns:a14="http://schemas.microsoft.com/office/drawing/2010/main" val="0"/>
@@ -9250,7 +9207,7 @@
       <w:r>
         <w:t xml:space="preserve">Рисунок </w:t>
       </w:r>
-      <w:bookmarkStart w:id="24" w:name="Рис_15_результат_сохранения_файла"/>
+      <w:bookmarkStart w:id="21" w:name="Рис_15_результат_сохранения_файла"/>
       <w:r>
         <w:fldChar w:fldCharType="begin"/>
       </w:r>
@@ -9272,7 +9229,7 @@
       <w:r>
         <w:t xml:space="preserve"> </w:t>
       </w:r>
-      <w:bookmarkEnd w:id="24"/>
+      <w:bookmarkEnd w:id="21"/>
       <w:r>
         <w:t>–</w:t>
       </w:r>
@@ -9300,11 +9257,11 @@
           <w:numId w:val="27"/>
         </w:numPr>
       </w:pPr>
-      <w:bookmarkStart w:id="25" w:name="_Toc232211101"/>
+      <w:bookmarkStart w:id="22" w:name="_Toc232254748"/>
       <w:r>
         <w:t>Тестовый случай загрузки фигур</w:t>
       </w:r>
-      <w:bookmarkEnd w:id="25"/>
+      <w:bookmarkEnd w:id="22"/>
     </w:p>
     <w:p>
       <w:r>
@@ -9370,7 +9327,7 @@
                     <pic:cNvPicPr/>
                   </pic:nvPicPr>
                   <pic:blipFill>
-                    <a:blip r:embed="rId28"/>
+                    <a:blip r:embed="rId24"/>
                     <a:stretch>
                       <a:fillRect/>
                     </a:stretch>
@@ -9398,7 +9355,7 @@
       <w:r>
         <w:t xml:space="preserve">Рисунок </w:t>
       </w:r>
-      <w:bookmarkStart w:id="26" w:name="Рис_18_результат_загрузки_фигур"/>
+      <w:bookmarkStart w:id="23" w:name="Рис_18_результат_загрузки_фигур"/>
       <w:r>
         <w:fldChar w:fldCharType="begin"/>
       </w:r>
@@ -9420,7 +9377,7 @@
         </w:rPr>
         <w:fldChar w:fldCharType="end"/>
       </w:r>
-      <w:bookmarkEnd w:id="26"/>
+      <w:bookmarkEnd w:id="23"/>
       <w:r>
         <w:t xml:space="preserve"> – Результат загрузки </w:t>
       </w:r>
@@ -9441,7 +9398,7 @@
           <w:numId w:val="27"/>
         </w:numPr>
       </w:pPr>
-      <w:bookmarkStart w:id="27" w:name="_Toc232211102"/>
+      <w:bookmarkStart w:id="24" w:name="_Toc232254749"/>
       <w:r>
         <w:t xml:space="preserve">Тестовый случай </w:t>
       </w:r>
@@ -9451,7 +9408,7 @@
       <w:r>
         <w:t xml:space="preserve"> фигур</w:t>
       </w:r>
-      <w:bookmarkEnd w:id="27"/>
+      <w:bookmarkEnd w:id="24"/>
     </w:p>
     <w:p>
       <w:r>
@@ -9509,7 +9466,7 @@
                     <pic:cNvPicPr/>
                   </pic:nvPicPr>
                   <pic:blipFill>
-                    <a:blip r:embed="rId29"/>
+                    <a:blip r:embed="rId25"/>
                     <a:stretch>
                       <a:fillRect/>
                     </a:stretch>
@@ -9537,7 +9494,7 @@
       <w:r>
         <w:t xml:space="preserve">Рисунок </w:t>
       </w:r>
-      <w:bookmarkStart w:id="28" w:name="Рис_16_выбор_фигур_для_удаленя"/>
+      <w:bookmarkStart w:id="25" w:name="Рис_16_выбор_фигур_для_удаленя"/>
       <w:r>
         <w:fldChar w:fldCharType="begin"/>
       </w:r>
@@ -9559,7 +9516,7 @@
         </w:rPr>
         <w:fldChar w:fldCharType="end"/>
       </w:r>
-      <w:bookmarkEnd w:id="28"/>
+      <w:bookmarkEnd w:id="25"/>
       <w:r>
         <w:t xml:space="preserve"> – </w:t>
       </w:r>
@@ -9618,7 +9575,7 @@
                     <pic:cNvPicPr/>
                   </pic:nvPicPr>
                   <pic:blipFill>
-                    <a:blip r:embed="rId30"/>
+                    <a:blip r:embed="rId26"/>
                     <a:stretch>
                       <a:fillRect/>
                     </a:stretch>
@@ -9646,7 +9603,7 @@
       <w:r>
         <w:t xml:space="preserve">Рисунок </w:t>
       </w:r>
-      <w:bookmarkStart w:id="29" w:name="Рис_17_результат_удаления_фигур"/>
+      <w:bookmarkStart w:id="26" w:name="Рис_17_результат_удаления_фигур"/>
       <w:r>
         <w:fldChar w:fldCharType="begin"/>
       </w:r>
@@ -9671,7 +9628,7 @@
       <w:r>
         <w:t xml:space="preserve"> </w:t>
       </w:r>
-      <w:bookmarkEnd w:id="29"/>
+      <w:bookmarkEnd w:id="26"/>
       <w:r>
         <w:t>– Результат удаления фигур</w:t>
       </w:r>
@@ -9689,11 +9646,11 @@
           <w:numId w:val="27"/>
         </w:numPr>
       </w:pPr>
-      <w:bookmarkStart w:id="30" w:name="_Toc232211103"/>
+      <w:bookmarkStart w:id="27" w:name="_Toc232254750"/>
       <w:r>
         <w:t>Тестовый случай поиска фигур</w:t>
       </w:r>
-      <w:bookmarkEnd w:id="30"/>
+      <w:bookmarkEnd w:id="27"/>
     </w:p>
     <w:p>
       <w:r>
@@ -9745,7 +9702,7 @@
                     <pic:cNvPicPr/>
                   </pic:nvPicPr>
                   <pic:blipFill>
-                    <a:blip r:embed="rId31"/>
+                    <a:blip r:embed="rId27"/>
                     <a:stretch>
                       <a:fillRect/>
                     </a:stretch>
@@ -9773,7 +9730,7 @@
       <w:r>
         <w:t xml:space="preserve">Рисунок </w:t>
       </w:r>
-      <w:bookmarkStart w:id="31" w:name="Рис_19_главное_окно_поиска_фигур"/>
+      <w:bookmarkStart w:id="28" w:name="Рис_19_главное_окно_поиска_фигур"/>
       <w:r>
         <w:fldChar w:fldCharType="begin"/>
       </w:r>
@@ -9795,7 +9752,7 @@
         </w:rPr>
         <w:fldChar w:fldCharType="end"/>
       </w:r>
-      <w:bookmarkEnd w:id="31"/>
+      <w:bookmarkEnd w:id="28"/>
       <w:r>
         <w:t xml:space="preserve"> – Главное окно поиска фигур</w:t>
       </w:r>
@@ -9942,7 +9899,7 @@
                     <pic:cNvPicPr/>
                   </pic:nvPicPr>
                   <pic:blipFill>
-                    <a:blip r:embed="rId32"/>
+                    <a:blip r:embed="rId28"/>
                     <a:stretch>
                       <a:fillRect/>
                     </a:stretch>
@@ -9970,7 +9927,7 @@
       <w:r>
         <w:t xml:space="preserve">Рисунок </w:t>
       </w:r>
-      <w:bookmarkStart w:id="32" w:name="Рис_20_Результат_поиска_всех_фигур"/>
+      <w:bookmarkStart w:id="29" w:name="Рис_20_Результат_поиска_всех_фигур"/>
       <w:r>
         <w:fldChar w:fldCharType="begin"/>
       </w:r>
@@ -9992,7 +9949,7 @@
         </w:rPr>
         <w:fldChar w:fldCharType="end"/>
       </w:r>
-      <w:bookmarkEnd w:id="32"/>
+      <w:bookmarkEnd w:id="29"/>
       <w:r>
         <w:t xml:space="preserve"> – Результат поиска всех фигур</w:t>
       </w:r>
@@ -10050,7 +10007,7 @@
                     <pic:cNvPicPr/>
                   </pic:nvPicPr>
                   <pic:blipFill>
-                    <a:blip r:embed="rId33"/>
+                    <a:blip r:embed="rId29"/>
                     <a:stretch>
                       <a:fillRect/>
                     </a:stretch>
@@ -10078,7 +10035,7 @@
       <w:r>
         <w:t xml:space="preserve">Рисунок </w:t>
       </w:r>
-      <w:bookmarkStart w:id="33" w:name="Рис_21_Резутат_поиска_фигуры"/>
+      <w:bookmarkStart w:id="30" w:name="Рис_21_Резутат_поиска_фигуры"/>
       <w:r>
         <w:fldChar w:fldCharType="begin"/>
       </w:r>
@@ -10100,7 +10057,7 @@
         </w:rPr>
         <w:fldChar w:fldCharType="end"/>
       </w:r>
-      <w:bookmarkEnd w:id="33"/>
+      <w:bookmarkEnd w:id="30"/>
       <w:r>
         <w:t xml:space="preserve"> –</w:t>
       </w:r>
@@ -10161,7 +10118,7 @@
                     <pic:cNvPicPr/>
                   </pic:nvPicPr>
                   <pic:blipFill>
-                    <a:blip r:embed="rId34"/>
+                    <a:blip r:embed="rId30"/>
                     <a:stretch>
                       <a:fillRect/>
                     </a:stretch>
@@ -10189,7 +10146,7 @@
       <w:r>
         <w:t xml:space="preserve">Рисунок </w:t>
       </w:r>
-      <w:bookmarkStart w:id="34" w:name="Рис_22_Пустой_результат_поиска"/>
+      <w:bookmarkStart w:id="31" w:name="Рис_22_Пустой_результат_поиска"/>
       <w:r>
         <w:fldChar w:fldCharType="begin"/>
       </w:r>
@@ -10211,7 +10168,7 @@
         </w:rPr>
         <w:fldChar w:fldCharType="end"/>
       </w:r>
-      <w:bookmarkEnd w:id="34"/>
+      <w:bookmarkEnd w:id="31"/>
       <w:r>
         <w:t xml:space="preserve"> – </w:t>
       </w:r>
@@ -10272,7 +10229,7 @@
                     <pic:cNvPicPr/>
                   </pic:nvPicPr>
                   <pic:blipFill>
-                    <a:blip r:embed="rId35"/>
+                    <a:blip r:embed="rId31"/>
                     <a:stretch>
                       <a:fillRect/>
                     </a:stretch>
@@ -10300,7 +10257,7 @@
       <w:r>
         <w:t xml:space="preserve">Рисунок </w:t>
       </w:r>
-      <w:bookmarkStart w:id="35" w:name="Рис_23_Ошибка_задания_исх_данных_поиска"/>
+      <w:bookmarkStart w:id="32" w:name="Рис_23_Ошибка_задания_исх_данных_поиска"/>
       <w:r>
         <w:fldChar w:fldCharType="begin"/>
       </w:r>
@@ -10322,7 +10279,7 @@
         </w:rPr>
         <w:fldChar w:fldCharType="end"/>
       </w:r>
-      <w:bookmarkEnd w:id="35"/>
+      <w:bookmarkEnd w:id="32"/>
       <w:r>
         <w:t xml:space="preserve"> – </w:t>
       </w:r>
@@ -10356,10 +10313,12 @@
         <w:spacing w:after="120"/>
         <w:jc w:val="center"/>
       </w:pPr>
+      <w:bookmarkStart w:id="33" w:name="_Toc232254751"/>
       <w:r>
         <w:lastRenderedPageBreak/>
         <w:t>Тестирование памяти и загруженности процессора</w:t>
       </w:r>
+      <w:bookmarkEnd w:id="33"/>
     </w:p>
     <w:p>
       <w:pPr>
@@ -10390,7 +10349,7 @@
           <w:lang w:val="en-US"/>
         </w:rPr>
         <w:drawing>
-          <wp:inline distT="0" distB="0" distL="0" distR="0" wp14:anchorId="5E223F2C" wp14:editId="2ED9D474">
+          <wp:inline distT="0" distB="0" distL="0" distR="0" wp14:anchorId="5E223F2C" wp14:editId="57D05776">
             <wp:extent cx="5940425" cy="2514433"/>
             <wp:effectExtent l="0" t="0" r="3175" b="635"/>
             <wp:docPr id="1681852438" name="Рисунок 1"/>
@@ -10407,7 +10366,7 @@
                     </pic:cNvPicPr>
                   </pic:nvPicPr>
                   <pic:blipFill>
-                    <a:blip r:embed="rId36" cstate="print">
+                    <a:blip r:embed="rId32" cstate="print">
                       <a:extLst>
                         <a:ext uri="{28A0092B-C50C-407E-A947-70E740481C1C}">
                           <a14:useLocalDpi xmlns:a14="http://schemas.microsoft.com/office/drawing/2010/main" val="0"/>
@@ -10492,8 +10451,8 @@
           <w:szCs w:val="32"/>
         </w:rPr>
       </w:pPr>
-      <w:bookmarkStart w:id="36" w:name="_Toc225423988"/>
-      <w:bookmarkStart w:id="37" w:name="_Toc232211104"/>
+      <w:bookmarkStart w:id="34" w:name="_Toc225423988"/>
+      <w:bookmarkStart w:id="35" w:name="_Toc232254752"/>
       <w:r>
         <w:rPr>
           <w:rFonts w:eastAsiaTheme="majorEastAsia" w:cstheme="majorBidi"/>
@@ -10502,8 +10461,8 @@
         </w:rPr>
         <w:t>Приложение А</w:t>
       </w:r>
-      <w:bookmarkEnd w:id="36"/>
-      <w:bookmarkEnd w:id="37"/>
+      <w:bookmarkEnd w:id="34"/>
+      <w:bookmarkEnd w:id="35"/>
     </w:p>
     <w:p>
       <w:pPr>
@@ -10554,7 +10513,6 @@
         </w:rPr>
         <w:t xml:space="preserve">Программа для </w:t>
       </w:r>
-      <w:commentRangeStart w:id="38"/>
       <w:r>
         <w:rPr>
           <w:rFonts w:eastAsia="Calibri" w:cs="Times New Roman"/>
@@ -10574,19 +10532,6 @@
           <w14:ligatures w14:val="none"/>
         </w:rPr>
         <w:t>фигур сфера, пирамида, параллелепипеда</w:t>
-      </w:r>
-      <w:commentRangeEnd w:id="38"/>
-      <w:r>
-        <w:rPr>
-          <w:rStyle w:val="af2"/>
-          <w:rFonts w:eastAsia="Calibri" w:cs="Times New Roman"/>
-          <w:iCs/>
-          <w:kern w:val="0"/>
-          <w:sz w:val="28"/>
-          <w:szCs w:val="28"/>
-          <w14:ligatures w14:val="none"/>
-        </w:rPr>
-        <w:commentReference w:id="38"/>
       </w:r>
     </w:p>
     <w:p>
@@ -12326,7 +12271,8 @@
       <w:r>
         <w:t xml:space="preserve">Система должна функционировать под управлением операционной </w:t>
       </w:r>
-      <w:commentRangeStart w:id="39"/>
+      <w:commentRangeStart w:id="36"/>
+      <w:commentRangeStart w:id="37"/>
       <w:r>
         <w:t>системы Windows 10 версии 22</w:t>
       </w:r>
@@ -12339,14 +12285,35 @@
       <w:r>
         <w:t>2 или Windows 11</w:t>
       </w:r>
-      <w:commentRangeEnd w:id="39"/>
+      <w:commentRangeEnd w:id="36"/>
       <w:r>
         <w:rPr>
           <w:rStyle w:val="af2"/>
           <w:sz w:val="28"/>
           <w:szCs w:val="24"/>
         </w:rPr>
-        <w:commentReference w:id="39"/>
+        <w:commentReference w:id="36"/>
+      </w:r>
+      <w:commentRangeEnd w:id="37"/>
+      <w:r>
+        <w:rPr>
+          <w:rStyle w:val="af2"/>
+          <w:sz w:val="28"/>
+          <w:szCs w:val="24"/>
+        </w:rPr>
+        <w:commentReference w:id="37"/>
+      </w:r>
+      <w:r>
+        <w:t xml:space="preserve"> версии 25</w:t>
+      </w:r>
+      <w:r>
+        <w:rPr>
+          <w:lang w:val="en-US"/>
+        </w:rPr>
+        <w:t>H</w:t>
+      </w:r>
+      <w:r>
+        <w:t>2</w:t>
       </w:r>
       <w:r>
         <w:t>. Поддержка macOS и Linux не предусмотрена, так как приложение разработано как настольное Windows Forms-приложение.</w:t>
@@ -13870,7 +13837,7 @@
 
 <file path=word/comments.xml><?xml version="1.0" encoding="utf-8"?>
 <w:comments xmlns:wpc="http://schemas.microsoft.com/office/word/2010/wordprocessingCanvas" xmlns:cx="http://schemas.microsoft.com/office/drawing/2014/chartex" xmlns:cx1="http://schemas.microsoft.com/office/drawing/2015/9/8/chartex" xmlns:cx2="http://schemas.microsoft.com/office/drawing/2015/10/21/chartex" xmlns:cx3="http://schemas.microsoft.com/office/drawing/2016/5/9/chartex" xmlns:cx4="http://schemas.microsoft.com/office/drawing/2016/5/10/chartex" xmlns:cx5="http://schemas.microsoft.com/office/drawing/2016/5/11/chartex" xmlns:cx6="http://schemas.microsoft.com/office/drawing/2016/5/12/chartex" xmlns:cx7="http://schemas.microsoft.com/office/drawing/2016/5/13/chartex" xmlns:cx8="http://schemas.microsoft.com/office/drawing/2016/5/14/chartex" xmlns:mc="http://schemas.openxmlformats.org/markup-compatibility/2006" xmlns:aink="http://schemas.microsoft.com/office/drawing/2016/ink" xmlns:am3d="http://schemas.microsoft.com/office/drawing/2017/model3d" xmlns:o="urn:schemas-microsoft-com:office:office" xmlns:oel="http://schemas.microsoft.com/office/2019/extlst" xmlns:r="http://schemas.openxmlformats.org/officeDocument/2006/relationships" xmlns:m="http://schemas.openxmlformats.org/officeDocument/2006/math" xmlns:v="urn:schemas-microsoft-com:vml" xmlns:wp14="http://schemas.microsoft.com/office/word/2010/wordprocessingDrawing" xmlns:wp="http://schemas.openxmlformats.org/drawingml/2006/wordprocessingDrawing" xmlns:w10="urn:schemas-microsoft-com:office:word" xmlns:w="http://schemas.openxmlformats.org/wordprocessingml/2006/main" xmlns:w14="http://schemas.microsoft.com/office/word/2010/wordml" xmlns:w15="http://schemas.microsoft.com/office/word/2012/wordml" xmlns:w16cex="http://schemas.microsoft.com/office/word/2018/wordml/cex" xmlns:w16cid="http://schemas.microsoft.com/office/word/2016/wordml/cid" xmlns:w16="http://schemas.microsoft.com/office/word/2018/wordml" xmlns:w16du="http://schemas.microsoft.com/office/word/2023/wordml/word16du" xmlns:w16sdtdh="http://schemas.microsoft.com/office/word/2020/wordml/sdtdatahash" xmlns:w16sdtfl="http://schemas.microsoft.com/office/word/2024/wordml/sdtformatlock" xmlns:w16se="http://schemas.microsoft.com/office/word/2015/wordml/symex" xmlns:wpg="http://schemas.microsoft.com/office/word/2010/wordprocessingGroup" xmlns:wpi="http://schemas.microsoft.com/office/word/2010/wordprocessingInk" xmlns:wne="http://schemas.microsoft.com/office/word/2006/wordml" xmlns:wps="http://schemas.microsoft.com/office/word/2010/wordprocessingShape" mc:Ignorable="w14 w15 w16se w16cid w16 w16cex w16sdtdh w16sdtfl w16du wp14">
-  <w:comment w:id="12" w:author="Руслан Рустамов" w:date="2026-06-13T14:19:00Z" w:initials="РР">
+  <w:comment w:id="36" w:author="Aleksey A. Kalentev" w:date="2026-06-13T13:33:00Z" w:initials="AAK">
     <w:p>
       <w:pPr>
         <w:pStyle w:val="af3"/>
@@ -13881,21 +13848,13 @@
         </w:rPr>
         <w:annotationRef/>
       </w:r>
-      <w:r>
-        <w:t>Заменил кнопку ОК</w:t>
-      </w:r>
-    </w:p>
+    </w:p>
+  </w:comment>
+  <w:comment w:id="37" w:author="Руслан Рустамов" w:date="2026-06-13T14:51:00Z" w:initials="РР">
     <w:p>
       <w:pPr>
         <w:pStyle w:val="af3"/>
       </w:pPr>
-    </w:p>
-  </w:comment>
-  <w:comment w:id="13" w:author="Руслан Рустамов" w:date="2026-06-13T14:18:00Z" w:initials="РР">
-    <w:p>
-      <w:pPr>
-        <w:pStyle w:val="af3"/>
-      </w:pPr>
       <w:r>
         <w:rPr>
           <w:rStyle w:val="af2"/>
@@ -13903,62 +13862,7 @@
         <w:annotationRef/>
       </w:r>
       <w:r>
-        <w:t>Заменил кнопку ОК</w:t>
-      </w:r>
-    </w:p>
-    <w:p>
-      <w:pPr>
-        <w:pStyle w:val="af3"/>
-      </w:pPr>
-    </w:p>
-  </w:comment>
-  <w:comment w:id="15" w:author="Руслан Рустамов" w:date="2026-06-13T14:18:00Z" w:initials="РР">
-    <w:p>
-      <w:pPr>
-        <w:pStyle w:val="af3"/>
-      </w:pPr>
-      <w:r>
-        <w:rPr>
-          <w:rStyle w:val="af2"/>
-        </w:rPr>
-        <w:annotationRef/>
-      </w:r>
-      <w:r>
-        <w:t>Заменил кнопку ОК</w:t>
-      </w:r>
-    </w:p>
-  </w:comment>
-  <w:comment w:id="38" w:author="Руслан Рустамов" w:date="2026-06-13T14:39:00Z" w:initials="РР">
-    <w:p>
-      <w:pPr>
-        <w:pStyle w:val="af3"/>
-      </w:pPr>
-      <w:r>
-        <w:rPr>
-          <w:rStyle w:val="af2"/>
-        </w:rPr>
-        <w:annotationRef/>
-      </w:r>
-      <w:r>
-        <w:t>Поправил, было про библиотеку</w:t>
-      </w:r>
-    </w:p>
-    <w:p>
-      <w:pPr>
-        <w:pStyle w:val="af3"/>
-      </w:pPr>
-    </w:p>
-  </w:comment>
-  <w:comment w:id="39" w:author="Aleksey A. Kalentev" w:date="2026-06-13T13:33:00Z" w:initials="AAK">
-    <w:p>
-      <w:pPr>
-        <w:pStyle w:val="af3"/>
-      </w:pPr>
-      <w:r>
-        <w:rPr>
-          <w:rStyle w:val="af2"/>
-        </w:rPr>
-        <w:annotationRef/>
+        <w:t>Поправил</w:t>
       </w:r>
     </w:p>
   </w:comment>
@@ -13967,31 +13871,22 @@
 
 <file path=word/commentsExtended.xml><?xml version="1.0" encoding="utf-8"?>
 <w15:commentsEx xmlns:wpc="http://schemas.microsoft.com/office/word/2010/wordprocessingCanvas" xmlns:cx="http://schemas.microsoft.com/office/drawing/2014/chartex" xmlns:cx1="http://schemas.microsoft.com/office/drawing/2015/9/8/chartex" xmlns:cx2="http://schemas.microsoft.com/office/drawing/2015/10/21/chartex" xmlns:cx3="http://schemas.microsoft.com/office/drawing/2016/5/9/chartex" xmlns:cx4="http://schemas.microsoft.com/office/drawing/2016/5/10/chartex" xmlns:cx5="http://schemas.microsoft.com/office/drawing/2016/5/11/chartex" xmlns:cx6="http://schemas.microsoft.com/office/drawing/2016/5/12/chartex" xmlns:cx7="http://schemas.microsoft.com/office/drawing/2016/5/13/chartex" xmlns:cx8="http://schemas.microsoft.com/office/drawing/2016/5/14/chartex" xmlns:mc="http://schemas.openxmlformats.org/markup-compatibility/2006" xmlns:aink="http://schemas.microsoft.com/office/drawing/2016/ink" xmlns:am3d="http://schemas.microsoft.com/office/drawing/2017/model3d" xmlns:o="urn:schemas-microsoft-com:office:office" xmlns:oel="http://schemas.microsoft.com/office/2019/extlst" xmlns:r="http://schemas.openxmlformats.org/officeDocument/2006/relationships" xmlns:m="http://schemas.openxmlformats.org/officeDocument/2006/math" xmlns:v="urn:schemas-microsoft-com:vml" xmlns:wp14="http://schemas.microsoft.com/office/word/2010/wordprocessingDrawing" xmlns:wp="http://schemas.openxmlformats.org/drawingml/2006/wordprocessingDrawing" xmlns:w10="urn:schemas-microsoft-com:office:word" xmlns:w="http://schemas.openxmlformats.org/wordprocessingml/2006/main" xmlns:w14="http://schemas.microsoft.com/office/word/2010/wordml" xmlns:w15="http://schemas.microsoft.com/office/word/2012/wordml" xmlns:w16cex="http://schemas.microsoft.com/office/word/2018/wordml/cex" xmlns:w16cid="http://schemas.microsoft.com/office/word/2016/wordml/cid" xmlns:w16="http://schemas.microsoft.com/office/word/2018/wordml" xmlns:w16du="http://schemas.microsoft.com/office/word/2023/wordml/word16du" xmlns:w16sdtdh="http://schemas.microsoft.com/office/word/2020/wordml/sdtdatahash" xmlns:w16sdtfl="http://schemas.microsoft.com/office/word/2024/wordml/sdtformatlock" xmlns:w16se="http://schemas.microsoft.com/office/word/2015/wordml/symex" xmlns:wpg="http://schemas.microsoft.com/office/word/2010/wordprocessingGroup" xmlns:wpi="http://schemas.microsoft.com/office/word/2010/wordprocessingInk" xmlns:wne="http://schemas.microsoft.com/office/word/2006/wordml" xmlns:wps="http://schemas.microsoft.com/office/word/2010/wordprocessingShape" mc:Ignorable="w14 w15 w16se w16cid w16 w16cex w16sdtdh w16sdtfl w16du wp14">
-  <w15:commentEx w15:paraId="15BED037" w15:done="0"/>
-  <w15:commentEx w15:paraId="3C427E00" w15:done="0"/>
-  <w15:commentEx w15:paraId="7258B610" w15:done="0"/>
-  <w15:commentEx w15:paraId="334E3334" w15:done="0"/>
   <w15:commentEx w15:paraId="24BB3D33" w15:done="0"/>
+  <w15:commentEx w15:paraId="026A5F20" w15:paraIdParent="24BB3D33" w15:done="0"/>
 </w15:commentsEx>
 </file>
 
 <file path=word/commentsExtensible.xml><?xml version="1.0" encoding="utf-8"?>
 <w16cex:commentsExtensible xmlns:wpc="http://schemas.microsoft.com/office/word/2010/wordprocessingCanvas" xmlns:cx="http://schemas.microsoft.com/office/drawing/2014/chartex" xmlns:cx1="http://schemas.microsoft.com/office/drawing/2015/9/8/chartex" xmlns:cx2="http://schemas.microsoft.com/office/drawing/2015/10/21/chartex" xmlns:cx3="http://schemas.microsoft.com/office/drawing/2016/5/9/chartex" xmlns:cx4="http://schemas.microsoft.com/office/drawing/2016/5/10/chartex" xmlns:cx5="http://schemas.microsoft.com/office/drawing/2016/5/11/chartex" xmlns:cx6="http://schemas.microsoft.com/office/drawing/2016/5/12/chartex" xmlns:cx7="http://schemas.microsoft.com/office/drawing/2016/5/13/chartex" xmlns:cx8="http://schemas.microsoft.com/office/drawing/2016/5/14/chartex" xmlns:cr="http://schemas.microsoft.com/office/comments/2020/reactions" xmlns:mc="http://schemas.openxmlformats.org/markup-compatibility/2006" xmlns:aink="http://schemas.microsoft.com/office/drawing/2016/ink" xmlns:am3d="http://schemas.microsoft.com/office/drawing/2017/model3d" xmlns:o="urn:schemas-microsoft-com:office:office" xmlns:oel="http://schemas.microsoft.com/office/2019/extlst" xmlns:r="http://schemas.openxmlformats.org/officeDocument/2006/relationships" xmlns:m="http://schemas.openxmlformats.org/officeDocument/2006/math" xmlns:v="urn:schemas-microsoft-com:vml" xmlns:wp14="http://schemas.microsoft.com/office/word/2010/wordprocessingDrawing" xmlns:wp="http://schemas.openxmlformats.org/drawingml/2006/wordprocessingDrawing" xmlns:w10="urn:schemas-microsoft-com:office:word" xmlns:w="http://schemas.openxmlformats.org/wordprocessingml/2006/main" xmlns:w14="http://schemas.microsoft.com/office/word/2010/wordml" xmlns:w15="http://schemas.microsoft.com/office/word/2012/wordml" xmlns:w16cex="http://schemas.microsoft.com/office/word/2018/wordml/cex" xmlns:w16cid="http://schemas.microsoft.com/office/word/2016/wordml/cid" xmlns:w16="http://schemas.microsoft.com/office/word/2018/wordml" xmlns:w16du="http://schemas.microsoft.com/office/word/2023/wordml/word16du" xmlns:w16sdtdh="http://schemas.microsoft.com/office/word/2020/wordml/sdtdatahash" xmlns:w16sdtfl="http://schemas.microsoft.com/office/word/2024/wordml/sdtformatlock" xmlns:w16se="http://schemas.microsoft.com/office/word/2015/wordml/symex" xmlns:wpg="http://schemas.microsoft.com/office/word/2010/wordprocessingGroup" xmlns:wpi="http://schemas.microsoft.com/office/word/2010/wordprocessingInk" xmlns:wne="http://schemas.microsoft.com/office/word/2006/wordml" xmlns:wps="http://schemas.microsoft.com/office/word/2010/wordprocessingShape" mc:Ignorable="w14 w15 w16se w16cid w16 w16cex w16sdtdh w16sdtfl cr w16du wp14">
-  <w16cex:commentExtensible w16cex:durableId="108F5499" w16cex:dateUtc="2026-06-13T07:19:00Z"/>
-  <w16cex:commentExtensible w16cex:durableId="195C1D18" w16cex:dateUtc="2026-06-13T07:18:00Z"/>
-  <w16cex:commentExtensible w16cex:durableId="74504A8B" w16cex:dateUtc="2026-06-13T07:18:00Z"/>
-  <w16cex:commentExtensible w16cex:durableId="1F8D408F" w16cex:dateUtc="2026-06-13T07:39:00Z"/>
   <w16cex:commentExtensible w16cex:durableId="2DD7DAA8" w16cex:dateUtc="2026-06-13T06:33:00Z"/>
+  <w16cex:commentExtensible w16cex:durableId="442CDD2F" w16cex:dateUtc="2026-06-13T07:51:00Z"/>
 </w16cex:commentsExtensible>
 </file>
 
 <file path=word/commentsIds.xml><?xml version="1.0" encoding="utf-8"?>
 <w16cid:commentsIds xmlns:wpc="http://schemas.microsoft.com/office/word/2010/wordprocessingCanvas" xmlns:cx="http://schemas.microsoft.com/office/drawing/2014/chartex" xmlns:cx1="http://schemas.microsoft.com/office/drawing/2015/9/8/chartex" xmlns:cx2="http://schemas.microsoft.com/office/drawing/2015/10/21/chartex" xmlns:cx3="http://schemas.microsoft.com/office/drawing/2016/5/9/chartex" xmlns:cx4="http://schemas.microsoft.com/office/drawing/2016/5/10/chartex" xmlns:cx5="http://schemas.microsoft.com/office/drawing/2016/5/11/chartex" xmlns:cx6="http://schemas.microsoft.com/office/drawing/2016/5/12/chartex" xmlns:cx7="http://schemas.microsoft.com/office/drawing/2016/5/13/chartex" xmlns:cx8="http://schemas.microsoft.com/office/drawing/2016/5/14/chartex" xmlns:mc="http://schemas.openxmlformats.org/markup-compatibility/2006" xmlns:aink="http://schemas.microsoft.com/office/drawing/2016/ink" xmlns:am3d="http://schemas.microsoft.com/office/drawing/2017/model3d" xmlns:o="urn:schemas-microsoft-com:office:office" xmlns:oel="http://schemas.microsoft.com/office/2019/extlst" xmlns:r="http://schemas.openxmlformats.org/officeDocument/2006/relationships" xmlns:m="http://schemas.openxmlformats.org/officeDocument/2006/math" xmlns:v="urn:schemas-microsoft-com:vml" xmlns:wp14="http://schemas.microsoft.com/office/word/2010/wordprocessingDrawing" xmlns:wp="http://schemas.openxmlformats.org/drawingml/2006/wordprocessingDrawing" xmlns:w10="urn:schemas-microsoft-com:office:word" xmlns:w="http://schemas.openxmlformats.org/wordprocessingml/2006/main" xmlns:w14="http://schemas.microsoft.com/office/word/2010/wordml" xmlns:w15="http://schemas.microsoft.com/office/word/2012/wordml" xmlns:w16cex="http://schemas.microsoft.com/office/word/2018/wordml/cex" xmlns:w16cid="http://schemas.microsoft.com/office/word/2016/wordml/cid" xmlns:w16="http://schemas.microsoft.com/office/word/2018/wordml" xmlns:w16du="http://schemas.microsoft.com/office/word/2023/wordml/word16du" xmlns:w16sdtdh="http://schemas.microsoft.com/office/word/2020/wordml/sdtdatahash" xmlns:w16sdtfl="http://schemas.microsoft.com/office/word/2024/wordml/sdtformatlock" xmlns:w16se="http://schemas.microsoft.com/office/word/2015/wordml/symex" xmlns:wpg="http://schemas.microsoft.com/office/word/2010/wordprocessingGroup" xmlns:wpi="http://schemas.microsoft.com/office/word/2010/wordprocessingInk" xmlns:wne="http://schemas.microsoft.com/office/word/2006/wordml" xmlns:wps="http://schemas.microsoft.com/office/word/2010/wordprocessingShape" mc:Ignorable="w14 w15 w16se w16cid w16 w16cex w16sdtdh w16sdtfl w16du wp14">
-  <w16cid:commentId w16cid:paraId="15BED037" w16cid:durableId="108F5499"/>
-  <w16cid:commentId w16cid:paraId="3C427E00" w16cid:durableId="195C1D18"/>
-  <w16cid:commentId w16cid:paraId="7258B610" w16cid:durableId="74504A8B"/>
-  <w16cid:commentId w16cid:paraId="334E3334" w16cid:durableId="1F8D408F"/>
   <w16cid:commentId w16cid:paraId="24BB3D33" w16cid:durableId="2DD7DAA8"/>
+  <w16cid:commentId w16cid:paraId="026A5F20" w16cid:durableId="442CDD2F"/>
 </w16cid:commentsIds>
 </file>
 
@@ -18600,11 +18495,11 @@
 
 <file path=word/people.xml><?xml version="1.0" encoding="utf-8"?>
 <w15:people xmlns:wpc="http://schemas.microsoft.com/office/word/2010/wordprocessingCanvas" xmlns:cx="http://schemas.microsoft.com/office/drawing/2014/chartex" xmlns:cx1="http://schemas.microsoft.com/office/drawing/2015/9/8/chartex" xmlns:cx2="http://schemas.microsoft.com/office/drawing/2015/10/21/chartex" xmlns:cx3="http://schemas.microsoft.com/office/drawing/2016/5/9/chartex" xmlns:cx4="http://schemas.microsoft.com/office/drawing/2016/5/10/chartex" xmlns:cx5="http://schemas.microsoft.com/office/drawing/2016/5/11/chartex" xmlns:cx6="http://schemas.microsoft.com/office/drawing/2016/5/12/chartex" xmlns:cx7="http://schemas.microsoft.com/office/drawing/2016/5/13/chartex" xmlns:cx8="http://schemas.microsoft.com/office/drawing/2016/5/14/chartex" xmlns:mc="http://schemas.openxmlformats.org/markup-compatibility/2006" xmlns:aink="http://schemas.microsoft.com/office/drawing/2016/ink" xmlns:am3d="http://schemas.microsoft.com/office/drawing/2017/model3d" xmlns:o="urn:schemas-microsoft-com:office:office" xmlns:oel="http://schemas.microsoft.com/office/2019/extlst" xmlns:r="http://schemas.openxmlformats.org/officeDocument/2006/relationships" xmlns:m="http://schemas.openxmlformats.org/officeDocument/2006/math" xmlns:v="urn:schemas-microsoft-com:vml" xmlns:wp14="http://schemas.microsoft.com/office/word/2010/wordprocessingDrawing" xmlns:wp="http://schemas.openxmlformats.org/drawingml/2006/wordprocessingDrawing" xmlns:w10="urn:schemas-microsoft-com:office:word" xmlns:w="http://schemas.openxmlformats.org/wordprocessingml/2006/main" xmlns:w14="http://schemas.microsoft.com/office/word/2010/wordml" xmlns:w15="http://schemas.microsoft.com/office/word/2012/wordml" xmlns:w16cex="http://schemas.microsoft.com/office/word/2018/wordml/cex" xmlns:w16cid="http://schemas.microsoft.com/office/word/2016/wordml/cid" xmlns:w16="http://schemas.microsoft.com/office/word/2018/wordml" xmlns:w16du="http://schemas.microsoft.com/office/word/2023/wordml/word16du" xmlns:w16sdtdh="http://schemas.microsoft.com/office/word/2020/wordml/sdtdatahash" xmlns:w16sdtfl="http://schemas.microsoft.com/office/word/2024/wordml/sdtformatlock" xmlns:w16se="http://schemas.microsoft.com/office/word/2015/wordml/symex" xmlns:wpg="http://schemas.microsoft.com/office/word/2010/wordprocessingGroup" xmlns:wpi="http://schemas.microsoft.com/office/word/2010/wordprocessingInk" xmlns:wne="http://schemas.microsoft.com/office/word/2006/wordml" xmlns:wps="http://schemas.microsoft.com/office/word/2010/wordprocessingShape" mc:Ignorable="w14 w15 w16se w16cid w16 w16cex w16sdtdh w16sdtfl w16du wp14">
+  <w15:person w15:author="Aleksey A. Kalentev">
+    <w15:presenceInfo w15:providerId="AD" w15:userId="S-1-5-21-507921405-1993962763-1957994488-151096"/>
+  </w15:person>
   <w15:person w15:author="Руслан Рустамов">
     <w15:presenceInfo w15:providerId="Windows Live" w15:userId="7ad4751dad8caff6"/>
-  </w15:person>
-  <w15:person w15:author="Aleksey A. Kalentev">
-    <w15:presenceInfo w15:providerId="AD" w15:userId="S-1-5-21-507921405-1993962763-1957994488-151096"/>
   </w15:person>
 </w15:people>
 </file>

</xml_diff>